<commit_message>
docs: correct spelling and grammar in Notas_Python.docx
</commit_message>
<xml_diff>
--- a/docs/Notas_Python.docx
+++ b/docs/Notas_Python.docx
@@ -1650,8 +1650,8 @@
         <w:pStyle w:val="2"/>
         <w:bidi w:val="0"/>
       </w:pPr>
-      <w:bookmarkStart w:id="0" w:name="_Toc7784"/>
-      <w:bookmarkStart w:id="1" w:name="_Toc2011"/>
+      <w:bookmarkStart w:id="0" w:name="_Toc2011"/>
+      <w:bookmarkStart w:id="1" w:name="_Toc7784"/>
       <w:r>
         <w:t>CONCEPTOS BÁSICOS</w:t>
       </w:r>
@@ -3771,7 +3771,28 @@
                 <w:sz w:val="22"/>
                 <w:szCs w:val="22"/>
               </w:rPr>
-              <w:t>Agrega dos numeros</w:t>
+              <w:t>Agrega dos n</w:t>
+            </w:r>
+            <w:r>
+              <w:rPr>
+                <w:rFonts w:hint="default" w:cs="Calibri"/>
+                <w:b w:val="0"/>
+                <w:color w:val="000000"/>
+                <w:sz w:val="22"/>
+                <w:szCs w:val="22"/>
+                <w:lang w:val="es-MX"/>
+              </w:rPr>
+              <w:t>ú</w:t>
+            </w:r>
+            <w:r>
+              <w:rPr>
+                <w:rFonts w:ascii="Calibri" w:hAnsi="Calibri" w:eastAsia="Calibri" w:cs="Calibri"/>
+                <w:b w:val="0"/>
+                <w:color w:val="000000"/>
+                <w:sz w:val="22"/>
+                <w:szCs w:val="22"/>
+              </w:rPr>
+              <w:t>meros</w:t>
             </w:r>
           </w:p>
         </w:tc>
@@ -3965,7 +3986,28 @@
                 <w:sz w:val="22"/>
                 <w:szCs w:val="22"/>
               </w:rPr>
-              <w:t>Resta el segundo al primer numero</w:t>
+              <w:t>Resta el segundo al primer n</w:t>
+            </w:r>
+            <w:r>
+              <w:rPr>
+                <w:rFonts w:hint="default" w:cs="Calibri"/>
+                <w:b w:val="0"/>
+                <w:color w:val="000000"/>
+                <w:sz w:val="22"/>
+                <w:szCs w:val="22"/>
+                <w:lang w:val="es-MX"/>
+              </w:rPr>
+              <w:t>ú</w:t>
+            </w:r>
+            <w:r>
+              <w:rPr>
+                <w:rFonts w:ascii="Calibri" w:hAnsi="Calibri" w:eastAsia="Calibri" w:cs="Calibri"/>
+                <w:b w:val="0"/>
+                <w:color w:val="000000"/>
+                <w:sz w:val="22"/>
+                <w:szCs w:val="22"/>
+              </w:rPr>
+              <w:t>mero</w:t>
             </w:r>
           </w:p>
         </w:tc>
@@ -4133,7 +4175,28 @@
                 <w:sz w:val="22"/>
                 <w:szCs w:val="22"/>
               </w:rPr>
-              <w:t>Multiplica do números</w:t>
+              <w:t>Multiplica do</w:t>
+            </w:r>
+            <w:r>
+              <w:rPr>
+                <w:rFonts w:hint="default" w:cs="Calibri"/>
+                <w:b w:val="0"/>
+                <w:color w:val="000000"/>
+                <w:sz w:val="22"/>
+                <w:szCs w:val="22"/>
+                <w:lang w:val="es-MX"/>
+              </w:rPr>
+              <w:t>s</w:t>
+            </w:r>
+            <w:r>
+              <w:rPr>
+                <w:rFonts w:ascii="Calibri" w:hAnsi="Calibri" w:eastAsia="Calibri" w:cs="Calibri"/>
+                <w:b w:val="0"/>
+                <w:color w:val="000000"/>
+                <w:sz w:val="22"/>
+                <w:szCs w:val="22"/>
+              </w:rPr>
+              <w:t xml:space="preserve"> números</w:t>
             </w:r>
           </w:p>
         </w:tc>
@@ -4280,9 +4343,17 @@
             </w:pPr>
             <w:r>
               <w:rPr>
-                <w:b w:val="0"/>
-              </w:rPr>
-              <w:t>divide el primer número entre el segundo y da decimales</w:t>
+                <w:rFonts w:hint="default"/>
+                <w:b w:val="0"/>
+                <w:lang w:val="es-MX"/>
+              </w:rPr>
+              <w:t>D</w:t>
+            </w:r>
+            <w:r>
+              <w:rPr>
+                <w:b w:val="0"/>
+              </w:rPr>
+              <w:t>ivide el primer número entre el segundo y da decimales</w:t>
             </w:r>
           </w:p>
         </w:tc>
@@ -4430,13 +4501,24 @@
             </w:pPr>
             <w:r>
               <w:rPr>
-                <w:rFonts w:ascii="Calibri" w:hAnsi="Calibri" w:eastAsia="Calibri" w:cs="Calibri"/>
+                <w:rFonts w:hint="default" w:cs="Calibri"/>
                 <w:b w:val="0"/>
                 <w:color w:val="000000"/>
                 <w:sz w:val="22"/>
                 <w:szCs w:val="22"/>
-              </w:rPr>
-              <w:t>divide y deja solo la parte entera, borrando los decimales</w:t>
+                <w:lang w:val="es-MX"/>
+              </w:rPr>
+              <w:t>D</w:t>
+            </w:r>
+            <w:r>
+              <w:rPr>
+                <w:rFonts w:ascii="Calibri" w:hAnsi="Calibri" w:eastAsia="Calibri" w:cs="Calibri"/>
+                <w:b w:val="0"/>
+                <w:color w:val="000000"/>
+                <w:sz w:val="22"/>
+                <w:szCs w:val="22"/>
+              </w:rPr>
+              <w:t>ivide y deja solo la parte entera, borrando los decimales</w:t>
             </w:r>
           </w:p>
         </w:tc>
@@ -4558,7 +4640,19 @@
                 <w:sz w:val="22"/>
                 <w:szCs w:val="22"/>
               </w:rPr>
-              <w:t>Modulo</w:t>
+              <w:t>Mod</w:t>
+            </w:r>
+            <w:bookmarkStart w:id="69" w:name="_GoBack"/>
+            <w:bookmarkEnd w:id="69"/>
+            <w:r>
+              <w:rPr>
+                <w:rFonts w:ascii="Calibri" w:hAnsi="Calibri" w:eastAsia="Calibri" w:cs="Calibri"/>
+                <w:b w:val="0"/>
+                <w:color w:val="000000"/>
+                <w:sz w:val="22"/>
+                <w:szCs w:val="22"/>
+              </w:rPr>
+              <w:t>ulo</w:t>
             </w:r>
           </w:p>
         </w:tc>
@@ -4584,13 +4678,24 @@
             </w:pPr>
             <w:r>
               <w:rPr>
-                <w:rFonts w:ascii="Calibri" w:hAnsi="Calibri" w:eastAsia="Calibri" w:cs="Calibri"/>
+                <w:rFonts w:hint="default" w:cs="Calibri"/>
                 <w:b w:val="0"/>
                 <w:color w:val="000000"/>
                 <w:sz w:val="22"/>
                 <w:szCs w:val="22"/>
-              </w:rPr>
-              <w:t>da el residuo o resto de una división</w:t>
+                <w:lang w:val="es-MX"/>
+              </w:rPr>
+              <w:t>D</w:t>
+            </w:r>
+            <w:r>
+              <w:rPr>
+                <w:rFonts w:ascii="Calibri" w:hAnsi="Calibri" w:eastAsia="Calibri" w:cs="Calibri"/>
+                <w:b w:val="0"/>
+                <w:color w:val="000000"/>
+                <w:sz w:val="22"/>
+                <w:szCs w:val="22"/>
+              </w:rPr>
+              <w:t>a el residuo o resto de una división</w:t>
             </w:r>
           </w:p>
         </w:tc>
@@ -4757,7 +4862,38 @@
                   </w14:solidFill>
                 </w14:textFill>
               </w:rPr>
-              <w:t>Eleva el numero a la potencia</w:t>
+              <w:t>Eleva el n</w:t>
+            </w:r>
+            <w:r>
+              <w:rPr>
+                <w:rFonts w:hint="default" w:cs="Calibri"/>
+                <w:b w:val="0"/>
+                <w:color w:val="000000" w:themeColor="text1"/>
+                <w:sz w:val="22"/>
+                <w:szCs w:val="22"/>
+                <w:lang w:val="es-MX"/>
+                <w14:textFill>
+                  <w14:solidFill>
+                    <w14:schemeClr w14:val="tx1"/>
+                  </w14:solidFill>
+                </w14:textFill>
+              </w:rPr>
+              <w:t>ú</w:t>
+            </w:r>
+            <w:r>
+              <w:rPr>
+                <w:rFonts w:ascii="Calibri" w:hAnsi="Calibri" w:eastAsia="Calibri" w:cs="Calibri"/>
+                <w:b w:val="0"/>
+                <w:color w:val="000000" w:themeColor="text1"/>
+                <w:sz w:val="22"/>
+                <w:szCs w:val="22"/>
+                <w14:textFill>
+                  <w14:solidFill>
+                    <w14:schemeClr w14:val="tx1"/>
+                  </w14:solidFill>
+                </w14:textFill>
+              </w:rPr>
+              <w:t>mero a la potencia</w:t>
             </w:r>
           </w:p>
         </w:tc>
@@ -8073,8 +8209,8 @@
         </w:tabs>
       </w:pPr>
       <w:bookmarkStart w:id="28" w:name="_Toc109806133"/>
-      <w:bookmarkStart w:id="29" w:name="_Toc1407782618"/>
-      <w:bookmarkStart w:id="30" w:name="_Toc110498797"/>
+      <w:bookmarkStart w:id="29" w:name="_Toc110498797"/>
+      <w:bookmarkStart w:id="30" w:name="_Toc1407782618"/>
       <w:bookmarkStart w:id="31" w:name="_Toc9622"/>
       <w:r>
         <w:t xml:space="preserve">Estructuras </w:t>
@@ -9151,12 +9287,6 @@
             <w:insideH w:val="single" w:color="666666" w:themeColor="text1" w:themeTint="99" w:sz="4" w:space="0"/>
             <w:insideV w:val="single" w:color="666666" w:themeColor="text1" w:themeTint="99" w:sz="4" w:space="0"/>
           </w:tblBorders>
-          <w:tblCellMar>
-            <w:top w:w="0" w:type="dxa"/>
-            <w:left w:w="108" w:type="dxa"/>
-            <w:bottom w:w="0" w:type="dxa"/>
-            <w:right w:w="108" w:type="dxa"/>
-          </w:tblCellMar>
         </w:tblPrEx>
         <w:trPr>
           <w:jc w:val="center"/>
@@ -11723,6 +11853,7 @@
     <w:p>
       <w:pPr>
         <w:numPr>
+          <w:ilvl w:val="0"/>
           <w:numId w:val="0"/>
         </w:numPr>
         <w:ind w:leftChars="0"/>
@@ -11776,6 +11907,7 @@
       <w:pPr>
         <w:pStyle w:val="14"/>
         <w:numPr>
+          <w:ilvl w:val="0"/>
           <w:numId w:val="0"/>
         </w:numPr>
         <w:ind w:leftChars="0"/>
@@ -11854,6 +11986,7 @@
     <w:p>
       <w:pPr>
         <w:numPr>
+          <w:ilvl w:val="0"/>
           <w:numId w:val="0"/>
         </w:numPr>
         <w:ind w:leftChars="0"/>
@@ -11907,6 +12040,7 @@
       <w:pPr>
         <w:pStyle w:val="14"/>
         <w:numPr>
+          <w:ilvl w:val="0"/>
           <w:numId w:val="0"/>
         </w:numPr>
         <w:ind w:leftChars="0"/>
@@ -11966,16 +12100,7 @@
           <w:rFonts w:hint="default"/>
           <w:lang w:val="es-MX"/>
         </w:rPr>
-        <w:t xml:space="preserve"> Sirve para buscar la </w:t>
-      </w:r>
-      <w:bookmarkStart w:id="69" w:name="_GoBack"/>
-      <w:bookmarkEnd w:id="69"/>
-      <w:r>
-        <w:rPr>
-          <w:rFonts w:hint="default"/>
-          <w:lang w:val="es-MX"/>
-        </w:rPr>
-        <w:t>primer coincidencia de un elemento y saber en qué posición (índice) se encuentra</w:t>
+        <w:t xml:space="preserve"> Sirve para buscar la primer coincidencia de un elemento y saber en qué posición (índice) se encuentra</w:t>
       </w:r>
     </w:p>
     <w:p>
@@ -12792,6 +12917,7 @@
     <w:p>
       <w:pPr>
         <w:numPr>
+          <w:ilvl w:val="0"/>
           <w:numId w:val="0"/>
         </w:numPr>
         <w:ind w:leftChars="0"/>
@@ -13153,6 +13279,7 @@
     <w:p>
       <w:pPr>
         <w:numPr>
+          <w:ilvl w:val="0"/>
           <w:numId w:val="0"/>
         </w:numPr>
         <w:jc w:val="center"/>
@@ -13205,6 +13332,7 @@
       <w:pPr>
         <w:pStyle w:val="14"/>
         <w:numPr>
+          <w:ilvl w:val="0"/>
           <w:numId w:val="0"/>
         </w:numPr>
         <w:jc w:val="center"/>
@@ -13546,6 +13674,7 @@
     <w:p>
       <w:pPr>
         <w:numPr>
+          <w:ilvl w:val="0"/>
           <w:numId w:val="0"/>
         </w:numPr>
         <w:jc w:val="center"/>
@@ -13598,6 +13727,7 @@
       <w:pPr>
         <w:pStyle w:val="14"/>
         <w:numPr>
+          <w:ilvl w:val="0"/>
           <w:numId w:val="0"/>
         </w:numPr>
         <w:jc w:val="center"/>
@@ -17263,6 +17393,7 @@
     <w:lvl w:ilvl="4" w:tentative="0">
       <w:start w:val="1"/>
       <w:numFmt w:val="decimal"/>
+      <w:pStyle w:val="6"/>
       <w:lvlText w:val="%1.%2.%3.%4.%5."/>
       <w:lvlJc w:val="left"/>
       <w:pPr>
@@ -17918,7 +18049,7 @@
     <w:lsdException w:uiPriority="99" w:name="HTML Acronym"/>
     <w:lsdException w:uiPriority="99" w:name="HTML Address"/>
     <w:lsdException w:uiPriority="99" w:name="HTML Cite"/>
-    <w:lsdException w:uiPriority="99" w:name="HTML Code"/>
+    <w:lsdException w:qFormat="1" w:uiPriority="99" w:name="HTML Code"/>
     <w:lsdException w:uiPriority="99" w:name="HTML Definition"/>
     <w:lsdException w:uiPriority="99" w:name="HTML Keyboard"/>
     <w:lsdException w:uiPriority="99" w:name="HTML Preformatted"/>
@@ -18153,6 +18284,7 @@
     <w:basedOn w:val="7"/>
     <w:semiHidden/>
     <w:unhideWhenUsed/>
+    <w:qFormat/>
     <w:uiPriority w:val="99"/>
     <w:rPr>
       <w:rFonts w:ascii="Courier New" w:hAnsi="Courier New" w:cs="Courier New"/>

</xml_diff>

<commit_message>
docs(python-notes): add new notes on loop control
Update Notas_Python.docx in the docs folder with detailed notes and concepts regarding loop control statements.
</commit_message>
<xml_diff>
--- a/docs/Notas_Python.docx
+++ b/docs/Notas_Python.docx
@@ -3357,8 +3357,8 @@
         <w:pStyle w:val="3"/>
         <w:bidi w:val="0"/>
       </w:pPr>
-      <w:bookmarkStart w:id="16" w:name="_Toc30678"/>
-      <w:bookmarkStart w:id="17" w:name="_Toc25641"/>
+      <w:bookmarkStart w:id="16" w:name="_Toc25641"/>
+      <w:bookmarkStart w:id="17" w:name="_Toc30678"/>
       <w:r>
         <w:t>Operadores</w:t>
       </w:r>
@@ -4640,19 +4640,7 @@
                 <w:sz w:val="22"/>
                 <w:szCs w:val="22"/>
               </w:rPr>
-              <w:t>Mod</w:t>
-            </w:r>
-            <w:bookmarkStart w:id="69" w:name="_GoBack"/>
-            <w:bookmarkEnd w:id="69"/>
-            <w:r>
-              <w:rPr>
-                <w:rFonts w:ascii="Calibri" w:hAnsi="Calibri" w:eastAsia="Calibri" w:cs="Calibri"/>
-                <w:b w:val="0"/>
-                <w:color w:val="000000"/>
-                <w:sz w:val="22"/>
-                <w:szCs w:val="22"/>
-              </w:rPr>
-              <w:t>ulo</w:t>
+              <w:t>Modulo</w:t>
             </w:r>
           </w:p>
         </w:tc>
@@ -8209,8 +8197,8 @@
         </w:tabs>
       </w:pPr>
       <w:bookmarkStart w:id="28" w:name="_Toc109806133"/>
-      <w:bookmarkStart w:id="29" w:name="_Toc110498797"/>
-      <w:bookmarkStart w:id="30" w:name="_Toc1407782618"/>
+      <w:bookmarkStart w:id="29" w:name="_Toc1407782618"/>
+      <w:bookmarkStart w:id="30" w:name="_Toc110498797"/>
       <w:bookmarkStart w:id="31" w:name="_Toc9622"/>
       <w:r>
         <w:t xml:space="preserve">Estructuras </w:t>
@@ -8832,12 +8820,6 @@
             <w:insideH w:val="single" w:color="666666" w:themeColor="text1" w:themeTint="99" w:sz="4" w:space="0"/>
             <w:insideV w:val="single" w:color="666666" w:themeColor="text1" w:themeTint="99" w:sz="4" w:space="0"/>
           </w:tblBorders>
-          <w:tblCellMar>
-            <w:top w:w="0" w:type="dxa"/>
-            <w:left w:w="108" w:type="dxa"/>
-            <w:bottom w:w="0" w:type="dxa"/>
-            <w:right w:w="108" w:type="dxa"/>
-          </w:tblCellMar>
         </w:tblPrEx>
         <w:trPr>
           <w:jc w:val="center"/>
@@ -9287,6 +9269,12 @@
             <w:insideH w:val="single" w:color="666666" w:themeColor="text1" w:themeTint="99" w:sz="4" w:space="0"/>
             <w:insideV w:val="single" w:color="666666" w:themeColor="text1" w:themeTint="99" w:sz="4" w:space="0"/>
           </w:tblBorders>
+          <w:tblCellMar>
+            <w:top w:w="0" w:type="dxa"/>
+            <w:left w:w="108" w:type="dxa"/>
+            <w:bottom w:w="0" w:type="dxa"/>
+            <w:right w:w="108" w:type="dxa"/>
+          </w:tblCellMar>
         </w:tblPrEx>
         <w:trPr>
           <w:jc w:val="center"/>
@@ -9750,12 +9738,6 @@
             <w:insideH w:val="single" w:color="auto" w:sz="4" w:space="0"/>
             <w:insideV w:val="single" w:color="auto" w:sz="4" w:space="0"/>
           </w:tblBorders>
-          <w:tblCellMar>
-            <w:top w:w="0" w:type="dxa"/>
-            <w:left w:w="108" w:type="dxa"/>
-            <w:bottom w:w="0" w:type="dxa"/>
-            <w:right w:w="108" w:type="dxa"/>
-          </w:tblCellMar>
         </w:tblPrEx>
         <w:tc>
           <w:tcPr>
@@ -10617,10 +10599,503 @@
     </w:p>
     <w:p>
       <w:pPr>
+        <w:pStyle w:val="4"/>
+        <w:tabs>
+          <w:tab w:val="left" w:pos="850"/>
+          <w:tab w:val="clear" w:pos="709"/>
+        </w:tabs>
+        <w:bidi w:val="0"/>
+        <w:rPr>
+          <w:rFonts w:hint="default" w:ascii="Calibri" w:hAnsi="Calibri" w:eastAsiaTheme="majorEastAsia" w:cstheme="majorBidi"/>
+          <w:color w:val="104862" w:themeColor="accent1" w:themeShade="BF"/>
+          <w:sz w:val="28"/>
+          <w:szCs w:val="28"/>
+          <w:lang w:val="es-MX" w:eastAsia="en-US" w:bidi="ar-SA"/>
+        </w:rPr>
+      </w:pPr>
+      <w:bookmarkStart w:id="41" w:name="_Toc20794"/>
+      <w:r>
+        <w:rPr>
+          <w:rFonts w:hint="default" w:cstheme="majorBidi"/>
+          <w:color w:val="104862" w:themeColor="accent1" w:themeShade="BF"/>
+          <w:sz w:val="28"/>
+          <w:szCs w:val="28"/>
+          <w:lang w:val="es-MX" w:eastAsia="en-US" w:bidi="ar-SA"/>
+        </w:rPr>
+        <w:t>Control de Bucle</w:t>
+      </w:r>
+    </w:p>
+    <w:p>
+      <w:pPr>
+        <w:bidi w:val="0"/>
+        <w:rPr>
+          <w:rFonts w:hint="default"/>
+          <w:lang w:val="es-MX" w:eastAsia="en-US"/>
+        </w:rPr>
+      </w:pPr>
+      <w:r>
+        <w:rPr>
+          <w:rFonts w:hint="default"/>
+          <w:lang w:val="es-MX" w:eastAsia="en-US"/>
+        </w:rPr>
+        <w:t>Existen algunas instruciones especiales para controlar el flujo de ejecución dentro de los bucles</w:t>
+      </w:r>
+    </w:p>
+    <w:p>
+      <w:pPr>
+        <w:pStyle w:val="5"/>
+        <w:bidi w:val="0"/>
+        <w:rPr>
+          <w:rFonts w:hint="default"/>
+          <w:lang w:val="es-MX" w:eastAsia="en-US"/>
+        </w:rPr>
+      </w:pPr>
+      <w:r>
+        <w:rPr>
+          <w:rFonts w:hint="default"/>
+          <w:lang w:val="es-MX" w:eastAsia="en-US"/>
+        </w:rPr>
+        <w:t xml:space="preserve">Break </w:t>
+      </w:r>
+    </w:p>
+    <w:p>
+      <w:pPr>
+        <w:rPr>
+          <w:rFonts w:hint="default"/>
+          <w:lang w:val="es-MX" w:eastAsia="en-US"/>
+        </w:rPr>
+      </w:pPr>
+      <w:r>
+        <w:rPr>
+          <w:rFonts w:hint="default"/>
+          <w:lang w:val="es-MX" w:eastAsia="en-US"/>
+        </w:rPr>
+        <w:t>Se utiliza para salir prematuramente de un bucle, independientemente de la condición. Cuando se encuentra un break, el bucle se detiene y el flujo de ejecución continúa con la siguiente instrucción fuera del bucle.</w:t>
+      </w:r>
+    </w:p>
+    <w:p>
+      <w:pPr>
+        <w:pStyle w:val="14"/>
+        <w:jc w:val="center"/>
+        <w:rPr>
+          <w:rFonts w:hint="default"/>
+          <w:lang w:val="es-MX"/>
+        </w:rPr>
+      </w:pPr>
+      <w:r>
+        <w:t xml:space="preserve">Ejemplo </w:t>
+      </w:r>
+      <w:r>
+        <w:fldChar w:fldCharType="begin"/>
+      </w:r>
+      <w:r>
+        <w:instrText xml:space="preserve"> SEQ Ejemplo \* ARABIC </w:instrText>
+      </w:r>
+      <w:r>
+        <w:fldChar w:fldCharType="separate"/>
+      </w:r>
+      <w:r>
+        <w:t>4</w:t>
+      </w:r>
+      <w:r>
+        <w:fldChar w:fldCharType="end"/>
+      </w:r>
+      <w:r>
+        <w:rPr>
+          <w:lang w:val="es-MX"/>
+        </w:rPr>
+        <w:t xml:space="preserve"> Control break</w:t>
+      </w:r>
+    </w:p>
+    <w:p>
+      <w:pPr>
+        <w:jc w:val="center"/>
+        <w:rPr>
+          <w:rFonts w:hint="default"/>
+          <w:lang w:val="es-MX" w:eastAsia="en-US"/>
+        </w:rPr>
+      </w:pPr>
+      <w:r>
+        <w:drawing>
+          <wp:inline distT="0" distB="0" distL="114300" distR="114300">
+            <wp:extent cx="1638300" cy="1114425"/>
+            <wp:effectExtent l="0" t="0" r="0" b="9525"/>
+            <wp:docPr id="30" name="Imagen 1"/>
+            <wp:cNvGraphicFramePr>
+              <a:graphicFrameLocks xmlns:a="http://schemas.openxmlformats.org/drawingml/2006/main" noChangeAspect="1"/>
+            </wp:cNvGraphicFramePr>
+            <a:graphic xmlns:a="http://schemas.openxmlformats.org/drawingml/2006/main">
+              <a:graphicData uri="http://schemas.openxmlformats.org/drawingml/2006/picture">
+                <pic:pic xmlns:pic="http://schemas.openxmlformats.org/drawingml/2006/picture">
+                  <pic:nvPicPr>
+                    <pic:cNvPr id="30" name="Imagen 1"/>
+                    <pic:cNvPicPr>
+                      <a:picLocks noChangeAspect="1"/>
+                    </pic:cNvPicPr>
+                  </pic:nvPicPr>
+                  <pic:blipFill>
+                    <a:blip r:embed="rId25"/>
+                    <a:stretch>
+                      <a:fillRect/>
+                    </a:stretch>
+                  </pic:blipFill>
+                  <pic:spPr>
+                    <a:xfrm>
+                      <a:off x="0" y="0"/>
+                      <a:ext cx="1638300" cy="1114425"/>
+                    </a:xfrm>
+                    <a:prstGeom prst="rect">
+                      <a:avLst/>
+                    </a:prstGeom>
+                    <a:noFill/>
+                    <a:ln>
+                      <a:noFill/>
+                    </a:ln>
+                  </pic:spPr>
+                </pic:pic>
+              </a:graphicData>
+            </a:graphic>
+          </wp:inline>
+        </w:drawing>
+      </w:r>
+    </w:p>
+    <w:p>
+      <w:pPr>
+        <w:rPr>
+          <w:rFonts w:hint="default"/>
+          <w:lang w:val="es-MX" w:eastAsia="en-US"/>
+        </w:rPr>
+      </w:pPr>
+      <w:r>
+        <w:rPr>
+          <w:rFonts w:hint="default"/>
+          <w:lang w:val="es-MX" w:eastAsia="en-US"/>
+        </w:rPr>
+        <w:t xml:space="preserve">El bucle </w:t>
+      </w:r>
+      <w:r>
+        <w:rPr>
+          <w:rFonts w:hint="default"/>
+          <w:i/>
+          <w:iCs/>
+          <w:lang w:val="es-MX" w:eastAsia="en-US"/>
+        </w:rPr>
+        <w:t>while</w:t>
+      </w:r>
+      <w:r>
+        <w:rPr>
+          <w:rFonts w:hint="default"/>
+          <w:lang w:val="es-MX" w:eastAsia="en-US"/>
+        </w:rPr>
+        <w:t xml:space="preserve"> se ejecuta indefinidamente debido a la condición </w:t>
+      </w:r>
+      <w:r>
+        <w:rPr>
+          <w:rFonts w:hint="default"/>
+          <w:i/>
+          <w:iCs/>
+          <w:lang w:val="es-MX" w:eastAsia="en-US"/>
+        </w:rPr>
+        <w:t>True</w:t>
+      </w:r>
+      <w:r>
+        <w:rPr>
+          <w:rFonts w:hint="default"/>
+          <w:lang w:val="es-MX" w:eastAsia="en-US"/>
+        </w:rPr>
+        <w:t>. Se utiliza una estructura condicional para verificar si contador es igual a 5. Cuando se cumple esta condición, el bucle se detene y el flujo de ejecución continúe fuera del bucle.</w:t>
+      </w:r>
+    </w:p>
+    <w:p>
+      <w:pPr>
+        <w:pStyle w:val="5"/>
+        <w:bidi w:val="0"/>
+        <w:rPr>
+          <w:rFonts w:hint="default"/>
+          <w:lang w:val="es-MX" w:eastAsia="en-US"/>
+        </w:rPr>
+      </w:pPr>
+      <w:r>
+        <w:rPr>
+          <w:rFonts w:hint="default"/>
+          <w:lang w:val="es-MX" w:eastAsia="en-US"/>
+        </w:rPr>
+        <w:t>Continue</w:t>
+      </w:r>
+    </w:p>
+    <w:p>
+      <w:pPr>
+        <w:rPr>
+          <w:rFonts w:hint="default"/>
+          <w:lang w:val="es-MX" w:eastAsia="en-US"/>
+        </w:rPr>
+      </w:pPr>
+      <w:r>
+        <w:rPr>
+          <w:rFonts w:hint="default"/>
+          <w:lang w:val="es-MX" w:eastAsia="en-US"/>
+        </w:rPr>
+        <w:t>La instrucción continue se utiliza para saltar el resto del bloque de código dentro de un bucle y pasar a la siguiente iteración.</w:t>
+      </w:r>
+    </w:p>
+    <w:p>
+      <w:pPr>
+        <w:pStyle w:val="14"/>
+        <w:jc w:val="center"/>
+        <w:rPr>
+          <w:rFonts w:hint="default"/>
+          <w:lang w:val="es-MX"/>
+        </w:rPr>
+      </w:pPr>
+      <w:r>
+        <w:t xml:space="preserve">Ejemplo </w:t>
+      </w:r>
+      <w:r>
+        <w:fldChar w:fldCharType="begin"/>
+      </w:r>
+      <w:r>
+        <w:instrText xml:space="preserve"> SEQ Ejemplo \* ARABIC </w:instrText>
+      </w:r>
+      <w:r>
+        <w:fldChar w:fldCharType="separate"/>
+      </w:r>
+      <w:r>
+        <w:t>5</w:t>
+      </w:r>
+      <w:r>
+        <w:fldChar w:fldCharType="end"/>
+      </w:r>
+      <w:r>
+        <w:rPr>
+          <w:lang w:val="es-MX"/>
+        </w:rPr>
+        <w:t xml:space="preserve"> Control Continue</w:t>
+      </w:r>
+    </w:p>
+    <w:p>
+      <w:pPr>
+        <w:jc w:val="center"/>
+      </w:pPr>
+      <w:r>
+        <w:drawing>
+          <wp:inline distT="0" distB="0" distL="114300" distR="114300">
+            <wp:extent cx="1466850" cy="800100"/>
+            <wp:effectExtent l="0" t="0" r="0" b="0"/>
+            <wp:docPr id="33" name="Imagen 2"/>
+            <wp:cNvGraphicFramePr>
+              <a:graphicFrameLocks xmlns:a="http://schemas.openxmlformats.org/drawingml/2006/main" noChangeAspect="1"/>
+            </wp:cNvGraphicFramePr>
+            <a:graphic xmlns:a="http://schemas.openxmlformats.org/drawingml/2006/main">
+              <a:graphicData uri="http://schemas.openxmlformats.org/drawingml/2006/picture">
+                <pic:pic xmlns:pic="http://schemas.openxmlformats.org/drawingml/2006/picture">
+                  <pic:nvPicPr>
+                    <pic:cNvPr id="33" name="Imagen 2"/>
+                    <pic:cNvPicPr>
+                      <a:picLocks noChangeAspect="1"/>
+                    </pic:cNvPicPr>
+                  </pic:nvPicPr>
+                  <pic:blipFill>
+                    <a:blip r:embed="rId26"/>
+                    <a:stretch>
+                      <a:fillRect/>
+                    </a:stretch>
+                  </pic:blipFill>
+                  <pic:spPr>
+                    <a:xfrm>
+                      <a:off x="0" y="0"/>
+                      <a:ext cx="1466850" cy="800100"/>
+                    </a:xfrm>
+                    <a:prstGeom prst="rect">
+                      <a:avLst/>
+                    </a:prstGeom>
+                    <a:noFill/>
+                    <a:ln>
+                      <a:noFill/>
+                    </a:ln>
+                  </pic:spPr>
+                </pic:pic>
+              </a:graphicData>
+            </a:graphic>
+          </wp:inline>
+        </w:drawing>
+      </w:r>
+    </w:p>
+    <w:p>
+      <w:pPr>
+        <w:jc w:val="both"/>
+        <w:rPr>
+          <w:rFonts w:hint="default"/>
+          <w:lang w:val="es-MX" w:eastAsia="en-US"/>
+        </w:rPr>
+      </w:pPr>
+      <w:r>
+        <w:rPr>
+          <w:rFonts w:hint="default"/>
+          <w:lang w:val="es-MX" w:eastAsia="en-US"/>
+        </w:rPr>
+        <w:t xml:space="preserve">El bucle for itera sobre los números del 0 al 9. Dentro del bucle, se verifica si el número es divisible por 2. Si el número es par, se ejecuta la instrucción </w:t>
+      </w:r>
+      <w:r>
+        <w:rPr>
+          <w:rFonts w:hint="default"/>
+          <w:i/>
+          <w:iCs/>
+          <w:lang w:val="es-MX" w:eastAsia="en-US"/>
+        </w:rPr>
+        <w:t>continue</w:t>
+      </w:r>
+      <w:r>
+        <w:rPr>
+          <w:rFonts w:hint="default"/>
+          <w:lang w:val="es-MX" w:eastAsia="en-US"/>
+        </w:rPr>
+        <w:t>, lo que hace que se salte el resto del bloque de código y se pase a la siguiente iteración del bucle. Como resultado, solo se imprimirán los números impares.</w:t>
+      </w:r>
+    </w:p>
+    <w:p>
+      <w:pPr>
+        <w:pStyle w:val="5"/>
+        <w:bidi w:val="0"/>
+        <w:rPr>
+          <w:rFonts w:hint="default"/>
+          <w:lang w:val="es-MX" w:eastAsia="en-US"/>
+        </w:rPr>
+      </w:pPr>
+      <w:r>
+        <w:rPr>
+          <w:rFonts w:hint="default"/>
+          <w:lang w:val="es-MX" w:eastAsia="en-US"/>
+        </w:rPr>
+        <w:t>Pass</w:t>
+      </w:r>
+    </w:p>
+    <w:p>
+      <w:pPr>
+        <w:rPr>
+          <w:rFonts w:hint="default"/>
+          <w:lang w:val="es-MX" w:eastAsia="en-US"/>
+        </w:rPr>
+      </w:pPr>
+      <w:r>
+        <w:rPr>
+          <w:rFonts w:hint="default"/>
+          <w:lang w:val="es-MX" w:eastAsia="en-US"/>
+        </w:rPr>
+        <w:t>Es una operación nula que no hace nada. Se utiliza como marcador de posición cuando se requiere una instrucción sintácticamente, pero no se desea realizar ninguna acción.</w:t>
+      </w:r>
+    </w:p>
+    <w:p>
+      <w:pPr>
+        <w:pStyle w:val="14"/>
+        <w:jc w:val="center"/>
+        <w:rPr>
+          <w:rFonts w:hint="default"/>
+          <w:lang w:val="es-MX"/>
+        </w:rPr>
+      </w:pPr>
+      <w:r>
+        <w:t xml:space="preserve">Ejemplo </w:t>
+      </w:r>
+      <w:r>
+        <w:fldChar w:fldCharType="begin"/>
+      </w:r>
+      <w:r>
+        <w:instrText xml:space="preserve"> SEQ Ejemplo \* ARABIC </w:instrText>
+      </w:r>
+      <w:r>
+        <w:fldChar w:fldCharType="separate"/>
+      </w:r>
+      <w:r>
+        <w:t>6</w:t>
+      </w:r>
+      <w:r>
+        <w:fldChar w:fldCharType="end"/>
+      </w:r>
+      <w:r>
+        <w:rPr>
+          <w:lang w:val="es-MX"/>
+        </w:rPr>
+        <w:t xml:space="preserve"> Control Pass</w:t>
+      </w:r>
+    </w:p>
+    <w:p>
+      <w:pPr>
+        <w:jc w:val="center"/>
+      </w:pPr>
+      <w:r>
+        <w:drawing>
+          <wp:inline distT="0" distB="0" distL="114300" distR="114300">
+            <wp:extent cx="1371600" cy="419100"/>
+            <wp:effectExtent l="0" t="0" r="0" b="0"/>
+            <wp:docPr id="34" name="Imagen 3"/>
+            <wp:cNvGraphicFramePr>
+              <a:graphicFrameLocks xmlns:a="http://schemas.openxmlformats.org/drawingml/2006/main" noChangeAspect="1"/>
+            </wp:cNvGraphicFramePr>
+            <a:graphic xmlns:a="http://schemas.openxmlformats.org/drawingml/2006/main">
+              <a:graphicData uri="http://schemas.openxmlformats.org/drawingml/2006/picture">
+                <pic:pic xmlns:pic="http://schemas.openxmlformats.org/drawingml/2006/picture">
+                  <pic:nvPicPr>
+                    <pic:cNvPr id="34" name="Imagen 3"/>
+                    <pic:cNvPicPr>
+                      <a:picLocks noChangeAspect="1"/>
+                    </pic:cNvPicPr>
+                  </pic:nvPicPr>
+                  <pic:blipFill>
+                    <a:blip r:embed="rId27"/>
+                    <a:stretch>
+                      <a:fillRect/>
+                    </a:stretch>
+                  </pic:blipFill>
+                  <pic:spPr>
+                    <a:xfrm>
+                      <a:off x="0" y="0"/>
+                      <a:ext cx="1371600" cy="419100"/>
+                    </a:xfrm>
+                    <a:prstGeom prst="rect">
+                      <a:avLst/>
+                    </a:prstGeom>
+                    <a:noFill/>
+                    <a:ln>
+                      <a:noFill/>
+                    </a:ln>
+                  </pic:spPr>
+                </pic:pic>
+              </a:graphicData>
+            </a:graphic>
+          </wp:inline>
+        </w:drawing>
+      </w:r>
+    </w:p>
+    <w:p>
+      <w:pPr>
+        <w:jc w:val="both"/>
+        <w:rPr>
+          <w:rFonts w:hint="default"/>
+          <w:lang w:val="es-MX" w:eastAsia="en-US"/>
+        </w:rPr>
+      </w:pPr>
+      <w:r>
+        <w:rPr>
+          <w:rFonts w:hint="default"/>
+          <w:lang w:val="es-MX" w:eastAsia="en-US"/>
+        </w:rPr>
+        <w:t xml:space="preserve">El bucle itera sobre los números del 0 al 4, pero no se realiza ninguna acción dentro </w:t>
+      </w:r>
+      <w:bookmarkStart w:id="69" w:name="_GoBack"/>
+      <w:bookmarkEnd w:id="69"/>
+      <w:r>
+        <w:rPr>
+          <w:rFonts w:hint="default"/>
+          <w:lang w:val="es-MX" w:eastAsia="en-US"/>
+        </w:rPr>
+        <w:t>debido a la instrucción pass. Esto puede ser útil cuando se está desarrollando un programa y se desea reservar un bloque de código para implementarlo más adelante.</w:t>
+      </w:r>
+    </w:p>
+    <w:p>
+      <w:pPr>
         <w:pStyle w:val="2"/>
         <w:bidi w:val="0"/>
       </w:pPr>
-      <w:bookmarkStart w:id="41" w:name="_Toc20794"/>
       <w:r>
         <w:rPr>
           <w:rFonts w:hint="default"/>
@@ -10749,7 +11224,7 @@
                     </pic:cNvPicPr>
                   </pic:nvPicPr>
                   <pic:blipFill>
-                    <a:blip r:embed="rId25"/>
+                    <a:blip r:embed="rId28"/>
                     <a:stretch>
                       <a:fillRect/>
                     </a:stretch>
@@ -10847,7 +11322,7 @@
                     </pic:cNvPicPr>
                   </pic:nvPicPr>
                   <pic:blipFill>
-                    <a:blip r:embed="rId26"/>
+                    <a:blip r:embed="rId29"/>
                     <a:stretch>
                       <a:fillRect/>
                     </a:stretch>
@@ -10945,7 +11420,7 @@
                     </pic:cNvPicPr>
                   </pic:nvPicPr>
                   <pic:blipFill>
-                    <a:blip r:embed="rId27"/>
+                    <a:blip r:embed="rId30"/>
                     <a:stretch>
                       <a:fillRect/>
                     </a:stretch>
@@ -11126,7 +11601,7 @@
                     </pic:cNvPicPr>
                   </pic:nvPicPr>
                   <pic:blipFill>
-                    <a:blip r:embed="rId28"/>
+                    <a:blip r:embed="rId31"/>
                     <a:stretch>
                       <a:fillRect/>
                     </a:stretch>
@@ -11264,7 +11739,7 @@
                     </pic:cNvPicPr>
                   </pic:nvPicPr>
                   <pic:blipFill>
-                    <a:blip r:embed="rId29"/>
+                    <a:blip r:embed="rId32"/>
                     <a:stretch>
                       <a:fillRect/>
                     </a:stretch>
@@ -11387,7 +11862,7 @@
                     </pic:cNvPicPr>
                   </pic:nvPicPr>
                   <pic:blipFill>
-                    <a:blip r:embed="rId30"/>
+                    <a:blip r:embed="rId33"/>
                     <a:stretch>
                       <a:fillRect/>
                     </a:stretch>
@@ -11510,7 +11985,7 @@
                     </pic:cNvPicPr>
                   </pic:nvPicPr>
                   <pic:blipFill>
-                    <a:blip r:embed="rId31"/>
+                    <a:blip r:embed="rId34"/>
                     <a:stretch>
                       <a:fillRect/>
                     </a:stretch>
@@ -11633,7 +12108,7 @@
                     </pic:cNvPicPr>
                   </pic:nvPicPr>
                   <pic:blipFill>
-                    <a:blip r:embed="rId32"/>
+                    <a:blip r:embed="rId35"/>
                     <a:stretch>
                       <a:fillRect/>
                     </a:stretch>
@@ -11756,7 +12231,7 @@
                     </pic:cNvPicPr>
                   </pic:nvPicPr>
                   <pic:blipFill>
-                    <a:blip r:embed="rId33"/>
+                    <a:blip r:embed="rId36"/>
                     <a:stretch>
                       <a:fillRect/>
                     </a:stretch>
@@ -11878,7 +12353,7 @@
                     </pic:cNvPicPr>
                   </pic:nvPicPr>
                   <pic:blipFill>
-                    <a:blip r:embed="rId34"/>
+                    <a:blip r:embed="rId37"/>
                     <a:stretch>
                       <a:fillRect/>
                     </a:stretch>
@@ -12011,7 +12486,7 @@
                     </pic:cNvPicPr>
                   </pic:nvPicPr>
                   <pic:blipFill>
-                    <a:blip r:embed="rId35"/>
+                    <a:blip r:embed="rId38"/>
                     <a:stretch>
                       <a:fillRect/>
                     </a:stretch>
@@ -12130,7 +12605,7 @@
                     </pic:cNvPicPr>
                   </pic:nvPicPr>
                   <pic:blipFill>
-                    <a:blip r:embed="rId36"/>
+                    <a:blip r:embed="rId39"/>
                     <a:stretch>
                       <a:fillRect/>
                     </a:stretch>
@@ -12212,7 +12687,7 @@
                     </pic:cNvPicPr>
                   </pic:nvPicPr>
                   <pic:blipFill>
-                    <a:blip r:embed="rId37"/>
+                    <a:blip r:embed="rId40"/>
                     <a:stretch>
                       <a:fillRect/>
                     </a:stretch>
@@ -12327,7 +12802,7 @@
                     </pic:cNvPicPr>
                   </pic:nvPicPr>
                   <pic:blipFill>
-                    <a:blip r:embed="rId38"/>
+                    <a:blip r:embed="rId41"/>
                     <a:stretch>
                       <a:fillRect/>
                     </a:stretch>
@@ -12374,7 +12849,7 @@
         <w:fldChar w:fldCharType="separate"/>
       </w:r>
       <w:r>
-        <w:t>4</w:t>
+        <w:t>7</w:t>
       </w:r>
       <w:r>
         <w:fldChar w:fldCharType="end"/>
@@ -12521,7 +12996,7 @@
                     </pic:cNvPicPr>
                   </pic:nvPicPr>
                   <pic:blipFill>
-                    <a:blip r:embed="rId39"/>
+                    <a:blip r:embed="rId42"/>
                     <a:stretch>
                       <a:fillRect/>
                     </a:stretch>
@@ -12721,7 +13196,7 @@
                     </pic:cNvPicPr>
                   </pic:nvPicPr>
                   <pic:blipFill>
-                    <a:blip r:embed="rId40"/>
+                    <a:blip r:embed="rId43"/>
                     <a:stretch>
                       <a:fillRect/>
                     </a:stretch>
@@ -13303,7 +13778,7 @@
                     </pic:cNvPicPr>
                   </pic:nvPicPr>
                   <pic:blipFill>
-                    <a:blip r:embed="rId41"/>
+                    <a:blip r:embed="rId44"/>
                     <a:stretch>
                       <a:fillRect/>
                     </a:stretch>
@@ -13698,7 +14173,7 @@
                     </pic:cNvPicPr>
                   </pic:nvPicPr>
                   <pic:blipFill>
-                    <a:blip r:embed="rId42"/>
+                    <a:blip r:embed="rId45"/>
                     <a:stretch>
                       <a:fillRect/>
                     </a:stretch>

</xml_diff>

<commit_message>
feat(docs): update Notas_Python.docx with revised section titles and improved indexing
</commit_message>
<xml_diff>
--- a/docs/Notas_Python.docx
+++ b/docs/Notas_Python.docx
@@ -184,7 +184,7 @@
         <w:fldChar w:fldCharType="begin"/>
       </w:r>
       <w:r>
-        <w:instrText xml:space="preserve"> HYPERLINK \l _Toc2011 </w:instrText>
+        <w:instrText xml:space="preserve"> HYPERLINK \l _Toc14437 </w:instrText>
       </w:r>
       <w:r>
         <w:fldChar w:fldCharType="separate"/>
@@ -196,7 +196,11 @@
         <w:t xml:space="preserve">1. </w:t>
       </w:r>
       <w:r>
-        <w:t>CONCEPTOS BÁSICOS</w:t>
+        <w:rPr>
+          <w:rFonts w:hint="default"/>
+          <w:lang w:val="es-MX"/>
+        </w:rPr>
+        <w:t>Fundamentos</w:t>
       </w:r>
       <w:r>
         <w:tab/>
@@ -205,7 +209,7 @@
         <w:fldChar w:fldCharType="begin"/>
       </w:r>
       <w:r>
-        <w:instrText xml:space="preserve"> PAGEREF _Toc2011 \h </w:instrText>
+        <w:instrText xml:space="preserve"> PAGEREF _Toc14437 \h </w:instrText>
       </w:r>
       <w:r>
         <w:fldChar w:fldCharType="separate"/>
@@ -231,7 +235,7 @@
         <w:fldChar w:fldCharType="begin"/>
       </w:r>
       <w:r>
-        <w:instrText xml:space="preserve"> HYPERLINK \l _Toc15806 </w:instrText>
+        <w:instrText xml:space="preserve"> HYPERLINK \l _Toc25728 </w:instrText>
       </w:r>
       <w:r>
         <w:fldChar w:fldCharType="separate"/>
@@ -256,7 +260,7 @@
         <w:fldChar w:fldCharType="begin"/>
       </w:r>
       <w:r>
-        <w:instrText xml:space="preserve"> PAGEREF _Toc15806 \h </w:instrText>
+        <w:instrText xml:space="preserve"> PAGEREF _Toc25728 \h </w:instrText>
       </w:r>
       <w:r>
         <w:fldChar w:fldCharType="separate"/>
@@ -282,7 +286,7 @@
         <w:fldChar w:fldCharType="begin"/>
       </w:r>
       <w:r>
-        <w:instrText xml:space="preserve"> HYPERLINK \l _Toc17587 </w:instrText>
+        <w:instrText xml:space="preserve"> HYPERLINK \l _Toc18093 </w:instrText>
       </w:r>
       <w:r>
         <w:fldChar w:fldCharType="separate"/>
@@ -307,7 +311,7 @@
         <w:fldChar w:fldCharType="begin"/>
       </w:r>
       <w:r>
-        <w:instrText xml:space="preserve"> PAGEREF _Toc17587 \h </w:instrText>
+        <w:instrText xml:space="preserve"> PAGEREF _Toc18093 \h </w:instrText>
       </w:r>
       <w:r>
         <w:fldChar w:fldCharType="separate"/>
@@ -333,7 +337,7 @@
         <w:fldChar w:fldCharType="begin"/>
       </w:r>
       <w:r>
-        <w:instrText xml:space="preserve"> HYPERLINK \l _Toc25831 </w:instrText>
+        <w:instrText xml:space="preserve"> HYPERLINK \l _Toc7709 </w:instrText>
       </w:r>
       <w:r>
         <w:fldChar w:fldCharType="separate"/>
@@ -352,7 +356,7 @@
         <w:fldChar w:fldCharType="begin"/>
       </w:r>
       <w:r>
-        <w:instrText xml:space="preserve"> PAGEREF _Toc25831 \h </w:instrText>
+        <w:instrText xml:space="preserve"> PAGEREF _Toc7709 \h </w:instrText>
       </w:r>
       <w:r>
         <w:fldChar w:fldCharType="separate"/>
@@ -378,7 +382,7 @@
         <w:fldChar w:fldCharType="begin"/>
       </w:r>
       <w:r>
-        <w:instrText xml:space="preserve"> HYPERLINK \l _Toc6211 </w:instrText>
+        <w:instrText xml:space="preserve"> HYPERLINK \l _Toc18838 </w:instrText>
       </w:r>
       <w:r>
         <w:fldChar w:fldCharType="separate"/>
@@ -399,7 +403,7 @@
         <w:fldChar w:fldCharType="begin"/>
       </w:r>
       <w:r>
-        <w:instrText xml:space="preserve"> PAGEREF _Toc6211 \h </w:instrText>
+        <w:instrText xml:space="preserve"> PAGEREF _Toc18838 \h </w:instrText>
       </w:r>
       <w:r>
         <w:fldChar w:fldCharType="separate"/>
@@ -425,7 +429,7 @@
         <w:fldChar w:fldCharType="begin"/>
       </w:r>
       <w:r>
-        <w:instrText xml:space="preserve"> HYPERLINK \l _Toc26809 </w:instrText>
+        <w:instrText xml:space="preserve"> HYPERLINK \l _Toc28348 </w:instrText>
       </w:r>
       <w:r>
         <w:fldChar w:fldCharType="separate"/>
@@ -437,7 +441,11 @@
         <w:t xml:space="preserve">1.2.1. </w:t>
       </w:r>
       <w:r>
-        <w:t>Tipo de Variables</w:t>
+        <w:rPr>
+          <w:rFonts w:hint="default"/>
+          <w:lang w:val="es-MX"/>
+        </w:rPr>
+        <w:t>Alcance de Variables (Local vs Global)</w:t>
       </w:r>
       <w:r>
         <w:tab/>
@@ -446,7 +454,7 @@
         <w:fldChar w:fldCharType="begin"/>
       </w:r>
       <w:r>
-        <w:instrText xml:space="preserve"> PAGEREF _Toc26809 \h </w:instrText>
+        <w:instrText xml:space="preserve"> PAGEREF _Toc28348 \h </w:instrText>
       </w:r>
       <w:r>
         <w:fldChar w:fldCharType="separate"/>
@@ -472,7 +480,7 @@
         <w:fldChar w:fldCharType="begin"/>
       </w:r>
       <w:r>
-        <w:instrText xml:space="preserve"> HYPERLINK \l _Toc1125 </w:instrText>
+        <w:instrText xml:space="preserve"> HYPERLINK \l _Toc4551 </w:instrText>
       </w:r>
       <w:r>
         <w:fldChar w:fldCharType="separate"/>
@@ -484,6 +492,53 @@
         <w:t xml:space="preserve">1.2.2. </w:t>
       </w:r>
       <w:r>
+        <w:t>Tipo de Variables</w:t>
+      </w:r>
+      <w:r>
+        <w:tab/>
+      </w:r>
+      <w:r>
+        <w:fldChar w:fldCharType="begin"/>
+      </w:r>
+      <w:r>
+        <w:instrText xml:space="preserve"> PAGEREF _Toc4551 \h </w:instrText>
+      </w:r>
+      <w:r>
+        <w:fldChar w:fldCharType="separate"/>
+      </w:r>
+      <w:r>
+        <w:t>1</w:t>
+      </w:r>
+      <w:r>
+        <w:fldChar w:fldCharType="end"/>
+      </w:r>
+      <w:r>
+        <w:fldChar w:fldCharType="end"/>
+      </w:r>
+    </w:p>
+    <w:p>
+      <w:pPr>
+        <w:pStyle w:val="13"/>
+        <w:tabs>
+          <w:tab w:val="right" w:leader="dot" w:pos="8504"/>
+        </w:tabs>
+      </w:pPr>
+      <w:r>
+        <w:fldChar w:fldCharType="begin"/>
+      </w:r>
+      <w:r>
+        <w:instrText xml:space="preserve"> HYPERLINK \l _Toc5531 </w:instrText>
+      </w:r>
+      <w:r>
+        <w:fldChar w:fldCharType="separate"/>
+      </w:r>
+      <w:r>
+        <w:rPr>
+          <w:rFonts w:hint="default"/>
+        </w:rPr>
+        <w:t xml:space="preserve">1.2.3. </w:t>
+      </w:r>
+      <w:r>
         <w:t>Casteo de datos o casting</w:t>
       </w:r>
       <w:r>
@@ -493,7 +548,7 @@
         <w:fldChar w:fldCharType="begin"/>
       </w:r>
       <w:r>
-        <w:instrText xml:space="preserve"> PAGEREF _Toc1125 \h </w:instrText>
+        <w:instrText xml:space="preserve"> PAGEREF _Toc5531 \h </w:instrText>
       </w:r>
       <w:r>
         <w:fldChar w:fldCharType="separate"/>
@@ -519,7 +574,7 @@
         <w:fldChar w:fldCharType="begin"/>
       </w:r>
       <w:r>
-        <w:instrText xml:space="preserve"> HYPERLINK \l _Toc25641 </w:instrText>
+        <w:instrText xml:space="preserve"> HYPERLINK \l _Toc5617 </w:instrText>
       </w:r>
       <w:r>
         <w:fldChar w:fldCharType="separate"/>
@@ -540,13 +595,13 @@
         <w:fldChar w:fldCharType="begin"/>
       </w:r>
       <w:r>
-        <w:instrText xml:space="preserve"> PAGEREF _Toc25641 \h </w:instrText>
+        <w:instrText xml:space="preserve"> PAGEREF _Toc5617 \h </w:instrText>
       </w:r>
       <w:r>
         <w:fldChar w:fldCharType="separate"/>
       </w:r>
       <w:r>
-        <w:t>2</w:t>
+        <w:t>3</w:t>
       </w:r>
       <w:r>
         <w:fldChar w:fldCharType="end"/>
@@ -566,7 +621,7 @@
         <w:fldChar w:fldCharType="begin"/>
       </w:r>
       <w:r>
-        <w:instrText xml:space="preserve"> HYPERLINK \l _Toc24248 </w:instrText>
+        <w:instrText xml:space="preserve"> HYPERLINK \l _Toc14701 </w:instrText>
       </w:r>
       <w:r>
         <w:fldChar w:fldCharType="separate"/>
@@ -591,13 +646,13 @@
         <w:fldChar w:fldCharType="begin"/>
       </w:r>
       <w:r>
-        <w:instrText xml:space="preserve"> PAGEREF _Toc24248 \h </w:instrText>
+        <w:instrText xml:space="preserve"> PAGEREF _Toc14701 \h </w:instrText>
       </w:r>
       <w:r>
         <w:fldChar w:fldCharType="separate"/>
       </w:r>
       <w:r>
-        <w:t>2</w:t>
+        <w:t>3</w:t>
       </w:r>
       <w:r>
         <w:fldChar w:fldCharType="end"/>
@@ -617,7 +672,7 @@
         <w:fldChar w:fldCharType="begin"/>
       </w:r>
       <w:r>
-        <w:instrText xml:space="preserve"> HYPERLINK \l _Toc19176 </w:instrText>
+        <w:instrText xml:space="preserve"> HYPERLINK \l _Toc18868 </w:instrText>
       </w:r>
       <w:r>
         <w:fldChar w:fldCharType="separate"/>
@@ -636,13 +691,13 @@
         <w:fldChar w:fldCharType="begin"/>
       </w:r>
       <w:r>
-        <w:instrText xml:space="preserve"> PAGEREF _Toc19176 \h </w:instrText>
+        <w:instrText xml:space="preserve"> PAGEREF _Toc18868 \h </w:instrText>
       </w:r>
       <w:r>
         <w:fldChar w:fldCharType="separate"/>
       </w:r>
       <w:r>
-        <w:t>3</w:t>
+        <w:t>4</w:t>
       </w:r>
       <w:r>
         <w:fldChar w:fldCharType="end"/>
@@ -662,7 +717,7 @@
         <w:fldChar w:fldCharType="begin"/>
       </w:r>
       <w:r>
-        <w:instrText xml:space="preserve"> HYPERLINK \l _Toc13937 </w:instrText>
+        <w:instrText xml:space="preserve"> HYPERLINK \l _Toc12316 </w:instrText>
       </w:r>
       <w:r>
         <w:fldChar w:fldCharType="separate"/>
@@ -683,7 +738,7 @@
         <w:fldChar w:fldCharType="begin"/>
       </w:r>
       <w:r>
-        <w:instrText xml:space="preserve"> PAGEREF _Toc13937 \h </w:instrText>
+        <w:instrText xml:space="preserve"> PAGEREF _Toc12316 \h </w:instrText>
       </w:r>
       <w:r>
         <w:fldChar w:fldCharType="separate"/>
@@ -700,7 +755,7 @@
     </w:p>
     <w:p>
       <w:pPr>
-        <w:pStyle w:val="15"/>
+        <w:pStyle w:val="16"/>
         <w:tabs>
           <w:tab w:val="right" w:leader="dot" w:pos="8504"/>
         </w:tabs>
@@ -709,7 +764,7 @@
         <w:fldChar w:fldCharType="begin"/>
       </w:r>
       <w:r>
-        <w:instrText xml:space="preserve"> HYPERLINK \l _Toc22652 </w:instrText>
+        <w:instrText xml:space="preserve"> HYPERLINK \l _Toc24792 </w:instrText>
       </w:r>
       <w:r>
         <w:fldChar w:fldCharType="separate"/>
@@ -718,7 +773,7 @@
         <w:rPr>
           <w:rFonts w:hint="default"/>
         </w:rPr>
-        <w:t xml:space="preserve">2. </w:t>
+        <w:t xml:space="preserve">1.4. </w:t>
       </w:r>
       <w:r>
         <w:t xml:space="preserve">Estructuras </w:t>
@@ -747,7 +802,7 @@
         <w:fldChar w:fldCharType="begin"/>
       </w:r>
       <w:r>
-        <w:instrText xml:space="preserve"> PAGEREF _Toc22652 \h </w:instrText>
+        <w:instrText xml:space="preserve"> PAGEREF _Toc24792 \h </w:instrText>
       </w:r>
       <w:r>
         <w:fldChar w:fldCharType="separate"/>
@@ -773,7 +828,7 @@
         <w:fldChar w:fldCharType="begin"/>
       </w:r>
       <w:r>
-        <w:instrText xml:space="preserve"> HYPERLINK \l _Toc9622 </w:instrText>
+        <w:instrText xml:space="preserve"> HYPERLINK \l _Toc26041 </w:instrText>
       </w:r>
       <w:r>
         <w:fldChar w:fldCharType="separate"/>
@@ -782,7 +837,7 @@
         <w:rPr>
           <w:rFonts w:hint="default"/>
         </w:rPr>
-        <w:t xml:space="preserve">2.1.1. </w:t>
+        <w:t xml:space="preserve">1.4.1. </w:t>
       </w:r>
       <w:r>
         <w:t xml:space="preserve">Estructuras </w:t>
@@ -801,7 +856,7 @@
         <w:fldChar w:fldCharType="begin"/>
       </w:r>
       <w:r>
-        <w:instrText xml:space="preserve"> PAGEREF _Toc9622 \h </w:instrText>
+        <w:instrText xml:space="preserve"> PAGEREF _Toc26041 \h </w:instrText>
       </w:r>
       <w:r>
         <w:fldChar w:fldCharType="separate"/>
@@ -827,7 +882,7 @@
         <w:fldChar w:fldCharType="begin"/>
       </w:r>
       <w:r>
-        <w:instrText xml:space="preserve"> HYPERLINK \l _Toc16644 </w:instrText>
+        <w:instrText xml:space="preserve"> HYPERLINK \l _Toc2314 </w:instrText>
       </w:r>
       <w:r>
         <w:fldChar w:fldCharType="separate"/>
@@ -841,7 +896,7 @@
           <w:szCs w:val="28"/>
           <w:lang w:val="es-MX" w:eastAsia="en-US" w:bidi="ar-SA"/>
         </w:rPr>
-        <w:t xml:space="preserve">2.1.2. </w:t>
+        <w:t xml:space="preserve">1.4.2. </w:t>
       </w:r>
       <w:r>
         <w:rPr>
@@ -861,13 +916,264 @@
         <w:fldChar w:fldCharType="begin"/>
       </w:r>
       <w:r>
-        <w:instrText xml:space="preserve"> PAGEREF _Toc16644 \h </w:instrText>
+        <w:instrText xml:space="preserve"> PAGEREF _Toc2314 \h </w:instrText>
       </w:r>
       <w:r>
         <w:fldChar w:fldCharType="separate"/>
       </w:r>
       <w:r>
         <w:t>6</w:t>
+      </w:r>
+      <w:r>
+        <w:fldChar w:fldCharType="end"/>
+      </w:r>
+      <w:r>
+        <w:fldChar w:fldCharType="end"/>
+      </w:r>
+    </w:p>
+    <w:p>
+      <w:pPr>
+        <w:pStyle w:val="16"/>
+        <w:tabs>
+          <w:tab w:val="right" w:leader="dot" w:pos="8504"/>
+        </w:tabs>
+      </w:pPr>
+      <w:r>
+        <w:fldChar w:fldCharType="begin"/>
+      </w:r>
+      <w:r>
+        <w:instrText xml:space="preserve"> HYPERLINK \l _Toc25514 </w:instrText>
+      </w:r>
+      <w:r>
+        <w:fldChar w:fldCharType="separate"/>
+      </w:r>
+      <w:r>
+        <w:rPr>
+          <w:rFonts w:hint="default"/>
+        </w:rPr>
+        <w:t xml:space="preserve">1.5. </w:t>
+      </w:r>
+      <w:r>
+        <w:rPr>
+          <w:rFonts w:hint="default"/>
+          <w:lang w:val="es-MX"/>
+        </w:rPr>
+        <w:t>Estructuras de Datos</w:t>
+      </w:r>
+      <w:r>
+        <w:tab/>
+      </w:r>
+      <w:r>
+        <w:fldChar w:fldCharType="begin"/>
+      </w:r>
+      <w:r>
+        <w:instrText xml:space="preserve"> PAGEREF _Toc25514 \h </w:instrText>
+      </w:r>
+      <w:r>
+        <w:fldChar w:fldCharType="separate"/>
+      </w:r>
+      <w:r>
+        <w:t>8</w:t>
+      </w:r>
+      <w:r>
+        <w:fldChar w:fldCharType="end"/>
+      </w:r>
+      <w:r>
+        <w:fldChar w:fldCharType="end"/>
+      </w:r>
+    </w:p>
+    <w:p>
+      <w:pPr>
+        <w:pStyle w:val="13"/>
+        <w:tabs>
+          <w:tab w:val="right" w:leader="dot" w:pos="8504"/>
+        </w:tabs>
+      </w:pPr>
+      <w:r>
+        <w:fldChar w:fldCharType="begin"/>
+      </w:r>
+      <w:r>
+        <w:instrText xml:space="preserve"> HYPERLINK \l _Toc14012 </w:instrText>
+      </w:r>
+      <w:r>
+        <w:fldChar w:fldCharType="separate"/>
+      </w:r>
+      <w:r>
+        <w:rPr>
+          <w:rFonts w:hint="default"/>
+        </w:rPr>
+        <w:t xml:space="preserve">1.5.1. </w:t>
+      </w:r>
+      <w:r>
+        <w:rPr>
+          <w:rFonts w:hint="default"/>
+          <w:lang w:val="es-MX"/>
+        </w:rPr>
+        <w:t>Listas</w:t>
+      </w:r>
+      <w:r>
+        <w:tab/>
+      </w:r>
+      <w:r>
+        <w:fldChar w:fldCharType="begin"/>
+      </w:r>
+      <w:r>
+        <w:instrText xml:space="preserve"> PAGEREF _Toc14012 \h </w:instrText>
+      </w:r>
+      <w:r>
+        <w:fldChar w:fldCharType="separate"/>
+      </w:r>
+      <w:r>
+        <w:t>8</w:t>
+      </w:r>
+      <w:r>
+        <w:fldChar w:fldCharType="end"/>
+      </w:r>
+      <w:r>
+        <w:fldChar w:fldCharType="end"/>
+      </w:r>
+    </w:p>
+    <w:p>
+      <w:pPr>
+        <w:pStyle w:val="16"/>
+        <w:tabs>
+          <w:tab w:val="right" w:leader="dot" w:pos="8504"/>
+        </w:tabs>
+      </w:pPr>
+      <w:r>
+        <w:fldChar w:fldCharType="begin"/>
+      </w:r>
+      <w:r>
+        <w:instrText xml:space="preserve"> HYPERLINK \l _Toc17054 </w:instrText>
+      </w:r>
+      <w:r>
+        <w:fldChar w:fldCharType="separate"/>
+      </w:r>
+      <w:r>
+        <w:rPr>
+          <w:rFonts w:hint="default"/>
+        </w:rPr>
+        <w:t xml:space="preserve">1.6. </w:t>
+      </w:r>
+      <w:r>
+        <w:t>Funciones</w:t>
+      </w:r>
+      <w:r>
+        <w:tab/>
+      </w:r>
+      <w:r>
+        <w:fldChar w:fldCharType="begin"/>
+      </w:r>
+      <w:r>
+        <w:instrText xml:space="preserve"> PAGEREF _Toc17054 \h </w:instrText>
+      </w:r>
+      <w:r>
+        <w:fldChar w:fldCharType="separate"/>
+      </w:r>
+      <w:r>
+        <w:t>10</w:t>
+      </w:r>
+      <w:r>
+        <w:fldChar w:fldCharType="end"/>
+      </w:r>
+      <w:r>
+        <w:fldChar w:fldCharType="end"/>
+      </w:r>
+    </w:p>
+    <w:p>
+      <w:pPr>
+        <w:pStyle w:val="13"/>
+        <w:tabs>
+          <w:tab w:val="right" w:leader="dot" w:pos="8504"/>
+        </w:tabs>
+      </w:pPr>
+      <w:r>
+        <w:fldChar w:fldCharType="begin"/>
+      </w:r>
+      <w:r>
+        <w:instrText xml:space="preserve"> HYPERLINK \l _Toc17889 </w:instrText>
+      </w:r>
+      <w:r>
+        <w:fldChar w:fldCharType="separate"/>
+      </w:r>
+      <w:r>
+        <w:rPr>
+          <w:rFonts w:hint="default"/>
+        </w:rPr>
+        <w:t xml:space="preserve">1.7. </w:t>
+      </w:r>
+      <w:r>
+        <w:rPr>
+          <w:rFonts w:hint="default"/>
+          <w:lang w:val="es-MX"/>
+        </w:rPr>
+        <w:t>Funciones de Usuario</w:t>
+      </w:r>
+      <w:r>
+        <w:tab/>
+      </w:r>
+      <w:r>
+        <w:fldChar w:fldCharType="begin"/>
+      </w:r>
+      <w:r>
+        <w:instrText xml:space="preserve"> PAGEREF _Toc17889 \h </w:instrText>
+      </w:r>
+      <w:r>
+        <w:fldChar w:fldCharType="separate"/>
+      </w:r>
+      <w:r>
+        <w:t>10</w:t>
+      </w:r>
+      <w:r>
+        <w:fldChar w:fldCharType="end"/>
+      </w:r>
+      <w:r>
+        <w:fldChar w:fldCharType="end"/>
+      </w:r>
+    </w:p>
+    <w:p>
+      <w:pPr>
+        <w:pStyle w:val="13"/>
+        <w:tabs>
+          <w:tab w:val="right" w:leader="dot" w:pos="8504"/>
+        </w:tabs>
+      </w:pPr>
+      <w:r>
+        <w:fldChar w:fldCharType="begin"/>
+      </w:r>
+      <w:r>
+        <w:instrText xml:space="preserve"> HYPERLINK \l _Toc25808 </w:instrText>
+      </w:r>
+      <w:r>
+        <w:fldChar w:fldCharType="separate"/>
+      </w:r>
+      <w:r>
+        <w:rPr>
+          <w:rFonts w:hint="default"/>
+        </w:rPr>
+        <w:t xml:space="preserve">1.7.2. </w:t>
+      </w:r>
+      <w:r>
+        <w:rPr>
+          <w:rFonts w:hint="default"/>
+          <w:lang w:val="es-MX"/>
+        </w:rPr>
+        <w:t>Funciones de programa</w:t>
+      </w:r>
+      <w:r>
+        <w:tab/>
+      </w:r>
+      <w:r>
+        <w:fldChar w:fldCharType="begin"/>
+      </w:r>
+      <w:r>
+        <w:instrText xml:space="preserve"> PAGEREF _Toc25808 \h </w:instrText>
+      </w:r>
+      <w:r>
+        <w:fldChar w:fldCharType="separate"/>
+      </w:r>
+      <w:r>
+        <w:t>12</w:t>
       </w:r>
       <w:r>
         <w:fldChar w:fldCharType="end"/>
@@ -887,7 +1193,7 @@
         <w:fldChar w:fldCharType="begin"/>
       </w:r>
       <w:r>
-        <w:instrText xml:space="preserve"> HYPERLINK \l _Toc20794 </w:instrText>
+        <w:instrText xml:space="preserve"> HYPERLINK \l _Toc916 </w:instrText>
       </w:r>
       <w:r>
         <w:fldChar w:fldCharType="separate"/>
@@ -896,14 +1202,14 @@
         <w:rPr>
           <w:rFonts w:hint="default"/>
         </w:rPr>
-        <w:t xml:space="preserve">3. </w:t>
-      </w:r>
-      <w:r>
-        <w:rPr>
-          <w:rFonts w:hint="default"/>
-          <w:lang w:val="es-MX"/>
-        </w:rPr>
-        <w:t>Estructuras de Datos</w:t>
+        <w:t xml:space="preserve">2. </w:t>
+      </w:r>
+      <w:r>
+        <w:rPr>
+          <w:rFonts w:hint="default"/>
+          <w:lang w:val="es-MX"/>
+        </w:rPr>
+        <w:t>Referencias</w:t>
       </w:r>
       <w:r>
         <w:tab/>
@@ -912,13 +1218,13 @@
         <w:fldChar w:fldCharType="begin"/>
       </w:r>
       <w:r>
-        <w:instrText xml:space="preserve"> PAGEREF _Toc20794 \h </w:instrText>
+        <w:instrText xml:space="preserve"> PAGEREF _Toc916 \h </w:instrText>
       </w:r>
       <w:r>
         <w:fldChar w:fldCharType="separate"/>
       </w:r>
       <w:r>
-        <w:t>7</w:t>
+        <w:t>I</w:t>
       </w:r>
       <w:r>
         <w:fldChar w:fldCharType="end"/>
@@ -938,7 +1244,7 @@
         <w:fldChar w:fldCharType="begin"/>
       </w:r>
       <w:r>
-        <w:instrText xml:space="preserve"> HYPERLINK \l _Toc30986 </w:instrText>
+        <w:instrText xml:space="preserve"> HYPERLINK \l _Toc15844 </w:instrText>
       </w:r>
       <w:r>
         <w:fldChar w:fldCharType="separate"/>
@@ -947,14 +1253,14 @@
         <w:rPr>
           <w:rFonts w:hint="default"/>
         </w:rPr>
-        <w:t xml:space="preserve">3.1. </w:t>
-      </w:r>
-      <w:r>
-        <w:rPr>
-          <w:rFonts w:hint="default"/>
-          <w:lang w:val="es-MX"/>
-        </w:rPr>
-        <w:t>Listas</w:t>
+        <w:t xml:space="preserve">2.1. </w:t>
+      </w:r>
+      <w:r>
+        <w:rPr>
+          <w:rFonts w:hint="default"/>
+          <w:lang w:val="es-MX"/>
+        </w:rPr>
+        <w:t>Bibliografia y Enlaces</w:t>
       </w:r>
       <w:r>
         <w:tab/>
@@ -963,201 +1269,13 @@
         <w:fldChar w:fldCharType="begin"/>
       </w:r>
       <w:r>
-        <w:instrText xml:space="preserve"> PAGEREF _Toc30986 \h </w:instrText>
+        <w:instrText xml:space="preserve"> PAGEREF _Toc15844 \h </w:instrText>
       </w:r>
       <w:r>
         <w:fldChar w:fldCharType="separate"/>
       </w:r>
       <w:r>
-        <w:t>7</w:t>
-      </w:r>
-      <w:r>
-        <w:fldChar w:fldCharType="end"/>
-      </w:r>
-      <w:r>
-        <w:fldChar w:fldCharType="end"/>
-      </w:r>
-    </w:p>
-    <w:p>
-      <w:pPr>
-        <w:pStyle w:val="13"/>
-        <w:tabs>
-          <w:tab w:val="right" w:leader="dot" w:pos="8504"/>
-        </w:tabs>
-      </w:pPr>
-      <w:r>
-        <w:fldChar w:fldCharType="begin"/>
-      </w:r>
-      <w:r>
-        <w:instrText xml:space="preserve"> HYPERLINK \l _Toc14450 </w:instrText>
-      </w:r>
-      <w:r>
-        <w:fldChar w:fldCharType="separate"/>
-      </w:r>
-      <w:r>
-        <w:rPr>
-          <w:rFonts w:hint="default"/>
-        </w:rPr>
-        <w:t xml:space="preserve">3.1.1. </w:t>
-      </w:r>
-      <w:r>
-        <w:rPr>
-          <w:rFonts w:hint="default"/>
-          <w:lang w:val="es-MX"/>
-        </w:rPr>
-        <w:t>Creación y acceso</w:t>
-      </w:r>
-      <w:r>
-        <w:tab/>
-      </w:r>
-      <w:r>
-        <w:fldChar w:fldCharType="begin"/>
-      </w:r>
-      <w:r>
-        <w:instrText xml:space="preserve"> PAGEREF _Toc14450 \h </w:instrText>
-      </w:r>
-      <w:r>
-        <w:fldChar w:fldCharType="separate"/>
-      </w:r>
-      <w:r>
-        <w:t>7</w:t>
-      </w:r>
-      <w:r>
-        <w:fldChar w:fldCharType="end"/>
-      </w:r>
-      <w:r>
-        <w:fldChar w:fldCharType="end"/>
-      </w:r>
-    </w:p>
-    <w:p>
-      <w:pPr>
-        <w:pStyle w:val="13"/>
-        <w:tabs>
-          <w:tab w:val="right" w:leader="dot" w:pos="8504"/>
-        </w:tabs>
-      </w:pPr>
-      <w:r>
-        <w:fldChar w:fldCharType="begin"/>
-      </w:r>
-      <w:r>
-        <w:instrText xml:space="preserve"> HYPERLINK \l _Toc21790 </w:instrText>
-      </w:r>
-      <w:r>
-        <w:fldChar w:fldCharType="separate"/>
-      </w:r>
-      <w:r>
-        <w:rPr>
-          <w:rFonts w:hint="default"/>
-          <w:lang w:val="es-MX"/>
-        </w:rPr>
-        <w:t>3.1.2. Métodos de listas</w:t>
-      </w:r>
-      <w:r>
-        <w:tab/>
-      </w:r>
-      <w:r>
-        <w:fldChar w:fldCharType="begin"/>
-      </w:r>
-      <w:r>
-        <w:instrText xml:space="preserve"> PAGEREF _Toc21790 \h </w:instrText>
-      </w:r>
-      <w:r>
-        <w:fldChar w:fldCharType="separate"/>
-      </w:r>
-      <w:r>
-        <w:t>8</w:t>
-      </w:r>
-      <w:r>
-        <w:fldChar w:fldCharType="end"/>
-      </w:r>
-      <w:r>
-        <w:fldChar w:fldCharType="end"/>
-      </w:r>
-    </w:p>
-    <w:p>
-      <w:pPr>
-        <w:pStyle w:val="13"/>
-        <w:tabs>
-          <w:tab w:val="right" w:leader="dot" w:pos="8504"/>
-        </w:tabs>
-      </w:pPr>
-      <w:r>
-        <w:fldChar w:fldCharType="begin"/>
-      </w:r>
-      <w:r>
-        <w:instrText xml:space="preserve"> HYPERLINK \l _Toc12316 </w:instrText>
-      </w:r>
-      <w:r>
-        <w:fldChar w:fldCharType="separate"/>
-      </w:r>
-      <w:r>
-        <w:rPr>
-          <w:rFonts w:hint="default"/>
-          <w:lang w:val="es-MX"/>
-        </w:rPr>
-        <w:t>3.1.3. Listas de Comprensión</w:t>
-      </w:r>
-      <w:r>
-        <w:tab/>
-      </w:r>
-      <w:r>
-        <w:fldChar w:fldCharType="begin"/>
-      </w:r>
-      <w:r>
-        <w:instrText xml:space="preserve"> PAGEREF _Toc12316 \h </w:instrText>
-      </w:r>
-      <w:r>
-        <w:fldChar w:fldCharType="separate"/>
-      </w:r>
-      <w:r>
-        <w:t>8</w:t>
-      </w:r>
-      <w:r>
-        <w:fldChar w:fldCharType="end"/>
-      </w:r>
-      <w:r>
-        <w:fldChar w:fldCharType="end"/>
-      </w:r>
-    </w:p>
-    <w:p>
-      <w:pPr>
-        <w:pStyle w:val="15"/>
-        <w:tabs>
-          <w:tab w:val="right" w:leader="dot" w:pos="8504"/>
-        </w:tabs>
-      </w:pPr>
-      <w:r>
-        <w:fldChar w:fldCharType="begin"/>
-      </w:r>
-      <w:r>
-        <w:instrText xml:space="preserve"> HYPERLINK \l _Toc1804 </w:instrText>
-      </w:r>
-      <w:r>
-        <w:fldChar w:fldCharType="separate"/>
-      </w:r>
-      <w:r>
-        <w:rPr>
-          <w:rFonts w:hint="default"/>
-        </w:rPr>
-        <w:t xml:space="preserve">4. </w:t>
-      </w:r>
-      <w:r>
-        <w:t>Funciones</w:t>
-      </w:r>
-      <w:r>
-        <w:tab/>
-      </w:r>
-      <w:r>
-        <w:fldChar w:fldCharType="begin"/>
-      </w:r>
-      <w:r>
-        <w:instrText xml:space="preserve"> PAGEREF _Toc1804 \h </w:instrText>
-      </w:r>
-      <w:r>
-        <w:fldChar w:fldCharType="separate"/>
-      </w:r>
-      <w:r>
-        <w:t>9</w:t>
+        <w:t>I</w:t>
       </w:r>
       <w:r>
         <w:fldChar w:fldCharType="end"/>
@@ -1177,7 +1295,7 @@
         <w:fldChar w:fldCharType="begin"/>
       </w:r>
       <w:r>
-        <w:instrText xml:space="preserve"> HYPERLINK \l _Toc6574 </w:instrText>
+        <w:instrText xml:space="preserve"> HYPERLINK \l _Toc12889 </w:instrText>
       </w:r>
       <w:r>
         <w:fldChar w:fldCharType="separate"/>
@@ -1186,14 +1304,14 @@
         <w:rPr>
           <w:rFonts w:hint="default"/>
         </w:rPr>
-        <w:t xml:space="preserve">4.1. </w:t>
-      </w:r>
-      <w:r>
-        <w:rPr>
-          <w:rFonts w:hint="default"/>
-          <w:lang w:val="es-MX"/>
-        </w:rPr>
-        <w:t>Funciones de Usuario</w:t>
+        <w:t xml:space="preserve">2.2. </w:t>
+      </w:r>
+      <w:r>
+        <w:rPr>
+          <w:rFonts w:hint="default"/>
+          <w:lang w:val="es-MX"/>
+        </w:rPr>
+        <w:t>Indice de Tablas</w:t>
       </w:r>
       <w:r>
         <w:tab/>
@@ -1202,120 +1320,13 @@
         <w:fldChar w:fldCharType="begin"/>
       </w:r>
       <w:r>
-        <w:instrText xml:space="preserve"> PAGEREF _Toc6574 \h </w:instrText>
+        <w:instrText xml:space="preserve"> PAGEREF _Toc12889 \h </w:instrText>
       </w:r>
       <w:r>
         <w:fldChar w:fldCharType="separate"/>
       </w:r>
       <w:r>
-        <w:t>9</w:t>
-      </w:r>
-      <w:r>
-        <w:fldChar w:fldCharType="end"/>
-      </w:r>
-      <w:r>
-        <w:fldChar w:fldCharType="end"/>
-      </w:r>
-    </w:p>
-    <w:p>
-      <w:pPr>
-        <w:pStyle w:val="13"/>
-        <w:tabs>
-          <w:tab w:val="right" w:leader="dot" w:pos="8504"/>
-        </w:tabs>
-      </w:pPr>
-      <w:r>
-        <w:fldChar w:fldCharType="begin"/>
-      </w:r>
-      <w:r>
-        <w:instrText xml:space="preserve"> HYPERLINK \l _Toc28132 </w:instrText>
-      </w:r>
-      <w:r>
-        <w:fldChar w:fldCharType="separate"/>
-      </w:r>
-      <w:r>
-        <w:rPr>
-          <w:rFonts w:hint="default"/>
-        </w:rPr>
-        <w:t xml:space="preserve">4.1.1. </w:t>
-      </w:r>
-      <w:r>
-        <w:rPr>
-          <w:rFonts w:hint="default"/>
-          <w:lang w:val="es-MX"/>
-        </w:rPr>
-        <w:t>Parámetros y Argumentos</w:t>
-      </w:r>
-      <w:r>
-        <w:tab/>
-      </w:r>
-      <w:r>
-        <w:fldChar w:fldCharType="begin"/>
-      </w:r>
-      <w:r>
-        <w:instrText xml:space="preserve"> PAGEREF _Toc28132 \h </w:instrText>
-      </w:r>
-      <w:r>
-        <w:fldChar w:fldCharType="separate"/>
-      </w:r>
-      <w:r>
-        <w:t>9</w:t>
-      </w:r>
-      <w:r>
-        <w:fldChar w:fldCharType="end"/>
-      </w:r>
-      <w:r>
-        <w:fldChar w:fldCharType="end"/>
-      </w:r>
-    </w:p>
-    <w:p>
-      <w:pPr>
-        <w:pStyle w:val="13"/>
-        <w:tabs>
-          <w:tab w:val="right" w:leader="dot" w:pos="8504"/>
-        </w:tabs>
-      </w:pPr>
-      <w:r>
-        <w:fldChar w:fldCharType="begin"/>
-      </w:r>
-      <w:r>
-        <w:instrText xml:space="preserve"> HYPERLINK \l _Toc5539 </w:instrText>
-      </w:r>
-      <w:r>
-        <w:fldChar w:fldCharType="separate"/>
-      </w:r>
-      <w:r>
-        <w:rPr>
-          <w:rFonts w:hint="default" w:ascii="Calibri" w:hAnsi="Calibri" w:eastAsiaTheme="majorEastAsia" w:cstheme="majorBidi"/>
-          <w:color w:val="355A65" w:themeColor="hyperlink" w:themeShade="BF"/>
-          <w:szCs w:val="28"/>
-          <w:lang w:val="es-MX" w:eastAsia="en-US" w:bidi="ar-SA"/>
-        </w:rPr>
-        <w:t xml:space="preserve">4.1.2. </w:t>
-      </w:r>
-      <w:r>
-        <w:rPr>
-          <w:rFonts w:hint="default" w:cstheme="majorBidi"/>
-          <w:color w:val="355A65" w:themeColor="hyperlink" w:themeShade="BF"/>
-          <w:szCs w:val="28"/>
-          <w:lang w:val="es-MX" w:eastAsia="en-US" w:bidi="ar-SA"/>
-        </w:rPr>
-        <w:t>Parámetros Posiciónales</w:t>
-      </w:r>
-      <w:r>
-        <w:tab/>
-      </w:r>
-      <w:r>
-        <w:fldChar w:fldCharType="begin"/>
-      </w:r>
-      <w:r>
-        <w:instrText xml:space="preserve"> PAGEREF _Toc5539 \h </w:instrText>
-      </w:r>
-      <w:r>
-        <w:fldChar w:fldCharType="separate"/>
-      </w:r>
-      <w:r>
-        <w:t>10</w:t>
+        <w:t>I</w:t>
       </w:r>
       <w:r>
         <w:fldChar w:fldCharType="end"/>
@@ -1335,7 +1346,7 @@
         <w:fldChar w:fldCharType="begin"/>
       </w:r>
       <w:r>
-        <w:instrText xml:space="preserve"> HYPERLINK \l _Toc5939 </w:instrText>
+        <w:instrText xml:space="preserve"> HYPERLINK \l _Toc14719 </w:instrText>
       </w:r>
       <w:r>
         <w:fldChar w:fldCharType="separate"/>
@@ -1344,14 +1355,14 @@
         <w:rPr>
           <w:rFonts w:hint="default"/>
         </w:rPr>
-        <w:t xml:space="preserve">4.2. </w:t>
-      </w:r>
-      <w:r>
-        <w:rPr>
-          <w:rFonts w:hint="default"/>
-          <w:lang w:val="es-MX"/>
-        </w:rPr>
-        <w:t>Funciones de programa</w:t>
+        <w:t xml:space="preserve">2.3. </w:t>
+      </w:r>
+      <w:r>
+        <w:rPr>
+          <w:rFonts w:hint="default"/>
+          <w:lang w:val="es-MX"/>
+        </w:rPr>
+        <w:t>Indice de Ejemplos</w:t>
       </w:r>
       <w:r>
         <w:tab/>
@@ -1360,58 +1371,7 @@
         <w:fldChar w:fldCharType="begin"/>
       </w:r>
       <w:r>
-        <w:instrText xml:space="preserve"> PAGEREF _Toc5939 \h </w:instrText>
-      </w:r>
-      <w:r>
-        <w:fldChar w:fldCharType="separate"/>
-      </w:r>
-      <w:r>
-        <w:t>10</w:t>
-      </w:r>
-      <w:r>
-        <w:fldChar w:fldCharType="end"/>
-      </w:r>
-      <w:r>
-        <w:fldChar w:fldCharType="end"/>
-      </w:r>
-    </w:p>
-    <w:p>
-      <w:pPr>
-        <w:pStyle w:val="15"/>
-        <w:tabs>
-          <w:tab w:val="right" w:leader="dot" w:pos="8504"/>
-        </w:tabs>
-      </w:pPr>
-      <w:r>
-        <w:fldChar w:fldCharType="begin"/>
-      </w:r>
-      <w:r>
-        <w:instrText xml:space="preserve"> HYPERLINK \l _Toc800 </w:instrText>
-      </w:r>
-      <w:r>
-        <w:fldChar w:fldCharType="separate"/>
-      </w:r>
-      <w:r>
-        <w:rPr>
-          <w:rFonts w:hint="default"/>
-        </w:rPr>
-        <w:t xml:space="preserve">5. </w:t>
-      </w:r>
-      <w:r>
-        <w:rPr>
-          <w:rFonts w:hint="default"/>
-          <w:lang w:val="es-MX"/>
-        </w:rPr>
-        <w:t>Referencias</w:t>
-      </w:r>
-      <w:r>
-        <w:tab/>
-      </w:r>
-      <w:r>
-        <w:fldChar w:fldCharType="begin"/>
-      </w:r>
-      <w:r>
-        <w:instrText xml:space="preserve"> PAGEREF _Toc800 \h </w:instrText>
+        <w:instrText xml:space="preserve"> PAGEREF _Toc14719 \h </w:instrText>
       </w:r>
       <w:r>
         <w:fldChar w:fldCharType="separate"/>
@@ -1437,7 +1397,7 @@
         <w:fldChar w:fldCharType="begin"/>
       </w:r>
       <w:r>
-        <w:instrText xml:space="preserve"> HYPERLINK \l _Toc7675 </w:instrText>
+        <w:instrText xml:space="preserve"> HYPERLINK \l _Toc19054 </w:instrText>
       </w:r>
       <w:r>
         <w:fldChar w:fldCharType="separate"/>
@@ -1445,15 +1405,9 @@
       <w:r>
         <w:rPr>
           <w:rFonts w:hint="default"/>
-        </w:rPr>
-        <w:t xml:space="preserve">5.1. </w:t>
-      </w:r>
-      <w:r>
-        <w:rPr>
-          <w:rFonts w:hint="default"/>
-          <w:lang w:val="es-MX"/>
-        </w:rPr>
-        <w:t>Bibliografia y Enlaces</w:t>
+          <w:lang w:val="es-MX"/>
+        </w:rPr>
+        <w:t>2.4. Indice de Sintaxis</w:t>
       </w:r>
       <w:r>
         <w:tab/>
@@ -1462,154 +1416,7 @@
         <w:fldChar w:fldCharType="begin"/>
       </w:r>
       <w:r>
-        <w:instrText xml:space="preserve"> PAGEREF _Toc7675 \h </w:instrText>
-      </w:r>
-      <w:r>
-        <w:fldChar w:fldCharType="separate"/>
-      </w:r>
-      <w:r>
-        <w:t>I</w:t>
-      </w:r>
-      <w:r>
-        <w:fldChar w:fldCharType="end"/>
-      </w:r>
-      <w:r>
-        <w:fldChar w:fldCharType="end"/>
-      </w:r>
-    </w:p>
-    <w:p>
-      <w:pPr>
-        <w:pStyle w:val="16"/>
-        <w:tabs>
-          <w:tab w:val="right" w:leader="dot" w:pos="8504"/>
-        </w:tabs>
-      </w:pPr>
-      <w:r>
-        <w:fldChar w:fldCharType="begin"/>
-      </w:r>
-      <w:r>
-        <w:instrText xml:space="preserve"> HYPERLINK \l _Toc2630 </w:instrText>
-      </w:r>
-      <w:r>
-        <w:fldChar w:fldCharType="separate"/>
-      </w:r>
-      <w:r>
-        <w:rPr>
-          <w:rFonts w:hint="default"/>
-        </w:rPr>
-        <w:t xml:space="preserve">5.2. </w:t>
-      </w:r>
-      <w:r>
-        <w:rPr>
-          <w:rFonts w:hint="default"/>
-          <w:lang w:val="es-MX"/>
-        </w:rPr>
-        <w:t>Indice de Tablas</w:t>
-      </w:r>
-      <w:r>
-        <w:tab/>
-      </w:r>
-      <w:r>
-        <w:fldChar w:fldCharType="begin"/>
-      </w:r>
-      <w:r>
-        <w:instrText xml:space="preserve"> PAGEREF _Toc2630 \h </w:instrText>
-      </w:r>
-      <w:r>
-        <w:fldChar w:fldCharType="separate"/>
-      </w:r>
-      <w:r>
-        <w:t>I</w:t>
-      </w:r>
-      <w:r>
-        <w:fldChar w:fldCharType="end"/>
-      </w:r>
-      <w:r>
-        <w:fldChar w:fldCharType="end"/>
-      </w:r>
-    </w:p>
-    <w:p>
-      <w:pPr>
-        <w:pStyle w:val="16"/>
-        <w:tabs>
-          <w:tab w:val="right" w:leader="dot" w:pos="8504"/>
-        </w:tabs>
-      </w:pPr>
-      <w:r>
-        <w:fldChar w:fldCharType="begin"/>
-      </w:r>
-      <w:r>
-        <w:instrText xml:space="preserve"> HYPERLINK \l _Toc3069 </w:instrText>
-      </w:r>
-      <w:r>
-        <w:fldChar w:fldCharType="separate"/>
-      </w:r>
-      <w:r>
-        <w:rPr>
-          <w:rFonts w:hint="default"/>
-        </w:rPr>
-        <w:t xml:space="preserve">5.3. </w:t>
-      </w:r>
-      <w:r>
-        <w:rPr>
-          <w:rFonts w:hint="default"/>
-          <w:lang w:val="es-MX"/>
-        </w:rPr>
-        <w:t>Indice de Ejemplos</w:t>
-      </w:r>
-      <w:r>
-        <w:tab/>
-      </w:r>
-      <w:r>
-        <w:fldChar w:fldCharType="begin"/>
-      </w:r>
-      <w:r>
-        <w:instrText xml:space="preserve"> PAGEREF _Toc3069 \h </w:instrText>
-      </w:r>
-      <w:r>
-        <w:fldChar w:fldCharType="separate"/>
-      </w:r>
-      <w:r>
-        <w:t>I</w:t>
-      </w:r>
-      <w:r>
-        <w:fldChar w:fldCharType="end"/>
-      </w:r>
-      <w:r>
-        <w:fldChar w:fldCharType="end"/>
-      </w:r>
-    </w:p>
-    <w:p>
-      <w:pPr>
-        <w:pStyle w:val="16"/>
-        <w:tabs>
-          <w:tab w:val="right" w:leader="dot" w:pos="8504"/>
-        </w:tabs>
-      </w:pPr>
-      <w:r>
-        <w:fldChar w:fldCharType="begin"/>
-      </w:r>
-      <w:r>
-        <w:instrText xml:space="preserve"> HYPERLINK \l _Toc31617 </w:instrText>
-      </w:r>
-      <w:r>
-        <w:fldChar w:fldCharType="separate"/>
-      </w:r>
-      <w:r>
-        <w:rPr>
-          <w:rFonts w:hint="default"/>
-          <w:lang w:val="es-MX"/>
-        </w:rPr>
-        <w:t>5.4. Indice de Ilustraciones</w:t>
-      </w:r>
-      <w:r>
-        <w:tab/>
-      </w:r>
-      <w:r>
-        <w:fldChar w:fldCharType="begin"/>
-      </w:r>
-      <w:r>
-        <w:instrText xml:space="preserve"> PAGEREF _Toc31617 \h </w:instrText>
+        <w:instrText xml:space="preserve"> PAGEREF _Toc19054 \h </w:instrText>
       </w:r>
       <w:r>
         <w:fldChar w:fldCharType="separate"/>
@@ -1650,13 +1457,15 @@
         <w:pStyle w:val="2"/>
         <w:bidi w:val="0"/>
       </w:pPr>
-      <w:bookmarkStart w:id="0" w:name="_Toc2011"/>
-      <w:bookmarkStart w:id="1" w:name="_Toc7784"/>
-      <w:r>
-        <w:t>CONCEPTOS BÁSICOS</w:t>
+      <w:bookmarkStart w:id="0" w:name="_Toc14437"/>
+      <w:r>
+        <w:rPr>
+          <w:rFonts w:hint="default"/>
+          <w:lang w:val="es-MX"/>
+        </w:rPr>
+        <w:t>Fundamentos</w:t>
       </w:r>
       <w:bookmarkEnd w:id="0"/>
-      <w:bookmarkEnd w:id="1"/>
     </w:p>
     <w:p>
       <w:pPr>
@@ -1667,8 +1476,8 @@
         </w:numPr>
         <w:bidi w:val="0"/>
       </w:pPr>
-      <w:bookmarkStart w:id="2" w:name="_Toc15806"/>
-      <w:bookmarkStart w:id="3" w:name="_Toc17530"/>
+      <w:bookmarkStart w:id="1" w:name="_Toc25728"/>
+      <w:bookmarkStart w:id="2" w:name="_Toc17530"/>
       <w:r>
         <w:rPr>
           <w:rFonts w:hint="default"/>
@@ -1676,7 +1485,7 @@
         </w:rPr>
         <w:t>Sintaxis</w:t>
       </w:r>
-      <w:bookmarkEnd w:id="2"/>
+      <w:bookmarkEnd w:id="1"/>
     </w:p>
     <w:p>
       <w:pPr>
@@ -1687,7 +1496,7 @@
         </w:numPr>
         <w:bidi w:val="0"/>
       </w:pPr>
-      <w:bookmarkStart w:id="4" w:name="_Toc17587"/>
+      <w:bookmarkStart w:id="3" w:name="_Toc18093"/>
       <w:r>
         <w:rPr>
           <w:rFonts w:hint="default"/>
@@ -1695,7 +1504,7 @@
         </w:rPr>
         <w:t>Indentación</w:t>
       </w:r>
-      <w:bookmarkEnd w:id="4"/>
+      <w:bookmarkEnd w:id="3"/>
     </w:p>
     <w:p>
       <w:pPr>
@@ -1785,14 +1594,14 @@
       <w:r>
         <w:fldChar w:fldCharType="end"/>
       </w:r>
-      <w:bookmarkStart w:id="5" w:name="_Toc27306"/>
+      <w:bookmarkStart w:id="4" w:name="_Toc25412"/>
       <w:r>
         <w:rPr>
           <w:lang w:val="es-MX"/>
         </w:rPr>
         <w:t xml:space="preserve"> Identación</w:t>
       </w:r>
-      <w:bookmarkEnd w:id="5"/>
+      <w:bookmarkEnd w:id="4"/>
     </w:p>
     <w:p>
       <w:pPr>
@@ -1807,7 +1616,7 @@
           <w:lang w:val="es-MX"/>
         </w:rPr>
       </w:pPr>
-      <w:bookmarkStart w:id="6" w:name="_Toc25831"/>
+      <w:bookmarkStart w:id="5" w:name="_Toc7709"/>
       <w:r>
         <w:rPr>
           <w:rFonts w:hint="default"/>
@@ -1815,7 +1624,7 @@
         </w:rPr>
         <w:t>Comentarios</w:t>
       </w:r>
-      <w:bookmarkEnd w:id="6"/>
+      <w:bookmarkEnd w:id="5"/>
     </w:p>
     <w:p>
       <w:pPr>
@@ -1912,14 +1721,14 @@
       <w:r>
         <w:fldChar w:fldCharType="end"/>
       </w:r>
-      <w:bookmarkStart w:id="7" w:name="_Toc26817"/>
+      <w:bookmarkStart w:id="6" w:name="_Toc30745"/>
       <w:r>
         <w:rPr>
           <w:lang w:val="es-MX"/>
         </w:rPr>
         <w:t xml:space="preserve"> Comentarios</w:t>
       </w:r>
-      <w:bookmarkEnd w:id="7"/>
+      <w:bookmarkEnd w:id="6"/>
     </w:p>
     <w:p>
       <w:pPr>
@@ -1930,12 +1739,12 @@
         </w:numPr>
         <w:bidi w:val="0"/>
       </w:pPr>
-      <w:bookmarkStart w:id="8" w:name="_Toc6211"/>
+      <w:bookmarkStart w:id="7" w:name="_Toc18838"/>
       <w:r>
         <w:t>Variables</w:t>
       </w:r>
-      <w:bookmarkEnd w:id="3"/>
-      <w:bookmarkEnd w:id="8"/>
+      <w:bookmarkEnd w:id="2"/>
+      <w:bookmarkEnd w:id="7"/>
     </w:p>
     <w:p>
       <w:r>
@@ -1951,8 +1760,8 @@
         </w:numPr>
         <w:bidi w:val="0"/>
       </w:pPr>
+      <w:bookmarkStart w:id="8" w:name="_Toc28348"/>
       <w:bookmarkStart w:id="9" w:name="_Toc30944"/>
-      <w:bookmarkStart w:id="10" w:name="_Toc26809"/>
       <w:r>
         <w:rPr>
           <w:rFonts w:hint="default"/>
@@ -1960,6 +1769,7 @@
         </w:rPr>
         <w:t>Alcance de Variables (Local vs Global)</w:t>
       </w:r>
+      <w:bookmarkEnd w:id="8"/>
     </w:p>
     <w:p>
       <w:r>
@@ -1978,6 +1788,7 @@
         </w:numPr>
         <w:bidi w:val="0"/>
       </w:pPr>
+      <w:bookmarkStart w:id="10" w:name="_Toc4551"/>
       <w:r>
         <w:t>Tipo de Variables</w:t>
       </w:r>
@@ -2120,7 +1931,7 @@
         <w:bidi w:val="0"/>
       </w:pPr>
       <w:bookmarkStart w:id="11" w:name="_Toc14474"/>
-      <w:bookmarkStart w:id="12" w:name="_Toc1125"/>
+      <w:bookmarkStart w:id="12" w:name="_Toc5531"/>
       <w:r>
         <w:t>Casteo de datos o casting</w:t>
       </w:r>
@@ -2309,7 +2120,7 @@
       <w:r>
         <w:fldChar w:fldCharType="end"/>
       </w:r>
-      <w:bookmarkStart w:id="14" w:name="_Toc15686"/>
+      <w:bookmarkStart w:id="14" w:name="_Toc16761"/>
       <w:r>
         <w:rPr>
           <w:lang w:val="es-MX"/>
@@ -2354,7 +2165,7 @@
       <w:r>
         <w:fldChar w:fldCharType="end"/>
       </w:r>
-      <w:bookmarkStart w:id="15" w:name="_Toc11692"/>
+      <w:bookmarkStart w:id="15" w:name="_Toc3673"/>
       <w:r>
         <w:rPr>
           <w:lang w:val="es-MX"/>
@@ -3357,8 +3168,8 @@
         <w:pStyle w:val="3"/>
         <w:bidi w:val="0"/>
       </w:pPr>
-      <w:bookmarkStart w:id="16" w:name="_Toc25641"/>
-      <w:bookmarkStart w:id="17" w:name="_Toc30678"/>
+      <w:bookmarkStart w:id="16" w:name="_Toc30678"/>
+      <w:bookmarkStart w:id="17" w:name="_Toc5617"/>
       <w:r>
         <w:t>Operadores</w:t>
       </w:r>
@@ -3381,7 +3192,7 @@
         </w:rPr>
         <w:t xml:space="preserve"> </w:t>
       </w:r>
-      <w:bookmarkStart w:id="18" w:name="_Toc24248"/>
+      <w:bookmarkStart w:id="18" w:name="_Toc14701"/>
       <w:r>
         <w:rPr>
           <w:rFonts w:hint="default"/>
@@ -3423,7 +3234,7 @@
       <w:r>
         <w:fldChar w:fldCharType="end"/>
       </w:r>
-      <w:bookmarkStart w:id="19" w:name="_Toc9499"/>
+      <w:bookmarkStart w:id="19" w:name="_Toc2178"/>
       <w:r>
         <w:rPr>
           <w:lang w:val="es-MX"/>
@@ -4980,7 +4791,7 @@
       <w:r>
         <w:fldChar w:fldCharType="end"/>
       </w:r>
-      <w:bookmarkStart w:id="21" w:name="_Toc25173"/>
+      <w:bookmarkStart w:id="21" w:name="_Toc2162"/>
       <w:r>
         <w:rPr>
           <w:lang w:val="es-MX"/>
@@ -6081,7 +5892,7 @@
         </w:rPr>
         <w:t xml:space="preserve"> </w:t>
       </w:r>
-      <w:bookmarkStart w:id="22" w:name="_Toc19176"/>
+      <w:bookmarkStart w:id="22" w:name="_Toc18868"/>
       <w:r>
         <w:rPr>
           <w:rFonts w:hint="default"/>
@@ -6132,7 +5943,7 @@
       <w:r>
         <w:fldChar w:fldCharType="end"/>
       </w:r>
-      <w:bookmarkStart w:id="23" w:name="_Toc745"/>
+      <w:bookmarkStart w:id="23" w:name="_Toc31497"/>
       <w:r>
         <w:rPr>
           <w:lang w:val="es-MX"/>
@@ -6659,7 +6470,7 @@
           <w:lang w:val="es-MX" w:eastAsia="en-US" w:bidi="ar-SA"/>
         </w:rPr>
       </w:pPr>
-      <w:bookmarkStart w:id="24" w:name="_Toc13937"/>
+      <w:bookmarkStart w:id="24" w:name="_Toc12316"/>
       <w:r>
         <w:rPr>
           <w:rFonts w:hint="default" w:cstheme="majorBidi"/>
@@ -6725,7 +6536,7 @@
       <w:r>
         <w:fldChar w:fldCharType="end"/>
       </w:r>
-      <w:bookmarkStart w:id="25" w:name="_Toc28229"/>
+      <w:bookmarkStart w:id="25" w:name="_Toc32080"/>
       <w:r>
         <w:rPr>
           <w:lang w:val="es-MX"/>
@@ -8145,11 +7956,11 @@
     </w:p>
     <w:p>
       <w:pPr>
-        <w:pStyle w:val="2"/>
+        <w:pStyle w:val="3"/>
         <w:bidi w:val="0"/>
       </w:pPr>
       <w:bookmarkStart w:id="26" w:name="_Toc216093559"/>
-      <w:bookmarkStart w:id="27" w:name="_Toc22652"/>
+      <w:bookmarkStart w:id="27" w:name="_Toc24792"/>
       <w:r>
         <w:t xml:space="preserve">Estructuras </w:t>
       </w:r>
@@ -8190,16 +8001,12 @@
     </w:p>
     <w:p>
       <w:pPr>
-        <w:pStyle w:val="3"/>
-        <w:tabs>
-          <w:tab w:val="left" w:pos="709"/>
-          <w:tab w:val="clear" w:pos="567"/>
-        </w:tabs>
+        <w:pStyle w:val="4"/>
       </w:pPr>
       <w:bookmarkStart w:id="28" w:name="_Toc109806133"/>
       <w:bookmarkStart w:id="29" w:name="_Toc1407782618"/>
       <w:bookmarkStart w:id="30" w:name="_Toc110498797"/>
-      <w:bookmarkStart w:id="31" w:name="_Toc9622"/>
+      <w:bookmarkStart w:id="31" w:name="_Toc26041"/>
       <w:r>
         <w:t xml:space="preserve">Estructuras </w:t>
       </w:r>
@@ -8232,11 +8039,7 @@
     </w:p>
     <w:p>
       <w:pPr>
-        <w:pStyle w:val="4"/>
-        <w:tabs>
-          <w:tab w:val="left" w:pos="850"/>
-          <w:tab w:val="clear" w:pos="709"/>
-        </w:tabs>
+        <w:pStyle w:val="5"/>
         <w:bidi w:val="0"/>
         <w:rPr>
           <w:rFonts w:hint="default"/>
@@ -8340,7 +8143,7 @@
       <w:r>
         <w:fldChar w:fldCharType="end"/>
       </w:r>
-      <w:bookmarkStart w:id="32" w:name="_Toc12375"/>
+      <w:bookmarkStart w:id="32" w:name="_Toc18121"/>
       <w:r>
         <w:rPr>
           <w:lang w:val="es-MX"/>
@@ -8602,7 +8405,7 @@
             <w:r>
               <w:fldChar w:fldCharType="end"/>
             </w:r>
-            <w:bookmarkStart w:id="33" w:name="_Toc21306"/>
+            <w:bookmarkStart w:id="33" w:name="_Toc16360"/>
             <w:r>
               <w:rPr>
                 <w:lang w:val="es-MX"/>
@@ -8707,11 +8510,7 @@
     </w:p>
     <w:p>
       <w:pPr>
-        <w:pStyle w:val="4"/>
-        <w:tabs>
-          <w:tab w:val="left" w:pos="850"/>
-          <w:tab w:val="clear" w:pos="709"/>
-        </w:tabs>
+        <w:pStyle w:val="5"/>
         <w:bidi w:val="0"/>
         <w:rPr>
           <w:rFonts w:hint="default" w:ascii="Calibri" w:hAnsi="Calibri" w:eastAsiaTheme="majorEastAsia" w:cstheme="majorBidi"/>
@@ -8776,7 +8575,7 @@
       <w:r>
         <w:fldChar w:fldCharType="end"/>
       </w:r>
-      <w:bookmarkStart w:id="34" w:name="_Toc1607"/>
+      <w:bookmarkStart w:id="34" w:name="_Toc12150"/>
       <w:r>
         <w:rPr>
           <w:lang w:val="es-MX"/>
@@ -8820,6 +8619,12 @@
             <w:insideH w:val="single" w:color="666666" w:themeColor="text1" w:themeTint="99" w:sz="4" w:space="0"/>
             <w:insideV w:val="single" w:color="666666" w:themeColor="text1" w:themeTint="99" w:sz="4" w:space="0"/>
           </w:tblBorders>
+          <w:tblCellMar>
+            <w:top w:w="0" w:type="dxa"/>
+            <w:left w:w="108" w:type="dxa"/>
+            <w:bottom w:w="0" w:type="dxa"/>
+            <w:right w:w="108" w:type="dxa"/>
+          </w:tblCellMar>
         </w:tblPrEx>
         <w:trPr>
           <w:jc w:val="center"/>
@@ -9024,7 +8829,7 @@
             <w:r>
               <w:fldChar w:fldCharType="end"/>
             </w:r>
-            <w:bookmarkStart w:id="35" w:name="_Toc30515"/>
+            <w:bookmarkStart w:id="35" w:name="_Toc6696"/>
             <w:r>
               <w:rPr>
                 <w:lang w:val="es-MX"/>
@@ -9129,11 +8934,7 @@
     </w:p>
     <w:p>
       <w:pPr>
-        <w:pStyle w:val="4"/>
-        <w:tabs>
-          <w:tab w:val="left" w:pos="850"/>
-          <w:tab w:val="clear" w:pos="709"/>
-        </w:tabs>
+        <w:pStyle w:val="5"/>
         <w:bidi w:val="0"/>
         <w:rPr>
           <w:rFonts w:hint="default" w:ascii="Calibri" w:hAnsi="Calibri" w:eastAsiaTheme="majorEastAsia" w:cstheme="majorBidi"/>
@@ -9217,7 +9018,7 @@
       <w:r>
         <w:fldChar w:fldCharType="end"/>
       </w:r>
-      <w:bookmarkStart w:id="36" w:name="_Toc5563"/>
+      <w:bookmarkStart w:id="36" w:name="_Toc30449"/>
       <w:r>
         <w:rPr>
           <w:lang w:val="es-MX"/>
@@ -9479,7 +9280,7 @@
             <w:r>
               <w:fldChar w:fldCharType="end"/>
             </w:r>
-            <w:bookmarkStart w:id="37" w:name="_Toc16437"/>
+            <w:bookmarkStart w:id="37" w:name="_Toc8211"/>
             <w:r>
               <w:rPr>
                 <w:lang w:val="es-MX"/>
@@ -9575,11 +9376,7 @@
     </w:p>
     <w:p>
       <w:pPr>
-        <w:pStyle w:val="3"/>
-        <w:tabs>
-          <w:tab w:val="left" w:pos="709"/>
-          <w:tab w:val="clear" w:pos="567"/>
-        </w:tabs>
+        <w:pStyle w:val="4"/>
         <w:bidi w:val="0"/>
         <w:rPr>
           <w:rFonts w:hint="default" w:ascii="Calibri" w:hAnsi="Calibri" w:eastAsiaTheme="majorEastAsia" w:cstheme="majorBidi"/>
@@ -9592,7 +9389,7 @@
           <w:lang w:val="es-MX" w:eastAsia="en-US" w:bidi="ar-SA"/>
         </w:rPr>
       </w:pPr>
-      <w:bookmarkStart w:id="38" w:name="_Toc16644"/>
+      <w:bookmarkStart w:id="38" w:name="_Toc2314"/>
       <w:r>
         <w:rPr>
           <w:rFonts w:hint="default" w:cstheme="majorBidi"/>
@@ -9637,11 +9434,7 @@
     </w:p>
     <w:p>
       <w:pPr>
-        <w:pStyle w:val="4"/>
-        <w:tabs>
-          <w:tab w:val="left" w:pos="850"/>
-          <w:tab w:val="clear" w:pos="709"/>
-        </w:tabs>
+        <w:pStyle w:val="5"/>
         <w:bidi w:val="0"/>
         <w:rPr>
           <w:rFonts w:hint="default"/>
@@ -9696,12 +9489,14 @@
       <w:r>
         <w:fldChar w:fldCharType="end"/>
       </w:r>
+      <w:bookmarkStart w:id="39" w:name="_Toc23869"/>
       <w:r>
         <w:rPr>
           <w:lang w:val="es-MX"/>
         </w:rPr>
         <w:t xml:space="preserve"> Estructura for</w:t>
       </w:r>
+      <w:bookmarkEnd w:id="39"/>
     </w:p>
     <w:tbl>
       <w:tblPr>
@@ -9738,6 +9533,12 @@
             <w:insideH w:val="single" w:color="auto" w:sz="4" w:space="0"/>
             <w:insideV w:val="single" w:color="auto" w:sz="4" w:space="0"/>
           </w:tblBorders>
+          <w:tblCellMar>
+            <w:top w:w="0" w:type="dxa"/>
+            <w:left w:w="108" w:type="dxa"/>
+            <w:bottom w:w="0" w:type="dxa"/>
+            <w:right w:w="108" w:type="dxa"/>
+          </w:tblCellMar>
         </w:tblPrEx>
         <w:tc>
           <w:tcPr>
@@ -9899,14 +9700,14 @@
             <w:r>
               <w:fldChar w:fldCharType="end"/>
             </w:r>
-            <w:bookmarkStart w:id="39" w:name="_Toc28510"/>
+            <w:bookmarkStart w:id="40" w:name="_Toc22248"/>
             <w:r>
               <w:rPr>
                 <w:lang w:val="es-MX"/>
               </w:rPr>
               <w:t xml:space="preserve"> Estructura for</w:t>
             </w:r>
-            <w:bookmarkEnd w:id="39"/>
+            <w:bookmarkEnd w:id="40"/>
           </w:p>
           <w:p>
             <w:pPr>
@@ -10220,11 +10021,7 @@
     </w:p>
     <w:p>
       <w:pPr>
-        <w:pStyle w:val="4"/>
-        <w:tabs>
-          <w:tab w:val="left" w:pos="850"/>
-          <w:tab w:val="clear" w:pos="709"/>
-        </w:tabs>
+        <w:pStyle w:val="5"/>
         <w:bidi w:val="0"/>
         <w:rPr>
           <w:rFonts w:hint="default" w:ascii="Calibri" w:hAnsi="Calibri" w:eastAsiaTheme="majorEastAsia" w:cstheme="majorBidi"/>
@@ -10492,14 +10289,14 @@
             <w:r>
               <w:fldChar w:fldCharType="end"/>
             </w:r>
-            <w:bookmarkStart w:id="40" w:name="_Toc2286"/>
+            <w:bookmarkStart w:id="41" w:name="_Toc254"/>
             <w:r>
               <w:rPr>
                 <w:lang w:val="es-MX"/>
               </w:rPr>
               <w:t xml:space="preserve"> Estructura while</w:t>
             </w:r>
-            <w:bookmarkEnd w:id="40"/>
+            <w:bookmarkEnd w:id="41"/>
           </w:p>
         </w:tc>
         <w:tc>
@@ -10599,11 +10396,7 @@
     </w:p>
     <w:p>
       <w:pPr>
-        <w:pStyle w:val="4"/>
-        <w:tabs>
-          <w:tab w:val="left" w:pos="850"/>
-          <w:tab w:val="clear" w:pos="709"/>
-        </w:tabs>
+        <w:pStyle w:val="5"/>
         <w:bidi w:val="0"/>
         <w:rPr>
           <w:rFonts w:hint="default" w:ascii="Calibri" w:hAnsi="Calibri" w:eastAsiaTheme="majorEastAsia" w:cstheme="majorBidi"/>
@@ -10613,7 +10406,6 @@
           <w:lang w:val="es-MX" w:eastAsia="en-US" w:bidi="ar-SA"/>
         </w:rPr>
       </w:pPr>
-      <w:bookmarkStart w:id="41" w:name="_Toc20794"/>
       <w:r>
         <w:rPr>
           <w:rFonts w:hint="default" w:cstheme="majorBidi"/>
@@ -10643,7 +10435,7 @@
     </w:p>
     <w:p>
       <w:pPr>
-        <w:pStyle w:val="5"/>
+        <w:pStyle w:val="6"/>
         <w:bidi w:val="0"/>
         <w:rPr>
           <w:rFonts w:hint="default"/>
@@ -10700,12 +10492,14 @@
       <w:r>
         <w:fldChar w:fldCharType="end"/>
       </w:r>
+      <w:bookmarkStart w:id="42" w:name="_Toc24863"/>
       <w:r>
         <w:rPr>
           <w:lang w:val="es-MX"/>
         </w:rPr>
         <w:t xml:space="preserve"> Control break</w:t>
       </w:r>
+      <w:bookmarkEnd w:id="42"/>
     </w:p>
     <w:p>
       <w:pPr>
@@ -10808,7 +10602,7 @@
     </w:p>
     <w:p>
       <w:pPr>
-        <w:pStyle w:val="5"/>
+        <w:pStyle w:val="6"/>
         <w:bidi w:val="0"/>
         <w:rPr>
           <w:rFonts w:hint="default"/>
@@ -10865,12 +10659,14 @@
       <w:r>
         <w:fldChar w:fldCharType="end"/>
       </w:r>
+      <w:bookmarkStart w:id="43" w:name="_Toc26082"/>
       <w:r>
         <w:rPr>
           <w:lang w:val="es-MX"/>
         </w:rPr>
         <w:t xml:space="preserve"> Control Continue</w:t>
       </w:r>
+      <w:bookmarkEnd w:id="43"/>
     </w:p>
     <w:p>
       <w:pPr>
@@ -10954,7 +10750,7 @@
     </w:p>
     <w:p>
       <w:pPr>
-        <w:pStyle w:val="5"/>
+        <w:pStyle w:val="6"/>
         <w:bidi w:val="0"/>
         <w:rPr>
           <w:rFonts w:hint="default"/>
@@ -11011,12 +10807,14 @@
       <w:r>
         <w:fldChar w:fldCharType="end"/>
       </w:r>
+      <w:bookmarkStart w:id="44" w:name="_Toc20164"/>
       <w:r>
         <w:rPr>
           <w:lang w:val="es-MX"/>
         </w:rPr>
         <w:t xml:space="preserve"> Control Pass</w:t>
       </w:r>
+      <w:bookmarkEnd w:id="44"/>
     </w:p>
     <w:p>
       <w:pPr>
@@ -11079,23 +10877,19 @@
           <w:rFonts w:hint="default"/>
           <w:lang w:val="es-MX" w:eastAsia="en-US"/>
         </w:rPr>
-        <w:t xml:space="preserve">El bucle itera sobre los números del 0 al 4, pero no se realiza ninguna acción dentro </w:t>
-      </w:r>
-      <w:bookmarkStart w:id="69" w:name="_GoBack"/>
-      <w:bookmarkEnd w:id="69"/>
-      <w:r>
-        <w:rPr>
-          <w:rFonts w:hint="default"/>
-          <w:lang w:val="es-MX" w:eastAsia="en-US"/>
-        </w:rPr>
-        <w:t>debido a la instrucción pass. Esto puede ser útil cuando se está desarrollando un programa y se desea reservar un bloque de código para implementarlo más adelante.</w:t>
-      </w:r>
-    </w:p>
-    <w:p>
-      <w:pPr>
-        <w:pStyle w:val="2"/>
+        <w:t>El bucle itera sobre los números del 0 al 4, pero no se realiza ninguna acción dentro debido a la instrucción pass. Esto puede ser útil cuando se está desarrollando un programa y se desea reservar un bloque de código para implementarlo más adelante.</w:t>
+      </w:r>
+    </w:p>
+    <w:p>
+      <w:pPr>
+        <w:pStyle w:val="3"/>
+        <w:tabs>
+          <w:tab w:val="left" w:pos="425"/>
+          <w:tab w:val="clear" w:pos="567"/>
+        </w:tabs>
         <w:bidi w:val="0"/>
       </w:pPr>
+      <w:bookmarkStart w:id="45" w:name="_Toc25514"/>
       <w:r>
         <w:rPr>
           <w:rFonts w:hint="default"/>
@@ -11103,7 +10897,7 @@
         </w:rPr>
         <w:t>Estructuras de Datos</w:t>
       </w:r>
-      <w:bookmarkEnd w:id="41"/>
+      <w:bookmarkEnd w:id="45"/>
     </w:p>
     <w:p>
       <w:pPr>
@@ -11120,13 +10914,17 @@
     </w:p>
     <w:p>
       <w:pPr>
-        <w:pStyle w:val="3"/>
+        <w:pStyle w:val="4"/>
+        <w:tabs>
+          <w:tab w:val="left" w:pos="567"/>
+          <w:tab w:val="clear" w:pos="709"/>
+        </w:tabs>
         <w:bidi w:val="0"/>
         <w:rPr>
           <w:rFonts w:hint="default"/>
         </w:rPr>
       </w:pPr>
-      <w:bookmarkStart w:id="42" w:name="_Toc30986"/>
+      <w:bookmarkStart w:id="46" w:name="_Toc14012"/>
       <w:r>
         <w:rPr>
           <w:rFonts w:hint="default"/>
@@ -11134,7 +10932,7 @@
         </w:rPr>
         <w:t>Listas</w:t>
       </w:r>
-      <w:bookmarkEnd w:id="42"/>
+      <w:bookmarkEnd w:id="46"/>
     </w:p>
     <w:p>
       <w:pPr>
@@ -11172,13 +10970,16 @@
     </w:p>
     <w:p>
       <w:pPr>
-        <w:pStyle w:val="4"/>
+        <w:pStyle w:val="5"/>
+        <w:tabs>
+          <w:tab w:val="left" w:pos="709"/>
+          <w:tab w:val="clear" w:pos="850"/>
+        </w:tabs>
         <w:bidi w:val="0"/>
         <w:rPr>
           <w:rFonts w:hint="default"/>
         </w:rPr>
       </w:pPr>
-      <w:bookmarkStart w:id="43" w:name="_Toc14450"/>
       <w:r>
         <w:rPr>
           <w:rFonts w:hint="default"/>
@@ -11186,7 +10987,6 @@
         </w:rPr>
         <w:t>Creación y acceso</w:t>
       </w:r>
-      <w:bookmarkEnd w:id="43"/>
     </w:p>
     <w:p>
       <w:pPr>
@@ -11275,14 +11075,14 @@
       <w:r>
         <w:fldChar w:fldCharType="end"/>
       </w:r>
-      <w:bookmarkStart w:id="44" w:name="_Toc24460"/>
+      <w:bookmarkStart w:id="47" w:name="_Toc16299"/>
       <w:r>
         <w:rPr>
           <w:lang w:val="es-MX"/>
         </w:rPr>
         <w:t xml:space="preserve"> Lista</w:t>
       </w:r>
-      <w:bookmarkEnd w:id="44"/>
+      <w:bookmarkEnd w:id="47"/>
     </w:p>
     <w:p>
       <w:pPr>
@@ -11373,14 +11173,14 @@
       <w:r>
         <w:fldChar w:fldCharType="end"/>
       </w:r>
-      <w:bookmarkStart w:id="45" w:name="_Toc2719"/>
+      <w:bookmarkStart w:id="48" w:name="_Toc3413"/>
       <w:r>
         <w:rPr>
           <w:lang w:val="es-MX"/>
         </w:rPr>
         <w:t xml:space="preserve"> Acceso a lista</w:t>
       </w:r>
-      <w:bookmarkEnd w:id="45"/>
+      <w:bookmarkEnd w:id="48"/>
     </w:p>
     <w:p>
       <w:pPr>
@@ -11401,6 +11201,8 @@
       <w:pPr>
         <w:jc w:val="center"/>
       </w:pPr>
+      <w:bookmarkStart w:id="72" w:name="_GoBack"/>
+      <w:bookmarkEnd w:id="72"/>
       <w:r>
         <w:drawing>
           <wp:inline distT="0" distB="0" distL="114300" distR="114300">
@@ -11471,25 +11273,28 @@
       <w:r>
         <w:fldChar w:fldCharType="end"/>
       </w:r>
-      <w:bookmarkStart w:id="46" w:name="_Toc10334"/>
+      <w:bookmarkStart w:id="49" w:name="_Toc6427"/>
       <w:r>
         <w:rPr>
           <w:lang w:val="es-MX"/>
         </w:rPr>
         <w:t xml:space="preserve"> Acceso inverso a lista </w:t>
       </w:r>
-      <w:bookmarkEnd w:id="46"/>
-    </w:p>
-    <w:p>
-      <w:pPr>
-        <w:pStyle w:val="4"/>
+      <w:bookmarkEnd w:id="49"/>
+    </w:p>
+    <w:p>
+      <w:pPr>
+        <w:pStyle w:val="5"/>
+        <w:tabs>
+          <w:tab w:val="left" w:pos="709"/>
+          <w:tab w:val="clear" w:pos="850"/>
+        </w:tabs>
         <w:bidi w:val="0"/>
         <w:rPr>
           <w:rFonts w:hint="default"/>
           <w:lang w:val="es-MX"/>
         </w:rPr>
       </w:pPr>
-      <w:bookmarkStart w:id="47" w:name="_Toc21790"/>
       <w:r>
         <w:rPr>
           <w:rFonts w:hint="default"/>
@@ -11497,7 +11302,6 @@
         </w:rPr>
         <w:t>Métodos de listas</w:t>
       </w:r>
-      <w:bookmarkEnd w:id="47"/>
     </w:p>
     <w:p>
       <w:pPr>
@@ -11673,14 +11477,14 @@
       <w:r>
         <w:fldChar w:fldCharType="end"/>
       </w:r>
-      <w:bookmarkStart w:id="48" w:name="_Toc4496"/>
+      <w:bookmarkStart w:id="50" w:name="_Toc6331"/>
       <w:r>
         <w:rPr>
           <w:lang w:val="es-MX"/>
         </w:rPr>
         <w:t xml:space="preserve"> Método append</w:t>
       </w:r>
-      <w:bookmarkEnd w:id="48"/>
+      <w:bookmarkEnd w:id="50"/>
     </w:p>
     <w:p>
       <w:pPr>
@@ -11796,14 +11600,14 @@
       <w:r>
         <w:fldChar w:fldCharType="end"/>
       </w:r>
-      <w:bookmarkStart w:id="49" w:name="_Toc5135"/>
+      <w:bookmarkStart w:id="51" w:name="_Toc2710"/>
       <w:r>
         <w:rPr>
           <w:lang w:val="es-MX"/>
         </w:rPr>
         <w:t xml:space="preserve"> Método insert</w:t>
       </w:r>
-      <w:bookmarkEnd w:id="49"/>
+      <w:bookmarkEnd w:id="51"/>
     </w:p>
     <w:p>
       <w:pPr>
@@ -11919,14 +11723,14 @@
       <w:r>
         <w:fldChar w:fldCharType="end"/>
       </w:r>
-      <w:bookmarkStart w:id="50" w:name="_Toc12931"/>
+      <w:bookmarkStart w:id="52" w:name="_Toc28943"/>
       <w:r>
         <w:rPr>
           <w:lang w:val="es-MX"/>
         </w:rPr>
         <w:t xml:space="preserve"> Método remove</w:t>
       </w:r>
-      <w:bookmarkEnd w:id="50"/>
+      <w:bookmarkEnd w:id="52"/>
     </w:p>
     <w:p>
       <w:pPr>
@@ -12042,14 +11846,14 @@
       <w:r>
         <w:fldChar w:fldCharType="end"/>
       </w:r>
-      <w:bookmarkStart w:id="51" w:name="_Toc6908"/>
+      <w:bookmarkStart w:id="53" w:name="_Toc6541"/>
       <w:r>
         <w:rPr>
           <w:lang w:val="es-MX"/>
         </w:rPr>
         <w:t xml:space="preserve"> Método pop</w:t>
       </w:r>
-      <w:bookmarkEnd w:id="51"/>
+      <w:bookmarkEnd w:id="53"/>
     </w:p>
     <w:p>
       <w:pPr>
@@ -12165,14 +11969,14 @@
       <w:r>
         <w:fldChar w:fldCharType="end"/>
       </w:r>
-      <w:bookmarkStart w:id="52" w:name="_Toc21328"/>
+      <w:bookmarkStart w:id="54" w:name="_Toc21741"/>
       <w:r>
         <w:rPr>
           <w:lang w:val="es-MX"/>
         </w:rPr>
         <w:t xml:space="preserve"> Método sort</w:t>
       </w:r>
-      <w:bookmarkEnd w:id="52"/>
+      <w:bookmarkEnd w:id="54"/>
     </w:p>
     <w:p>
       <w:pPr>
@@ -12287,14 +12091,14 @@
       <w:r>
         <w:fldChar w:fldCharType="end"/>
       </w:r>
-      <w:bookmarkStart w:id="53" w:name="_Toc20836"/>
+      <w:bookmarkStart w:id="55" w:name="_Toc29738"/>
       <w:r>
         <w:rPr>
           <w:lang w:val="es-MX"/>
         </w:rPr>
         <w:t xml:space="preserve"> Método reverse</w:t>
       </w:r>
-      <w:bookmarkEnd w:id="53"/>
+      <w:bookmarkEnd w:id="55"/>
     </w:p>
     <w:p>
       <w:pPr>
@@ -12409,6 +12213,7 @@
       <w:r>
         <w:fldChar w:fldCharType="end"/>
       </w:r>
+      <w:bookmarkStart w:id="56" w:name="_Toc13176"/>
       <w:r>
         <w:rPr>
           <w:lang w:val="es-MX"/>
@@ -12428,6 +12233,7 @@
         </w:rPr>
         <w:t>todo clear</w:t>
       </w:r>
+      <w:bookmarkEnd w:id="56"/>
     </w:p>
     <w:p>
       <w:pPr>
@@ -12542,12 +12348,14 @@
       <w:r>
         <w:fldChar w:fldCharType="end"/>
       </w:r>
+      <w:bookmarkStart w:id="57" w:name="_Toc20278"/>
       <w:r>
         <w:rPr>
           <w:lang w:val="es-MX"/>
         </w:rPr>
         <w:t xml:space="preserve"> Método count</w:t>
       </w:r>
+      <w:bookmarkEnd w:id="57"/>
     </w:p>
     <w:p>
       <w:pPr>
@@ -12632,14 +12440,17 @@
     </w:p>
     <w:p>
       <w:pPr>
-        <w:pStyle w:val="4"/>
+        <w:pStyle w:val="5"/>
+        <w:tabs>
+          <w:tab w:val="left" w:pos="709"/>
+          <w:tab w:val="clear" w:pos="850"/>
+        </w:tabs>
         <w:bidi w:val="0"/>
         <w:rPr>
           <w:rFonts w:hint="default"/>
           <w:lang w:val="es-MX"/>
         </w:rPr>
       </w:pPr>
-      <w:bookmarkStart w:id="54" w:name="_Toc12316"/>
       <w:r>
         <w:rPr>
           <w:rFonts w:hint="default"/>
@@ -12647,7 +12458,6 @@
         </w:rPr>
         <w:t>Listas de Comprensión</w:t>
       </w:r>
-      <w:bookmarkEnd w:id="54"/>
     </w:p>
     <w:p>
       <w:pPr>
@@ -12738,7 +12548,7 @@
       <w:r>
         <w:fldChar w:fldCharType="end"/>
       </w:r>
-      <w:bookmarkStart w:id="55" w:name="_Toc9933"/>
+      <w:bookmarkStart w:id="58" w:name="_Toc6487"/>
       <w:r>
         <w:rPr>
           <w:lang w:val="es-MX"/>
@@ -12758,7 +12568,7 @@
         </w:rPr>
         <w:t>sión</w:t>
       </w:r>
-      <w:bookmarkEnd w:id="55"/>
+      <w:bookmarkEnd w:id="58"/>
     </w:p>
     <w:p>
       <w:pPr>
@@ -12854,12 +12664,14 @@
       <w:r>
         <w:fldChar w:fldCharType="end"/>
       </w:r>
+      <w:bookmarkStart w:id="59" w:name="_Toc30541"/>
       <w:r>
         <w:rPr>
           <w:lang w:val="es-MX"/>
         </w:rPr>
         <w:t xml:space="preserve"> Lista de Comprensión</w:t>
       </w:r>
+      <w:bookmarkEnd w:id="59"/>
     </w:p>
     <w:p>
       <w:pPr>
@@ -12873,14 +12685,18 @@
     </w:p>
     <w:p>
       <w:pPr>
-        <w:pStyle w:val="2"/>
+        <w:pStyle w:val="3"/>
+        <w:tabs>
+          <w:tab w:val="left" w:pos="425"/>
+          <w:tab w:val="clear" w:pos="567"/>
+        </w:tabs>
         <w:bidi w:val="0"/>
       </w:pPr>
-      <w:bookmarkStart w:id="56" w:name="_Toc1804"/>
+      <w:bookmarkStart w:id="60" w:name="_Toc17054"/>
       <w:r>
         <w:t>Funciones</w:t>
       </w:r>
-      <w:bookmarkEnd w:id="56"/>
+      <w:bookmarkEnd w:id="60"/>
     </w:p>
     <w:p>
       <w:pPr>
@@ -12904,13 +12720,16 @@
     </w:p>
     <w:p>
       <w:pPr>
-        <w:pStyle w:val="3"/>
+        <w:pStyle w:val="4"/>
         <w:numPr>
           <w:ilvl w:val="1"/>
           <w:numId w:val="1"/>
         </w:numPr>
-      </w:pPr>
-      <w:bookmarkStart w:id="57" w:name="_Toc6574"/>
+        <w:tabs>
+          <w:tab w:val="clear" w:pos="709"/>
+        </w:tabs>
+      </w:pPr>
+      <w:bookmarkStart w:id="61" w:name="_Toc17889"/>
       <w:r>
         <w:rPr>
           <w:rFonts w:hint="default"/>
@@ -12918,7 +12737,7 @@
         </w:rPr>
         <w:t>Funciones de Usuario</w:t>
       </w:r>
-      <w:bookmarkEnd w:id="57"/>
+      <w:bookmarkEnd w:id="61"/>
     </w:p>
     <w:p>
       <w:pPr>
@@ -13048,7 +12867,7 @@
       <w:r>
         <w:fldChar w:fldCharType="end"/>
       </w:r>
-      <w:bookmarkStart w:id="58" w:name="_Toc25196"/>
+      <w:bookmarkStart w:id="62" w:name="_Toc23353"/>
       <w:r>
         <w:rPr>
           <w:lang w:val="es-MX"/>
@@ -13068,15 +12887,18 @@
         </w:rPr>
         <w:t>n de usuario simple</w:t>
       </w:r>
-      <w:bookmarkEnd w:id="58"/>
+      <w:bookmarkEnd w:id="62"/>
     </w:p>
     <w:bookmarkEnd w:id="20"/>
     <w:p>
       <w:pPr>
-        <w:pStyle w:val="4"/>
+        <w:pStyle w:val="5"/>
+        <w:tabs>
+          <w:tab w:val="left" w:pos="709"/>
+          <w:tab w:val="clear" w:pos="850"/>
+        </w:tabs>
         <w:bidi w:val="0"/>
       </w:pPr>
-      <w:bookmarkStart w:id="59" w:name="_Toc28132"/>
       <w:r>
         <w:rPr>
           <w:rFonts w:hint="default"/>
@@ -13084,7 +12906,6 @@
         </w:rPr>
         <w:t>Parámetros y Argumentos</w:t>
       </w:r>
-      <w:bookmarkEnd w:id="59"/>
     </w:p>
     <w:p>
       <w:pPr>
@@ -13248,7 +13069,7 @@
       <w:r>
         <w:fldChar w:fldCharType="end"/>
       </w:r>
-      <w:bookmarkStart w:id="60" w:name="_Toc8176"/>
+      <w:bookmarkStart w:id="63" w:name="_Toc28414"/>
       <w:r>
         <w:rPr>
           <w:lang w:val="es-MX"/>
@@ -13268,11 +13089,15 @@
         </w:rPr>
         <w:t>n Usuario Parámetros y Argumentos</w:t>
       </w:r>
-      <w:bookmarkEnd w:id="60"/>
-    </w:p>
-    <w:p>
-      <w:pPr>
-        <w:pStyle w:val="4"/>
+      <w:bookmarkEnd w:id="63"/>
+    </w:p>
+    <w:p>
+      <w:pPr>
+        <w:pStyle w:val="5"/>
+        <w:tabs>
+          <w:tab w:val="left" w:pos="709"/>
+          <w:tab w:val="clear" w:pos="850"/>
+        </w:tabs>
         <w:bidi w:val="0"/>
         <w:rPr>
           <w:rFonts w:hint="default" w:ascii="Calibri" w:hAnsi="Calibri" w:eastAsiaTheme="majorEastAsia" w:cstheme="majorBidi"/>
@@ -13475,7 +13300,7 @@
     </w:p>
     <w:p>
       <w:pPr>
-        <w:pStyle w:val="5"/>
+        <w:pStyle w:val="6"/>
         <w:bidi w:val="0"/>
         <w:rPr>
           <w:rFonts w:hint="default"/>
@@ -13833,18 +13658,18 @@
       <w:r>
         <w:fldChar w:fldCharType="end"/>
       </w:r>
-      <w:bookmarkStart w:id="61" w:name="_Toc15462"/>
+      <w:bookmarkStart w:id="64" w:name="_Toc5347"/>
       <w:r>
         <w:rPr>
           <w:lang w:val="es-MX"/>
         </w:rPr>
         <w:t xml:space="preserve"> Funcion *args</w:t>
       </w:r>
-      <w:bookmarkEnd w:id="61"/>
-    </w:p>
-    <w:p>
-      <w:pPr>
-        <w:pStyle w:val="5"/>
+      <w:bookmarkEnd w:id="64"/>
+    </w:p>
+    <w:p>
+      <w:pPr>
+        <w:pStyle w:val="6"/>
         <w:bidi w:val="0"/>
         <w:rPr>
           <w:rFonts w:hint="default"/>
@@ -14229,14 +14054,14 @@
       <w:r>
         <w:fldChar w:fldCharType="end"/>
       </w:r>
-      <w:bookmarkStart w:id="62" w:name="_Toc8248"/>
+      <w:bookmarkStart w:id="65" w:name="_Toc27695"/>
       <w:r>
         <w:rPr>
           <w:lang w:val="es-MX"/>
         </w:rPr>
         <w:t xml:space="preserve"> Funcion **kwargs</w:t>
       </w:r>
-      <w:bookmarkEnd w:id="62"/>
+      <w:bookmarkEnd w:id="65"/>
     </w:p>
     <w:p>
       <w:pPr>
@@ -14248,10 +14073,14 @@
     </w:p>
     <w:p>
       <w:pPr>
-        <w:pStyle w:val="3"/>
+        <w:pStyle w:val="4"/>
+        <w:tabs>
+          <w:tab w:val="left" w:pos="567"/>
+          <w:tab w:val="clear" w:pos="709"/>
+        </w:tabs>
         <w:bidi w:val="0"/>
       </w:pPr>
-      <w:bookmarkStart w:id="63" w:name="_Toc5939"/>
+      <w:bookmarkStart w:id="66" w:name="_Toc25808"/>
       <w:r>
         <w:rPr>
           <w:rFonts w:hint="default"/>
@@ -14259,7 +14088,7 @@
         </w:rPr>
         <w:t>Funciones de programa</w:t>
       </w:r>
-      <w:bookmarkEnd w:id="63"/>
+      <w:bookmarkEnd w:id="66"/>
     </w:p>
     <w:p>
       <w:pPr>
@@ -14746,7 +14575,11 @@
     </w:p>
     <w:p>
       <w:pPr>
-        <w:pStyle w:val="2"/>
+        <w:pStyle w:val="3"/>
+        <w:tabs>
+          <w:tab w:val="left" w:pos="425"/>
+          <w:tab w:val="clear" w:pos="567"/>
+        </w:tabs>
         <w:sectPr>
           <w:footerReference r:id="rId8" w:type="default"/>
           <w:pgSz w:w="11906" w:h="16838"/>
@@ -14768,7 +14601,7 @@
         <w:pStyle w:val="2"/>
         <w:bidi w:val="0"/>
       </w:pPr>
-      <w:bookmarkStart w:id="64" w:name="_Toc800"/>
+      <w:bookmarkStart w:id="67" w:name="_Toc916"/>
       <w:r>
         <w:rPr>
           <w:rFonts w:hint="default"/>
@@ -14776,14 +14609,14 @@
         </w:rPr>
         <w:t>Referencias</w:t>
       </w:r>
-      <w:bookmarkEnd w:id="64"/>
+      <w:bookmarkEnd w:id="67"/>
     </w:p>
     <w:p>
       <w:pPr>
         <w:pStyle w:val="3"/>
         <w:bidi w:val="0"/>
       </w:pPr>
-      <w:bookmarkStart w:id="65" w:name="_Toc7675"/>
+      <w:bookmarkStart w:id="68" w:name="_Toc15844"/>
       <w:r>
         <w:rPr>
           <w:rFonts w:hint="default"/>
@@ -14791,7 +14624,7 @@
         </w:rPr>
         <w:t>Bibliografia y Enlaces</w:t>
       </w:r>
-      <w:bookmarkEnd w:id="65"/>
+      <w:bookmarkEnd w:id="68"/>
     </w:p>
     <w:p>
       <w:pPr>
@@ -14937,7 +14770,7 @@
         <w:pStyle w:val="3"/>
         <w:bidi w:val="0"/>
       </w:pPr>
-      <w:bookmarkStart w:id="66" w:name="_Toc2630"/>
+      <w:bookmarkStart w:id="69" w:name="_Toc12889"/>
       <w:r>
         <w:rPr>
           <w:rFonts w:hint="default"/>
@@ -14945,7 +14778,7 @@
         </w:rPr>
         <w:t>Indice de Tablas</w:t>
       </w:r>
-      <w:bookmarkEnd w:id="66"/>
+      <w:bookmarkEnd w:id="69"/>
     </w:p>
     <w:p>
       <w:pPr>
@@ -14963,11 +14796,12 @@
       <w:r>
         <w:fldChar w:fldCharType="separate"/>
       </w:r>
+      <w:bookmarkStart w:id="70" w:name="_Toc14719"/>
       <w:r>
         <w:fldChar w:fldCharType="begin"/>
       </w:r>
       <w:r>
-        <w:instrText xml:space="preserve"> HYPERLINK \l _Toc11692 </w:instrText>
+        <w:instrText xml:space="preserve"> HYPERLINK \l _Toc3673 </w:instrText>
       </w:r>
       <w:r>
         <w:fldChar w:fldCharType="separate"/>
@@ -14988,7 +14822,7 @@
         <w:fldChar w:fldCharType="begin"/>
       </w:r>
       <w:r>
-        <w:instrText xml:space="preserve"> PAGEREF _Toc11692 \h </w:instrText>
+        <w:instrText xml:space="preserve"> PAGEREF _Toc3673 \h </w:instrText>
       </w:r>
       <w:r>
         <w:fldChar w:fldCharType="separate"/>
@@ -15014,7 +14848,7 @@
         <w:fldChar w:fldCharType="begin"/>
       </w:r>
       <w:r>
-        <w:instrText xml:space="preserve"> HYPERLINK \l _Toc9499 </w:instrText>
+        <w:instrText xml:space="preserve"> HYPERLINK \l _Toc2178 </w:instrText>
       </w:r>
       <w:r>
         <w:fldChar w:fldCharType="separate"/>
@@ -15035,7 +14869,7 @@
         <w:fldChar w:fldCharType="begin"/>
       </w:r>
       <w:r>
-        <w:instrText xml:space="preserve"> PAGEREF _Toc9499 \h </w:instrText>
+        <w:instrText xml:space="preserve"> PAGEREF _Toc2178 \h </w:instrText>
       </w:r>
       <w:r>
         <w:fldChar w:fldCharType="separate"/>
@@ -15061,7 +14895,7 @@
         <w:fldChar w:fldCharType="begin"/>
       </w:r>
       <w:r>
-        <w:instrText xml:space="preserve"> HYPERLINK \l _Toc25173 </w:instrText>
+        <w:instrText xml:space="preserve"> HYPERLINK \l _Toc2162 </w:instrText>
       </w:r>
       <w:r>
         <w:fldChar w:fldCharType="separate"/>
@@ -15095,7 +14929,7 @@
         <w:fldChar w:fldCharType="begin"/>
       </w:r>
       <w:r>
-        <w:instrText xml:space="preserve"> PAGEREF _Toc25173 \h </w:instrText>
+        <w:instrText xml:space="preserve"> PAGEREF _Toc2162 \h </w:instrText>
       </w:r>
       <w:r>
         <w:fldChar w:fldCharType="separate"/>
@@ -15121,7 +14955,7 @@
         <w:fldChar w:fldCharType="begin"/>
       </w:r>
       <w:r>
-        <w:instrText xml:space="preserve"> HYPERLINK \l _Toc745 </w:instrText>
+        <w:instrText xml:space="preserve"> HYPERLINK \l _Toc31497 </w:instrText>
       </w:r>
       <w:r>
         <w:fldChar w:fldCharType="separate"/>
@@ -15142,13 +14976,13 @@
         <w:fldChar w:fldCharType="begin"/>
       </w:r>
       <w:r>
-        <w:instrText xml:space="preserve"> PAGEREF _Toc745 \h </w:instrText>
+        <w:instrText xml:space="preserve"> PAGEREF _Toc31497 \h </w:instrText>
       </w:r>
       <w:r>
         <w:fldChar w:fldCharType="separate"/>
       </w:r>
       <w:r>
-        <w:t>3</w:t>
+        <w:t>4</w:t>
       </w:r>
       <w:r>
         <w:fldChar w:fldCharType="end"/>
@@ -15168,7 +15002,7 @@
         <w:fldChar w:fldCharType="begin"/>
       </w:r>
       <w:r>
-        <w:instrText xml:space="preserve"> HYPERLINK \l _Toc28229 </w:instrText>
+        <w:instrText xml:space="preserve"> HYPERLINK \l _Toc32080 </w:instrText>
       </w:r>
       <w:r>
         <w:fldChar w:fldCharType="separate"/>
@@ -15189,7 +15023,7 @@
         <w:fldChar w:fldCharType="begin"/>
       </w:r>
       <w:r>
-        <w:instrText xml:space="preserve"> PAGEREF _Toc28229 \h </w:instrText>
+        <w:instrText xml:space="preserve"> PAGEREF _Toc32080 \h </w:instrText>
       </w:r>
       <w:r>
         <w:fldChar w:fldCharType="separate"/>
@@ -15215,7 +15049,7 @@
         <w:fldChar w:fldCharType="begin"/>
       </w:r>
       <w:r>
-        <w:instrText xml:space="preserve"> HYPERLINK \l _Toc12375 </w:instrText>
+        <w:instrText xml:space="preserve"> HYPERLINK \l _Toc18121 </w:instrText>
       </w:r>
       <w:r>
         <w:fldChar w:fldCharType="separate"/>
@@ -15243,13 +15077,13 @@
         <w:fldChar w:fldCharType="begin"/>
       </w:r>
       <w:r>
-        <w:instrText xml:space="preserve"> PAGEREF _Toc12375 \h </w:instrText>
+        <w:instrText xml:space="preserve"> PAGEREF _Toc18121 \h </w:instrText>
       </w:r>
       <w:r>
         <w:fldChar w:fldCharType="separate"/>
       </w:r>
       <w:r>
-        <w:t>4</w:t>
+        <w:t>5</w:t>
       </w:r>
       <w:r>
         <w:fldChar w:fldCharType="end"/>
@@ -15269,7 +15103,7 @@
         <w:fldChar w:fldCharType="begin"/>
       </w:r>
       <w:r>
-        <w:instrText xml:space="preserve"> HYPERLINK \l _Toc1607 </w:instrText>
+        <w:instrText xml:space="preserve"> HYPERLINK \l _Toc12150 </w:instrText>
       </w:r>
       <w:r>
         <w:fldChar w:fldCharType="separate"/>
@@ -15290,7 +15124,7 @@
         <w:fldChar w:fldCharType="begin"/>
       </w:r>
       <w:r>
-        <w:instrText xml:space="preserve"> PAGEREF _Toc1607 \h </w:instrText>
+        <w:instrText xml:space="preserve"> PAGEREF _Toc12150 \h </w:instrText>
       </w:r>
       <w:r>
         <w:fldChar w:fldCharType="separate"/>
@@ -15316,7 +15150,7 @@
         <w:fldChar w:fldCharType="begin"/>
       </w:r>
       <w:r>
-        <w:instrText xml:space="preserve"> HYPERLINK \l _Toc5563 </w:instrText>
+        <w:instrText xml:space="preserve"> HYPERLINK \l _Toc30449 </w:instrText>
       </w:r>
       <w:r>
         <w:fldChar w:fldCharType="separate"/>
@@ -15328,7 +15162,15 @@
         <w:rPr>
           <w:lang w:val="es-MX"/>
         </w:rPr>
-        <w:t xml:space="preserve"> Estructura if - elif - else</w:t>
+        <w:t xml:space="preserve"> Estructura </w:t>
+      </w:r>
+      <w:r>
+        <w:rPr>
+          <w:i/>
+          <w:iCs/>
+          <w:lang w:val="es-MX"/>
+        </w:rPr>
+        <w:t>if - elif - else</w:t>
       </w:r>
       <w:r>
         <w:tab/>
@@ -15337,7 +15179,7 @@
         <w:fldChar w:fldCharType="begin"/>
       </w:r>
       <w:r>
-        <w:instrText xml:space="preserve"> PAGEREF _Toc5563 \h </w:instrText>
+        <w:instrText xml:space="preserve"> PAGEREF _Toc30449 \h </w:instrText>
       </w:r>
       <w:r>
         <w:fldChar w:fldCharType="separate"/>
@@ -15363,7 +15205,7 @@
         <w:fldChar w:fldCharType="begin"/>
       </w:r>
       <w:r>
-        <w:instrText xml:space="preserve"> HYPERLINK \l _Toc19338 </w:instrText>
+        <w:instrText xml:space="preserve"> HYPERLINK \l _Toc23869 </w:instrText>
       </w:r>
       <w:r>
         <w:fldChar w:fldCharType="separate"/>
@@ -15384,7 +15226,7 @@
         <w:fldChar w:fldCharType="begin"/>
       </w:r>
       <w:r>
-        <w:instrText xml:space="preserve"> PAGEREF _Toc19338 \h </w:instrText>
+        <w:instrText xml:space="preserve"> PAGEREF _Toc23869 \h </w:instrText>
       </w:r>
       <w:r>
         <w:fldChar w:fldCharType="separate"/>
@@ -15404,7 +15246,6 @@
         <w:pStyle w:val="3"/>
         <w:bidi w:val="0"/>
       </w:pPr>
-      <w:bookmarkStart w:id="67" w:name="_Toc3069"/>
       <w:r>
         <w:fldChar w:fldCharType="end"/>
       </w:r>
@@ -15415,7 +15256,7 @@
         </w:rPr>
         <w:t>Indice de Ejemplos</w:t>
       </w:r>
-      <w:bookmarkEnd w:id="67"/>
+      <w:bookmarkEnd w:id="70"/>
     </w:p>
     <w:p>
       <w:pPr>
@@ -15457,7 +15298,7 @@
           <w:rFonts w:hint="default"/>
           <w:lang w:val="es-MX"/>
         </w:rPr>
-        <w:instrText xml:space="preserve"> HYPERLINK \l _Toc27306 </w:instrText>
+        <w:instrText xml:space="preserve"> HYPERLINK \l _Toc25412 </w:instrText>
       </w:r>
       <w:r>
         <w:rPr>
@@ -15482,7 +15323,7 @@
         <w:fldChar w:fldCharType="begin"/>
       </w:r>
       <w:r>
-        <w:instrText xml:space="preserve"> PAGEREF _Toc27306 \h </w:instrText>
+        <w:instrText xml:space="preserve"> PAGEREF _Toc25412 \h </w:instrText>
       </w:r>
       <w:r>
         <w:fldChar w:fldCharType="separate"/>
@@ -15520,7 +15361,7 @@
           <w:rFonts w:hint="default"/>
           <w:lang w:val="es-MX"/>
         </w:rPr>
-        <w:instrText xml:space="preserve"> HYPERLINK \l _Toc26817 </w:instrText>
+        <w:instrText xml:space="preserve"> HYPERLINK \l _Toc30745 </w:instrText>
       </w:r>
       <w:r>
         <w:rPr>
@@ -15545,7 +15386,7 @@
         <w:fldChar w:fldCharType="begin"/>
       </w:r>
       <w:r>
-        <w:instrText xml:space="preserve"> PAGEREF _Toc26817 \h </w:instrText>
+        <w:instrText xml:space="preserve"> PAGEREF _Toc30745 \h </w:instrText>
       </w:r>
       <w:r>
         <w:fldChar w:fldCharType="separate"/>
@@ -15583,7 +15424,7 @@
           <w:rFonts w:hint="default"/>
           <w:lang w:val="es-MX"/>
         </w:rPr>
-        <w:instrText xml:space="preserve"> HYPERLINK \l _Toc15686 </w:instrText>
+        <w:instrText xml:space="preserve"> HYPERLINK \l _Toc16761 </w:instrText>
       </w:r>
       <w:r>
         <w:rPr>
@@ -15608,7 +15449,7 @@
         <w:fldChar w:fldCharType="begin"/>
       </w:r>
       <w:r>
-        <w:instrText xml:space="preserve"> PAGEREF _Toc15686 \h </w:instrText>
+        <w:instrText xml:space="preserve"> PAGEREF _Toc16761 \h </w:instrText>
       </w:r>
       <w:r>
         <w:fldChar w:fldCharType="separate"/>
@@ -15625,47 +15466,6 @@
           <w:lang w:val="es-MX"/>
         </w:rPr>
         <w:fldChar w:fldCharType="end"/>
-      </w:r>
-    </w:p>
-    <w:p>
-      <w:pPr>
-        <w:rPr>
-          <w:rFonts w:hint="default"/>
-          <w:lang w:val="es-MX"/>
-        </w:rPr>
-      </w:pPr>
-      <w:r>
-        <w:rPr>
-          <w:rFonts w:hint="default"/>
-          <w:lang w:val="es-MX"/>
-        </w:rPr>
-        <w:fldChar w:fldCharType="end"/>
-      </w:r>
-    </w:p>
-    <w:p>
-      <w:pPr>
-        <w:pStyle w:val="3"/>
-        <w:bidi w:val="0"/>
-        <w:rPr>
-          <w:rFonts w:hint="default"/>
-          <w:lang w:val="es-MX"/>
-        </w:rPr>
-      </w:pPr>
-      <w:bookmarkStart w:id="68" w:name="_Toc31617"/>
-      <w:r>
-        <w:rPr>
-          <w:rFonts w:hint="default"/>
-          <w:lang w:val="es-MX"/>
-        </w:rPr>
-        <w:t xml:space="preserve">Indice de </w:t>
-      </w:r>
-      <w:bookmarkEnd w:id="68"/>
-      <w:r>
-        <w:rPr>
-          <w:rFonts w:hint="default"/>
-          <w:lang w:val="es-MX"/>
-        </w:rPr>
-        <w:t>Sintaxis</w:t>
       </w:r>
     </w:p>
     <w:p>
@@ -15687,7 +15487,7 @@
           <w:rFonts w:hint="default"/>
           <w:lang w:val="es-MX"/>
         </w:rPr>
-        <w:instrText xml:space="preserve">TOC \h \c "Sintaxis"</w:instrText>
+        <w:instrText xml:space="preserve"> HYPERLINK \l _Toc24863 </w:instrText>
       </w:r>
       <w:r>
         <w:rPr>
@@ -15697,49 +15497,28 @@
         <w:fldChar w:fldCharType="separate"/>
       </w:r>
       <w:r>
-        <w:rPr>
-          <w:rFonts w:hint="default"/>
-          <w:lang w:val="es-MX"/>
-        </w:rPr>
+        <w:t xml:space="preserve">Ejemplo 4 </w:t>
+      </w:r>
+      <w:r>
+        <w:rPr>
+          <w:lang w:val="es-MX"/>
+        </w:rPr>
+        <w:t xml:space="preserve"> Control break</w:t>
+      </w:r>
+      <w:r>
+        <w:tab/>
+      </w:r>
+      <w:r>
         <w:fldChar w:fldCharType="begin"/>
       </w:r>
       <w:r>
-        <w:rPr>
-          <w:rFonts w:hint="default"/>
-          <w:lang w:val="es-MX"/>
-        </w:rPr>
-        <w:instrText xml:space="preserve"> HYPERLINK \l _Toc21306 </w:instrText>
-      </w:r>
-      <w:r>
-        <w:rPr>
-          <w:rFonts w:hint="default"/>
-          <w:lang w:val="es-MX"/>
-        </w:rPr>
+        <w:instrText xml:space="preserve"> PAGEREF _Toc24863 \h </w:instrText>
+      </w:r>
+      <w:r>
         <w:fldChar w:fldCharType="separate"/>
       </w:r>
       <w:r>
-        <w:t xml:space="preserve">Sintaxis 1 </w:t>
-      </w:r>
-      <w:r>
-        <w:rPr>
-          <w:lang w:val="es-MX"/>
-        </w:rPr>
-        <w:t xml:space="preserve"> Estructura if</w:t>
-      </w:r>
-      <w:r>
-        <w:tab/>
-      </w:r>
-      <w:r>
-        <w:fldChar w:fldCharType="begin"/>
-      </w:r>
-      <w:r>
-        <w:instrText xml:space="preserve"> PAGEREF _Toc21306 \h </w:instrText>
-      </w:r>
-      <w:r>
-        <w:fldChar w:fldCharType="separate"/>
-      </w:r>
-      <w:r>
-        <w:t>5</w:t>
+        <w:t>7</w:t>
       </w:r>
       <w:r>
         <w:fldChar w:fldCharType="end"/>
@@ -15771,7 +15550,7 @@
           <w:rFonts w:hint="default"/>
           <w:lang w:val="es-MX"/>
         </w:rPr>
-        <w:instrText xml:space="preserve"> HYPERLINK \l _Toc30515 </w:instrText>
+        <w:instrText xml:space="preserve"> HYPERLINK \l _Toc26082 </w:instrText>
       </w:r>
       <w:r>
         <w:rPr>
@@ -15781,13 +15560,13 @@
         <w:fldChar w:fldCharType="separate"/>
       </w:r>
       <w:r>
-        <w:t xml:space="preserve">Sintaxis 2 </w:t>
-      </w:r>
-      <w:r>
-        <w:rPr>
-          <w:lang w:val="es-MX"/>
-        </w:rPr>
-        <w:t xml:space="preserve"> Estructura if - else</w:t>
+        <w:t xml:space="preserve">Ejemplo 5 </w:t>
+      </w:r>
+      <w:r>
+        <w:rPr>
+          <w:lang w:val="es-MX"/>
+        </w:rPr>
+        <w:t xml:space="preserve"> Control Continue</w:t>
       </w:r>
       <w:r>
         <w:tab/>
@@ -15796,13 +15575,13 @@
         <w:fldChar w:fldCharType="begin"/>
       </w:r>
       <w:r>
-        <w:instrText xml:space="preserve"> PAGEREF _Toc30515 \h </w:instrText>
+        <w:instrText xml:space="preserve"> PAGEREF _Toc26082 \h </w:instrText>
       </w:r>
       <w:r>
         <w:fldChar w:fldCharType="separate"/>
       </w:r>
       <w:r>
-        <w:t>5</w:t>
+        <w:t>7</w:t>
       </w:r>
       <w:r>
         <w:fldChar w:fldCharType="end"/>
@@ -15834,7 +15613,7 @@
           <w:rFonts w:hint="default"/>
           <w:lang w:val="es-MX"/>
         </w:rPr>
-        <w:instrText xml:space="preserve"> HYPERLINK \l _Toc16437 </w:instrText>
+        <w:instrText xml:space="preserve"> HYPERLINK \l _Toc20164 </w:instrText>
       </w:r>
       <w:r>
         <w:rPr>
@@ -15844,13 +15623,13 @@
         <w:fldChar w:fldCharType="separate"/>
       </w:r>
       <w:r>
-        <w:t xml:space="preserve">Sintaxis 3 </w:t>
-      </w:r>
-      <w:r>
-        <w:rPr>
-          <w:lang w:val="es-MX"/>
-        </w:rPr>
-        <w:t xml:space="preserve"> Estructura if - elif - else</w:t>
+        <w:t xml:space="preserve">Ejemplo 6 </w:t>
+      </w:r>
+      <w:r>
+        <w:rPr>
+          <w:lang w:val="es-MX"/>
+        </w:rPr>
+        <w:t xml:space="preserve"> Control Pass</w:t>
       </w:r>
       <w:r>
         <w:tab/>
@@ -15859,13 +15638,13 @@
         <w:fldChar w:fldCharType="begin"/>
       </w:r>
       <w:r>
-        <w:instrText xml:space="preserve"> PAGEREF _Toc16437 \h </w:instrText>
+        <w:instrText xml:space="preserve"> PAGEREF _Toc20164 \h </w:instrText>
       </w:r>
       <w:r>
         <w:fldChar w:fldCharType="separate"/>
       </w:r>
       <w:r>
-        <w:t>6</w:t>
+        <w:t>8</w:t>
       </w:r>
       <w:r>
         <w:fldChar w:fldCharType="end"/>
@@ -15897,7 +15676,7 @@
           <w:rFonts w:hint="default"/>
           <w:lang w:val="es-MX"/>
         </w:rPr>
-        <w:instrText xml:space="preserve"> HYPERLINK \l _Toc28510 </w:instrText>
+        <w:instrText xml:space="preserve"> HYPERLINK \l _Toc30541 </w:instrText>
       </w:r>
       <w:r>
         <w:rPr>
@@ -15907,13 +15686,13 @@
         <w:fldChar w:fldCharType="separate"/>
       </w:r>
       <w:r>
-        <w:t xml:space="preserve">Sintaxis 4 </w:t>
-      </w:r>
-      <w:r>
-        <w:rPr>
-          <w:lang w:val="es-MX"/>
-        </w:rPr>
-        <w:t xml:space="preserve"> Estructura for</w:t>
+        <w:t xml:space="preserve">Ejemplo 7 </w:t>
+      </w:r>
+      <w:r>
+        <w:rPr>
+          <w:lang w:val="es-MX"/>
+        </w:rPr>
+        <w:t xml:space="preserve"> Lista de Comprensión</w:t>
       </w:r>
       <w:r>
         <w:tab/>
@@ -15922,13 +15701,13 @@
         <w:fldChar w:fldCharType="begin"/>
       </w:r>
       <w:r>
-        <w:instrText xml:space="preserve"> PAGEREF _Toc28510 \h </w:instrText>
+        <w:instrText xml:space="preserve"> PAGEREF _Toc30541 \h </w:instrText>
       </w:r>
       <w:r>
         <w:fldChar w:fldCharType="separate"/>
       </w:r>
       <w:r>
-        <w:t>6</w:t>
+        <w:t>10</w:t>
       </w:r>
       <w:r>
         <w:fldChar w:fldCharType="end"/>
@@ -15940,6 +15719,40 @@
         </w:rPr>
         <w:fldChar w:fldCharType="end"/>
       </w:r>
+    </w:p>
+    <w:p>
+      <w:pPr>
+        <w:rPr>
+          <w:rFonts w:hint="default"/>
+          <w:lang w:val="es-MX"/>
+        </w:rPr>
+      </w:pPr>
+      <w:r>
+        <w:rPr>
+          <w:rFonts w:hint="default"/>
+          <w:lang w:val="es-MX"/>
+        </w:rPr>
+        <w:fldChar w:fldCharType="end"/>
+      </w:r>
+    </w:p>
+    <w:p>
+      <w:pPr>
+        <w:pStyle w:val="3"/>
+        <w:bidi w:val="0"/>
+        <w:rPr>
+          <w:rFonts w:hint="default"/>
+          <w:lang w:val="es-MX"/>
+        </w:rPr>
+      </w:pPr>
+      <w:bookmarkStart w:id="71" w:name="_Toc19054"/>
+      <w:r>
+        <w:rPr>
+          <w:rFonts w:hint="default"/>
+          <w:lang w:val="es-MX"/>
+        </w:rPr>
+        <w:t>Indice de Sintaxis</w:t>
+      </w:r>
+      <w:bookmarkEnd w:id="71"/>
     </w:p>
     <w:p>
       <w:pPr>
@@ -15960,7 +15773,7 @@
           <w:rFonts w:hint="default"/>
           <w:lang w:val="es-MX"/>
         </w:rPr>
-        <w:instrText xml:space="preserve"> HYPERLINK \l _Toc2286 </w:instrText>
+        <w:instrText xml:space="preserve">TOC \h \c "Sintaxis"</w:instrText>
       </w:r>
       <w:r>
         <w:rPr>
@@ -15970,13 +15783,34 @@
         <w:fldChar w:fldCharType="separate"/>
       </w:r>
       <w:r>
-        <w:t xml:space="preserve">Sintaxis 5 </w:t>
-      </w:r>
-      <w:r>
-        <w:rPr>
-          <w:lang w:val="es-MX"/>
-        </w:rPr>
-        <w:t xml:space="preserve"> Estructura while</w:t>
+        <w:rPr>
+          <w:rFonts w:hint="default"/>
+          <w:lang w:val="es-MX"/>
+        </w:rPr>
+        <w:fldChar w:fldCharType="begin"/>
+      </w:r>
+      <w:r>
+        <w:rPr>
+          <w:rFonts w:hint="default"/>
+          <w:lang w:val="es-MX"/>
+        </w:rPr>
+        <w:instrText xml:space="preserve"> HYPERLINK \l _Toc16360 </w:instrText>
+      </w:r>
+      <w:r>
+        <w:rPr>
+          <w:rFonts w:hint="default"/>
+          <w:lang w:val="es-MX"/>
+        </w:rPr>
+        <w:fldChar w:fldCharType="separate"/>
+      </w:r>
+      <w:r>
+        <w:t xml:space="preserve">Sintaxis 1 </w:t>
+      </w:r>
+      <w:r>
+        <w:rPr>
+          <w:lang w:val="es-MX"/>
+        </w:rPr>
+        <w:t xml:space="preserve"> Estructura if</w:t>
       </w:r>
       <w:r>
         <w:tab/>
@@ -15985,13 +15819,13 @@
         <w:fldChar w:fldCharType="begin"/>
       </w:r>
       <w:r>
-        <w:instrText xml:space="preserve"> PAGEREF _Toc2286 \h </w:instrText>
+        <w:instrText xml:space="preserve"> PAGEREF _Toc16360 \h </w:instrText>
       </w:r>
       <w:r>
         <w:fldChar w:fldCharType="separate"/>
       </w:r>
       <w:r>
-        <w:t>7</w:t>
+        <w:t>5</w:t>
       </w:r>
       <w:r>
         <w:fldChar w:fldCharType="end"/>
@@ -16023,7 +15857,7 @@
           <w:rFonts w:hint="default"/>
           <w:lang w:val="es-MX"/>
         </w:rPr>
-        <w:instrText xml:space="preserve"> HYPERLINK \l _Toc24460 </w:instrText>
+        <w:instrText xml:space="preserve"> HYPERLINK \l _Toc6696 </w:instrText>
       </w:r>
       <w:r>
         <w:rPr>
@@ -16033,13 +15867,13 @@
         <w:fldChar w:fldCharType="separate"/>
       </w:r>
       <w:r>
-        <w:t xml:space="preserve">Sintaxis 6 </w:t>
-      </w:r>
-      <w:r>
-        <w:rPr>
-          <w:lang w:val="es-MX"/>
-        </w:rPr>
-        <w:t xml:space="preserve"> Lista</w:t>
+        <w:t xml:space="preserve">Sintaxis 2 </w:t>
+      </w:r>
+      <w:r>
+        <w:rPr>
+          <w:lang w:val="es-MX"/>
+        </w:rPr>
+        <w:t xml:space="preserve"> Estructura if - else</w:t>
       </w:r>
       <w:r>
         <w:tab/>
@@ -16048,13 +15882,13 @@
         <w:fldChar w:fldCharType="begin"/>
       </w:r>
       <w:r>
-        <w:instrText xml:space="preserve"> PAGEREF _Toc24460 \h </w:instrText>
+        <w:instrText xml:space="preserve"> PAGEREF _Toc6696 \h </w:instrText>
       </w:r>
       <w:r>
         <w:fldChar w:fldCharType="separate"/>
       </w:r>
       <w:r>
-        <w:t>7</w:t>
+        <w:t>5</w:t>
       </w:r>
       <w:r>
         <w:fldChar w:fldCharType="end"/>
@@ -16086,7 +15920,7 @@
           <w:rFonts w:hint="default"/>
           <w:lang w:val="es-MX"/>
         </w:rPr>
-        <w:instrText xml:space="preserve"> HYPERLINK \l _Toc2719 </w:instrText>
+        <w:instrText xml:space="preserve"> HYPERLINK \l _Toc8211 </w:instrText>
       </w:r>
       <w:r>
         <w:rPr>
@@ -16096,13 +15930,13 @@
         <w:fldChar w:fldCharType="separate"/>
       </w:r>
       <w:r>
-        <w:t xml:space="preserve">Sintaxis 7 </w:t>
-      </w:r>
-      <w:r>
-        <w:rPr>
-          <w:lang w:val="es-MX"/>
-        </w:rPr>
-        <w:t xml:space="preserve"> Acceso a lista</w:t>
+        <w:t xml:space="preserve">Sintaxis 3 </w:t>
+      </w:r>
+      <w:r>
+        <w:rPr>
+          <w:lang w:val="es-MX"/>
+        </w:rPr>
+        <w:t xml:space="preserve"> Estructura if - elif - else</w:t>
       </w:r>
       <w:r>
         <w:tab/>
@@ -16111,13 +15945,13 @@
         <w:fldChar w:fldCharType="begin"/>
       </w:r>
       <w:r>
-        <w:instrText xml:space="preserve"> PAGEREF _Toc2719 \h </w:instrText>
+        <w:instrText xml:space="preserve"> PAGEREF _Toc8211 \h </w:instrText>
       </w:r>
       <w:r>
         <w:fldChar w:fldCharType="separate"/>
       </w:r>
       <w:r>
-        <w:t>8</w:t>
+        <w:t>6</w:t>
       </w:r>
       <w:r>
         <w:fldChar w:fldCharType="end"/>
@@ -16149,7 +15983,7 @@
           <w:rFonts w:hint="default"/>
           <w:lang w:val="es-MX"/>
         </w:rPr>
-        <w:instrText xml:space="preserve"> HYPERLINK \l _Toc10334 </w:instrText>
+        <w:instrText xml:space="preserve"> HYPERLINK \l _Toc22248 </w:instrText>
       </w:r>
       <w:r>
         <w:rPr>
@@ -16159,13 +15993,13 @@
         <w:fldChar w:fldCharType="separate"/>
       </w:r>
       <w:r>
-        <w:t xml:space="preserve">Sintaxis 8 </w:t>
-      </w:r>
-      <w:r>
-        <w:rPr>
-          <w:lang w:val="es-MX"/>
-        </w:rPr>
-        <w:t xml:space="preserve"> Acceso inverso a lista </w:t>
+        <w:t xml:space="preserve">Sintaxis 4 </w:t>
+      </w:r>
+      <w:r>
+        <w:rPr>
+          <w:lang w:val="es-MX"/>
+        </w:rPr>
+        <w:t xml:space="preserve"> Estructura for</w:t>
       </w:r>
       <w:r>
         <w:tab/>
@@ -16174,13 +16008,13 @@
         <w:fldChar w:fldCharType="begin"/>
       </w:r>
       <w:r>
-        <w:instrText xml:space="preserve"> PAGEREF _Toc10334 \h </w:instrText>
+        <w:instrText xml:space="preserve"> PAGEREF _Toc22248 \h </w:instrText>
       </w:r>
       <w:r>
         <w:fldChar w:fldCharType="separate"/>
       </w:r>
       <w:r>
-        <w:t>8</w:t>
+        <w:t>6</w:t>
       </w:r>
       <w:r>
         <w:fldChar w:fldCharType="end"/>
@@ -16212,7 +16046,7 @@
           <w:rFonts w:hint="default"/>
           <w:lang w:val="es-MX"/>
         </w:rPr>
-        <w:instrText xml:space="preserve"> HYPERLINK \l _Toc4496 </w:instrText>
+        <w:instrText xml:space="preserve"> HYPERLINK \l _Toc254 </w:instrText>
       </w:r>
       <w:r>
         <w:rPr>
@@ -16222,13 +16056,13 @@
         <w:fldChar w:fldCharType="separate"/>
       </w:r>
       <w:r>
-        <w:t xml:space="preserve">Sintaxis 9 </w:t>
-      </w:r>
-      <w:r>
-        <w:rPr>
-          <w:lang w:val="es-MX"/>
-        </w:rPr>
-        <w:t xml:space="preserve"> Método append</w:t>
+        <w:t xml:space="preserve">Sintaxis 5 </w:t>
+      </w:r>
+      <w:r>
+        <w:rPr>
+          <w:lang w:val="es-MX"/>
+        </w:rPr>
+        <w:t xml:space="preserve"> Estructura while</w:t>
       </w:r>
       <w:r>
         <w:tab/>
@@ -16237,13 +16071,13 @@
         <w:fldChar w:fldCharType="begin"/>
       </w:r>
       <w:r>
-        <w:instrText xml:space="preserve"> PAGEREF _Toc4496 \h </w:instrText>
+        <w:instrText xml:space="preserve"> PAGEREF _Toc254 \h </w:instrText>
       </w:r>
       <w:r>
         <w:fldChar w:fldCharType="separate"/>
       </w:r>
       <w:r>
-        <w:t>8</w:t>
+        <w:t>7</w:t>
       </w:r>
       <w:r>
         <w:fldChar w:fldCharType="end"/>
@@ -16275,7 +16109,7 @@
           <w:rFonts w:hint="default"/>
           <w:lang w:val="es-MX"/>
         </w:rPr>
-        <w:instrText xml:space="preserve"> HYPERLINK \l _Toc5135 </w:instrText>
+        <w:instrText xml:space="preserve"> HYPERLINK \l _Toc16299 </w:instrText>
       </w:r>
       <w:r>
         <w:rPr>
@@ -16285,13 +16119,13 @@
         <w:fldChar w:fldCharType="separate"/>
       </w:r>
       <w:r>
-        <w:t xml:space="preserve">Sintaxis 10 </w:t>
-      </w:r>
-      <w:r>
-        <w:rPr>
-          <w:lang w:val="es-MX"/>
-        </w:rPr>
-        <w:t xml:space="preserve"> Método insert</w:t>
+        <w:t xml:space="preserve">Sintaxis 6 </w:t>
+      </w:r>
+      <w:r>
+        <w:rPr>
+          <w:lang w:val="es-MX"/>
+        </w:rPr>
+        <w:t xml:space="preserve"> Lista</w:t>
       </w:r>
       <w:r>
         <w:tab/>
@@ -16300,7 +16134,7 @@
         <w:fldChar w:fldCharType="begin"/>
       </w:r>
       <w:r>
-        <w:instrText xml:space="preserve"> PAGEREF _Toc5135 \h </w:instrText>
+        <w:instrText xml:space="preserve"> PAGEREF _Toc16299 \h </w:instrText>
       </w:r>
       <w:r>
         <w:fldChar w:fldCharType="separate"/>
@@ -16338,7 +16172,7 @@
           <w:rFonts w:hint="default"/>
           <w:lang w:val="es-MX"/>
         </w:rPr>
-        <w:instrText xml:space="preserve"> HYPERLINK \l _Toc12931 </w:instrText>
+        <w:instrText xml:space="preserve"> HYPERLINK \l _Toc3413 </w:instrText>
       </w:r>
       <w:r>
         <w:rPr>
@@ -16348,13 +16182,13 @@
         <w:fldChar w:fldCharType="separate"/>
       </w:r>
       <w:r>
-        <w:t xml:space="preserve">Sintaxis 11 </w:t>
-      </w:r>
-      <w:r>
-        <w:rPr>
-          <w:lang w:val="es-MX"/>
-        </w:rPr>
-        <w:t xml:space="preserve"> Método remove</w:t>
+        <w:t xml:space="preserve">Sintaxis 7 </w:t>
+      </w:r>
+      <w:r>
+        <w:rPr>
+          <w:lang w:val="es-MX"/>
+        </w:rPr>
+        <w:t xml:space="preserve"> Acceso a lista</w:t>
       </w:r>
       <w:r>
         <w:tab/>
@@ -16363,7 +16197,7 @@
         <w:fldChar w:fldCharType="begin"/>
       </w:r>
       <w:r>
-        <w:instrText xml:space="preserve"> PAGEREF _Toc12931 \h </w:instrText>
+        <w:instrText xml:space="preserve"> PAGEREF _Toc3413 \h </w:instrText>
       </w:r>
       <w:r>
         <w:fldChar w:fldCharType="separate"/>
@@ -16401,7 +16235,7 @@
           <w:rFonts w:hint="default"/>
           <w:lang w:val="es-MX"/>
         </w:rPr>
-        <w:instrText xml:space="preserve"> HYPERLINK \l _Toc6908 </w:instrText>
+        <w:instrText xml:space="preserve"> HYPERLINK \l _Toc6427 </w:instrText>
       </w:r>
       <w:r>
         <w:rPr>
@@ -16411,13 +16245,13 @@
         <w:fldChar w:fldCharType="separate"/>
       </w:r>
       <w:r>
-        <w:t xml:space="preserve">Sintaxis 12 </w:t>
-      </w:r>
-      <w:r>
-        <w:rPr>
-          <w:lang w:val="es-MX"/>
-        </w:rPr>
-        <w:t xml:space="preserve"> Método pop</w:t>
+        <w:t xml:space="preserve">Sintaxis 8 </w:t>
+      </w:r>
+      <w:r>
+        <w:rPr>
+          <w:lang w:val="es-MX"/>
+        </w:rPr>
+        <w:t xml:space="preserve"> Acceso inverso a lista </w:t>
       </w:r>
       <w:r>
         <w:tab/>
@@ -16426,13 +16260,13 @@
         <w:fldChar w:fldCharType="begin"/>
       </w:r>
       <w:r>
-        <w:instrText xml:space="preserve"> PAGEREF _Toc6908 \h </w:instrText>
+        <w:instrText xml:space="preserve"> PAGEREF _Toc6427 \h </w:instrText>
       </w:r>
       <w:r>
         <w:fldChar w:fldCharType="separate"/>
       </w:r>
       <w:r>
-        <w:t>8</w:t>
+        <w:t>9</w:t>
       </w:r>
       <w:r>
         <w:fldChar w:fldCharType="end"/>
@@ -16464,7 +16298,7 @@
           <w:rFonts w:hint="default"/>
           <w:lang w:val="es-MX"/>
         </w:rPr>
-        <w:instrText xml:space="preserve"> HYPERLINK \l _Toc21328 </w:instrText>
+        <w:instrText xml:space="preserve"> HYPERLINK \l _Toc6331 </w:instrText>
       </w:r>
       <w:r>
         <w:rPr>
@@ -16474,13 +16308,13 @@
         <w:fldChar w:fldCharType="separate"/>
       </w:r>
       <w:r>
-        <w:t xml:space="preserve">Sintaxis 13 </w:t>
-      </w:r>
-      <w:r>
-        <w:rPr>
-          <w:lang w:val="es-MX"/>
-        </w:rPr>
-        <w:t xml:space="preserve"> Método sort</w:t>
+        <w:t xml:space="preserve">Sintaxis 9 </w:t>
+      </w:r>
+      <w:r>
+        <w:rPr>
+          <w:lang w:val="es-MX"/>
+        </w:rPr>
+        <w:t xml:space="preserve"> Método append</w:t>
       </w:r>
       <w:r>
         <w:tab/>
@@ -16489,13 +16323,13 @@
         <w:fldChar w:fldCharType="begin"/>
       </w:r>
       <w:r>
-        <w:instrText xml:space="preserve"> PAGEREF _Toc21328 \h </w:instrText>
+        <w:instrText xml:space="preserve"> PAGEREF _Toc6331 \h </w:instrText>
       </w:r>
       <w:r>
         <w:fldChar w:fldCharType="separate"/>
       </w:r>
       <w:r>
-        <w:t>8</w:t>
+        <w:t>9</w:t>
       </w:r>
       <w:r>
         <w:fldChar w:fldCharType="end"/>
@@ -16527,7 +16361,7 @@
           <w:rFonts w:hint="default"/>
           <w:lang w:val="es-MX"/>
         </w:rPr>
-        <w:instrText xml:space="preserve"> HYPERLINK \l _Toc20836 </w:instrText>
+        <w:instrText xml:space="preserve"> HYPERLINK \l _Toc2710 </w:instrText>
       </w:r>
       <w:r>
         <w:rPr>
@@ -16537,13 +16371,13 @@
         <w:fldChar w:fldCharType="separate"/>
       </w:r>
       <w:r>
-        <w:t xml:space="preserve">Sintaxis 14 </w:t>
-      </w:r>
-      <w:r>
-        <w:rPr>
-          <w:lang w:val="es-MX"/>
-        </w:rPr>
-        <w:t xml:space="preserve"> Método reverse</w:t>
+        <w:t xml:space="preserve">Sintaxis 10 </w:t>
+      </w:r>
+      <w:r>
+        <w:rPr>
+          <w:lang w:val="es-MX"/>
+        </w:rPr>
+        <w:t xml:space="preserve"> Método insert</w:t>
       </w:r>
       <w:r>
         <w:tab/>
@@ -16552,13 +16386,13 @@
         <w:fldChar w:fldCharType="begin"/>
       </w:r>
       <w:r>
-        <w:instrText xml:space="preserve"> PAGEREF _Toc20836 \h </w:instrText>
+        <w:instrText xml:space="preserve"> PAGEREF _Toc2710 \h </w:instrText>
       </w:r>
       <w:r>
         <w:fldChar w:fldCharType="separate"/>
       </w:r>
       <w:r>
-        <w:t>8</w:t>
+        <w:t>9</w:t>
       </w:r>
       <w:r>
         <w:fldChar w:fldCharType="end"/>
@@ -16590,7 +16424,7 @@
           <w:rFonts w:hint="default"/>
           <w:lang w:val="es-MX"/>
         </w:rPr>
-        <w:instrText xml:space="preserve"> HYPERLINK \l _Toc9933 </w:instrText>
+        <w:instrText xml:space="preserve"> HYPERLINK \l _Toc28943 </w:instrText>
       </w:r>
       <w:r>
         <w:rPr>
@@ -16600,26 +16434,13 @@
         <w:fldChar w:fldCharType="separate"/>
       </w:r>
       <w:r>
-        <w:t xml:space="preserve">Sintaxis 15 </w:t>
-      </w:r>
-      <w:r>
-        <w:rPr>
-          <w:lang w:val="es-MX"/>
-        </w:rPr>
-        <w:t xml:space="preserve"> Lista de Compre</w:t>
-      </w:r>
-      <w:r>
-        <w:rPr>
-          <w:rFonts w:hint="default"/>
-          <w:lang w:val="es-MX"/>
-        </w:rPr>
-        <w:t>n</w:t>
-      </w:r>
-      <w:r>
-        <w:rPr>
-          <w:lang w:val="es-MX"/>
-        </w:rPr>
-        <w:t>sión</w:t>
+        <w:t xml:space="preserve">Sintaxis 11 </w:t>
+      </w:r>
+      <w:r>
+        <w:rPr>
+          <w:lang w:val="es-MX"/>
+        </w:rPr>
+        <w:t xml:space="preserve"> Método remove</w:t>
       </w:r>
       <w:r>
         <w:tab/>
@@ -16628,13 +16449,13 @@
         <w:fldChar w:fldCharType="begin"/>
       </w:r>
       <w:r>
-        <w:instrText xml:space="preserve"> PAGEREF _Toc9933 \h </w:instrText>
+        <w:instrText xml:space="preserve"> PAGEREF _Toc28943 \h </w:instrText>
       </w:r>
       <w:r>
         <w:fldChar w:fldCharType="separate"/>
       </w:r>
       <w:r>
-        <w:t>8</w:t>
+        <w:t>9</w:t>
       </w:r>
       <w:r>
         <w:fldChar w:fldCharType="end"/>
@@ -16666,7 +16487,7 @@
           <w:rFonts w:hint="default"/>
           <w:lang w:val="es-MX"/>
         </w:rPr>
-        <w:instrText xml:space="preserve"> HYPERLINK \l _Toc25196 </w:instrText>
+        <w:instrText xml:space="preserve"> HYPERLINK \l _Toc6541 </w:instrText>
       </w:r>
       <w:r>
         <w:rPr>
@@ -16676,26 +16497,13 @@
         <w:fldChar w:fldCharType="separate"/>
       </w:r>
       <w:r>
-        <w:t xml:space="preserve">Sintaxis 16 </w:t>
-      </w:r>
-      <w:r>
-        <w:rPr>
-          <w:lang w:val="es-MX"/>
-        </w:rPr>
-        <w:t xml:space="preserve"> Funci</w:t>
-      </w:r>
-      <w:r>
-        <w:rPr>
-          <w:rFonts w:hint="default"/>
-          <w:lang w:val="es-MX"/>
-        </w:rPr>
-        <w:t>ó</w:t>
-      </w:r>
-      <w:r>
-        <w:rPr>
-          <w:lang w:val="es-MX"/>
-        </w:rPr>
-        <w:t>n de usuario simple</w:t>
+        <w:t xml:space="preserve">Sintaxis 12 </w:t>
+      </w:r>
+      <w:r>
+        <w:rPr>
+          <w:lang w:val="es-MX"/>
+        </w:rPr>
+        <w:t xml:space="preserve"> Método pop</w:t>
       </w:r>
       <w:r>
         <w:tab/>
@@ -16704,7 +16512,7 @@
         <w:fldChar w:fldCharType="begin"/>
       </w:r>
       <w:r>
-        <w:instrText xml:space="preserve"> PAGEREF _Toc25196 \h </w:instrText>
+        <w:instrText xml:space="preserve"> PAGEREF _Toc6541 \h </w:instrText>
       </w:r>
       <w:r>
         <w:fldChar w:fldCharType="separate"/>
@@ -16742,7 +16550,7 @@
           <w:rFonts w:hint="default"/>
           <w:lang w:val="es-MX"/>
         </w:rPr>
-        <w:instrText xml:space="preserve"> HYPERLINK \l _Toc8176 </w:instrText>
+        <w:instrText xml:space="preserve"> HYPERLINK \l _Toc21741 </w:instrText>
       </w:r>
       <w:r>
         <w:rPr>
@@ -16752,26 +16560,13 @@
         <w:fldChar w:fldCharType="separate"/>
       </w:r>
       <w:r>
-        <w:t xml:space="preserve">Sintaxis 17 </w:t>
-      </w:r>
-      <w:r>
-        <w:rPr>
-          <w:lang w:val="es-MX"/>
-        </w:rPr>
-        <w:t xml:space="preserve"> Funci</w:t>
-      </w:r>
-      <w:r>
-        <w:rPr>
-          <w:rFonts w:hint="default"/>
-          <w:lang w:val="es-MX"/>
-        </w:rPr>
-        <w:t>ó</w:t>
-      </w:r>
-      <w:r>
-        <w:rPr>
-          <w:lang w:val="es-MX"/>
-        </w:rPr>
-        <w:t>n Usuario Parámetros y Argumentos</w:t>
+        <w:t xml:space="preserve">Sintaxis 13 </w:t>
+      </w:r>
+      <w:r>
+        <w:rPr>
+          <w:lang w:val="es-MX"/>
+        </w:rPr>
+        <w:t xml:space="preserve"> Método sort</w:t>
       </w:r>
       <w:r>
         <w:tab/>
@@ -16780,13 +16575,13 @@
         <w:fldChar w:fldCharType="begin"/>
       </w:r>
       <w:r>
-        <w:instrText xml:space="preserve"> PAGEREF _Toc8176 \h </w:instrText>
+        <w:instrText xml:space="preserve"> PAGEREF _Toc21741 \h </w:instrText>
       </w:r>
       <w:r>
         <w:fldChar w:fldCharType="separate"/>
       </w:r>
       <w:r>
-        <w:t>10</w:t>
+        <w:t>9</w:t>
       </w:r>
       <w:r>
         <w:fldChar w:fldCharType="end"/>
@@ -16818,7 +16613,7 @@
           <w:rFonts w:hint="default"/>
           <w:lang w:val="es-MX"/>
         </w:rPr>
-        <w:instrText xml:space="preserve"> HYPERLINK \l _Toc15462 </w:instrText>
+        <w:instrText xml:space="preserve"> HYPERLINK \l _Toc29738 </w:instrText>
       </w:r>
       <w:r>
         <w:rPr>
@@ -16828,13 +16623,13 @@
         <w:fldChar w:fldCharType="separate"/>
       </w:r>
       <w:r>
-        <w:t xml:space="preserve">Sintaxis 18 </w:t>
-      </w:r>
-      <w:r>
-        <w:rPr>
-          <w:lang w:val="es-MX"/>
-        </w:rPr>
-        <w:t xml:space="preserve"> Funcion *args</w:t>
+        <w:t xml:space="preserve">Sintaxis 14 </w:t>
+      </w:r>
+      <w:r>
+        <w:rPr>
+          <w:lang w:val="es-MX"/>
+        </w:rPr>
+        <w:t xml:space="preserve"> Método reverse</w:t>
       </w:r>
       <w:r>
         <w:tab/>
@@ -16843,13 +16638,13 @@
         <w:fldChar w:fldCharType="begin"/>
       </w:r>
       <w:r>
-        <w:instrText xml:space="preserve"> PAGEREF _Toc15462 \h </w:instrText>
+        <w:instrText xml:space="preserve"> PAGEREF _Toc29738 \h </w:instrText>
       </w:r>
       <w:r>
         <w:fldChar w:fldCharType="separate"/>
       </w:r>
       <w:r>
-        <w:t>11</w:t>
+        <w:t>9</w:t>
       </w:r>
       <w:r>
         <w:fldChar w:fldCharType="end"/>
@@ -16881,7 +16676,7 @@
           <w:rFonts w:hint="default"/>
           <w:lang w:val="es-MX"/>
         </w:rPr>
-        <w:instrText xml:space="preserve"> HYPERLINK \l _Toc8248 </w:instrText>
+        <w:instrText xml:space="preserve"> HYPERLINK \l _Toc13176 </w:instrText>
       </w:r>
       <w:r>
         <w:rPr>
@@ -16891,12 +16686,442 @@
         <w:fldChar w:fldCharType="separate"/>
       </w:r>
       <w:r>
+        <w:t xml:space="preserve">Sintaxis 15 </w:t>
+      </w:r>
+      <w:r>
+        <w:rPr>
+          <w:lang w:val="es-MX"/>
+        </w:rPr>
+        <w:t xml:space="preserve"> M</w:t>
+      </w:r>
+      <w:r>
+        <w:rPr>
+          <w:rFonts w:hint="default"/>
+          <w:lang w:val="es-MX"/>
+        </w:rPr>
+        <w:t>é</w:t>
+      </w:r>
+      <w:r>
+        <w:rPr>
+          <w:lang w:val="es-MX"/>
+        </w:rPr>
+        <w:t>todo clear</w:t>
+      </w:r>
+      <w:r>
+        <w:tab/>
+      </w:r>
+      <w:r>
+        <w:fldChar w:fldCharType="begin"/>
+      </w:r>
+      <w:r>
+        <w:instrText xml:space="preserve"> PAGEREF _Toc13176 \h </w:instrText>
+      </w:r>
+      <w:r>
+        <w:fldChar w:fldCharType="separate"/>
+      </w:r>
+      <w:r>
+        <w:t>9</w:t>
+      </w:r>
+      <w:r>
+        <w:fldChar w:fldCharType="end"/>
+      </w:r>
+      <w:r>
+        <w:rPr>
+          <w:rFonts w:hint="default"/>
+          <w:lang w:val="es-MX"/>
+        </w:rPr>
+        <w:fldChar w:fldCharType="end"/>
+      </w:r>
+    </w:p>
+    <w:p>
+      <w:pPr>
+        <w:pStyle w:val="17"/>
+        <w:tabs>
+          <w:tab w:val="right" w:leader="dot" w:pos="8504"/>
+        </w:tabs>
+      </w:pPr>
+      <w:r>
+        <w:rPr>
+          <w:rFonts w:hint="default"/>
+          <w:lang w:val="es-MX"/>
+        </w:rPr>
+        <w:fldChar w:fldCharType="begin"/>
+      </w:r>
+      <w:r>
+        <w:rPr>
+          <w:rFonts w:hint="default"/>
+          <w:lang w:val="es-MX"/>
+        </w:rPr>
+        <w:instrText xml:space="preserve"> HYPERLINK \l _Toc20278 </w:instrText>
+      </w:r>
+      <w:r>
+        <w:rPr>
+          <w:rFonts w:hint="default"/>
+          <w:lang w:val="es-MX"/>
+        </w:rPr>
+        <w:fldChar w:fldCharType="separate"/>
+      </w:r>
+      <w:r>
+        <w:t xml:space="preserve">Sintaxis 16 </w:t>
+      </w:r>
+      <w:r>
+        <w:rPr>
+          <w:lang w:val="es-MX"/>
+        </w:rPr>
+        <w:t xml:space="preserve"> Método count</w:t>
+      </w:r>
+      <w:r>
+        <w:tab/>
+      </w:r>
+      <w:r>
+        <w:fldChar w:fldCharType="begin"/>
+      </w:r>
+      <w:r>
+        <w:instrText xml:space="preserve"> PAGEREF _Toc20278 \h </w:instrText>
+      </w:r>
+      <w:r>
+        <w:fldChar w:fldCharType="separate"/>
+      </w:r>
+      <w:r>
+        <w:t>9</w:t>
+      </w:r>
+      <w:r>
+        <w:fldChar w:fldCharType="end"/>
+      </w:r>
+      <w:r>
+        <w:rPr>
+          <w:rFonts w:hint="default"/>
+          <w:lang w:val="es-MX"/>
+        </w:rPr>
+        <w:fldChar w:fldCharType="end"/>
+      </w:r>
+    </w:p>
+    <w:p>
+      <w:pPr>
+        <w:pStyle w:val="17"/>
+        <w:tabs>
+          <w:tab w:val="right" w:leader="dot" w:pos="8504"/>
+        </w:tabs>
+      </w:pPr>
+      <w:r>
+        <w:rPr>
+          <w:rFonts w:hint="default"/>
+          <w:lang w:val="es-MX"/>
+        </w:rPr>
+        <w:fldChar w:fldCharType="begin"/>
+      </w:r>
+      <w:r>
+        <w:rPr>
+          <w:rFonts w:hint="default"/>
+          <w:lang w:val="es-MX"/>
+        </w:rPr>
+        <w:instrText xml:space="preserve"> HYPERLINK \l _Toc6487 </w:instrText>
+      </w:r>
+      <w:r>
+        <w:rPr>
+          <w:rFonts w:hint="default"/>
+          <w:lang w:val="es-MX"/>
+        </w:rPr>
+        <w:fldChar w:fldCharType="separate"/>
+      </w:r>
+      <w:r>
+        <w:t xml:space="preserve">Sintaxis 17 </w:t>
+      </w:r>
+      <w:r>
+        <w:rPr>
+          <w:lang w:val="es-MX"/>
+        </w:rPr>
+        <w:t xml:space="preserve"> Lista de Compre</w:t>
+      </w:r>
+      <w:r>
+        <w:rPr>
+          <w:rFonts w:hint="default"/>
+          <w:lang w:val="es-MX"/>
+        </w:rPr>
+        <w:t>n</w:t>
+      </w:r>
+      <w:r>
+        <w:rPr>
+          <w:lang w:val="es-MX"/>
+        </w:rPr>
+        <w:t>sión</w:t>
+      </w:r>
+      <w:r>
+        <w:tab/>
+      </w:r>
+      <w:r>
+        <w:fldChar w:fldCharType="begin"/>
+      </w:r>
+      <w:r>
+        <w:instrText xml:space="preserve"> PAGEREF _Toc6487 \h </w:instrText>
+      </w:r>
+      <w:r>
+        <w:fldChar w:fldCharType="separate"/>
+      </w:r>
+      <w:r>
+        <w:t>10</w:t>
+      </w:r>
+      <w:r>
+        <w:fldChar w:fldCharType="end"/>
+      </w:r>
+      <w:r>
+        <w:rPr>
+          <w:rFonts w:hint="default"/>
+          <w:lang w:val="es-MX"/>
+        </w:rPr>
+        <w:fldChar w:fldCharType="end"/>
+      </w:r>
+    </w:p>
+    <w:p>
+      <w:pPr>
+        <w:pStyle w:val="17"/>
+        <w:tabs>
+          <w:tab w:val="right" w:leader="dot" w:pos="8504"/>
+        </w:tabs>
+      </w:pPr>
+      <w:r>
+        <w:rPr>
+          <w:rFonts w:hint="default"/>
+          <w:lang w:val="es-MX"/>
+        </w:rPr>
+        <w:fldChar w:fldCharType="begin"/>
+      </w:r>
+      <w:r>
+        <w:rPr>
+          <w:rFonts w:hint="default"/>
+          <w:lang w:val="es-MX"/>
+        </w:rPr>
+        <w:instrText xml:space="preserve"> HYPERLINK \l _Toc23353 </w:instrText>
+      </w:r>
+      <w:r>
+        <w:rPr>
+          <w:rFonts w:hint="default"/>
+          <w:lang w:val="es-MX"/>
+        </w:rPr>
+        <w:fldChar w:fldCharType="separate"/>
+      </w:r>
+      <w:r>
+        <w:t xml:space="preserve">Sintaxis 18 </w:t>
+      </w:r>
+      <w:r>
+        <w:rPr>
+          <w:lang w:val="es-MX"/>
+        </w:rPr>
+        <w:t xml:space="preserve"> Funci</w:t>
+      </w:r>
+      <w:r>
+        <w:rPr>
+          <w:rFonts w:hint="default"/>
+          <w:lang w:val="es-MX"/>
+        </w:rPr>
+        <w:t>ó</w:t>
+      </w:r>
+      <w:r>
+        <w:rPr>
+          <w:lang w:val="es-MX"/>
+        </w:rPr>
+        <w:t>n de usuario simple</w:t>
+      </w:r>
+      <w:r>
+        <w:tab/>
+      </w:r>
+      <w:r>
+        <w:fldChar w:fldCharType="begin"/>
+      </w:r>
+      <w:r>
+        <w:instrText xml:space="preserve"> PAGEREF _Toc23353 \h </w:instrText>
+      </w:r>
+      <w:r>
+        <w:fldChar w:fldCharType="separate"/>
+      </w:r>
+      <w:r>
+        <w:t>10</w:t>
+      </w:r>
+      <w:r>
+        <w:fldChar w:fldCharType="end"/>
+      </w:r>
+      <w:r>
+        <w:rPr>
+          <w:rFonts w:hint="default"/>
+          <w:lang w:val="es-MX"/>
+        </w:rPr>
+        <w:fldChar w:fldCharType="end"/>
+      </w:r>
+    </w:p>
+    <w:p>
+      <w:pPr>
+        <w:pStyle w:val="17"/>
+        <w:tabs>
+          <w:tab w:val="right" w:leader="dot" w:pos="8504"/>
+        </w:tabs>
+      </w:pPr>
+      <w:r>
+        <w:rPr>
+          <w:rFonts w:hint="default"/>
+          <w:lang w:val="es-MX"/>
+        </w:rPr>
+        <w:fldChar w:fldCharType="begin"/>
+      </w:r>
+      <w:r>
+        <w:rPr>
+          <w:rFonts w:hint="default"/>
+          <w:lang w:val="es-MX"/>
+        </w:rPr>
+        <w:instrText xml:space="preserve"> HYPERLINK \l _Toc28414 </w:instrText>
+      </w:r>
+      <w:r>
+        <w:rPr>
+          <w:rFonts w:hint="default"/>
+          <w:lang w:val="es-MX"/>
+        </w:rPr>
+        <w:fldChar w:fldCharType="separate"/>
+      </w:r>
+      <w:r>
         <w:t xml:space="preserve">Sintaxis 19 </w:t>
       </w:r>
       <w:r>
         <w:rPr>
           <w:lang w:val="es-MX"/>
         </w:rPr>
+        <w:t xml:space="preserve"> Funci</w:t>
+      </w:r>
+      <w:r>
+        <w:rPr>
+          <w:rFonts w:hint="default"/>
+          <w:lang w:val="es-MX"/>
+        </w:rPr>
+        <w:t>ó</w:t>
+      </w:r>
+      <w:r>
+        <w:rPr>
+          <w:lang w:val="es-MX"/>
+        </w:rPr>
+        <w:t>n Usuario Parámetros y Argumentos</w:t>
+      </w:r>
+      <w:r>
+        <w:tab/>
+      </w:r>
+      <w:r>
+        <w:fldChar w:fldCharType="begin"/>
+      </w:r>
+      <w:r>
+        <w:instrText xml:space="preserve"> PAGEREF _Toc28414 \h </w:instrText>
+      </w:r>
+      <w:r>
+        <w:fldChar w:fldCharType="separate"/>
+      </w:r>
+      <w:r>
+        <w:t>11</w:t>
+      </w:r>
+      <w:r>
+        <w:fldChar w:fldCharType="end"/>
+      </w:r>
+      <w:r>
+        <w:rPr>
+          <w:rFonts w:hint="default"/>
+          <w:lang w:val="es-MX"/>
+        </w:rPr>
+        <w:fldChar w:fldCharType="end"/>
+      </w:r>
+    </w:p>
+    <w:p>
+      <w:pPr>
+        <w:pStyle w:val="17"/>
+        <w:tabs>
+          <w:tab w:val="right" w:leader="dot" w:pos="8504"/>
+        </w:tabs>
+      </w:pPr>
+      <w:r>
+        <w:rPr>
+          <w:rFonts w:hint="default"/>
+          <w:lang w:val="es-MX"/>
+        </w:rPr>
+        <w:fldChar w:fldCharType="begin"/>
+      </w:r>
+      <w:r>
+        <w:rPr>
+          <w:rFonts w:hint="default"/>
+          <w:lang w:val="es-MX"/>
+        </w:rPr>
+        <w:instrText xml:space="preserve"> HYPERLINK \l _Toc5347 </w:instrText>
+      </w:r>
+      <w:r>
+        <w:rPr>
+          <w:rFonts w:hint="default"/>
+          <w:lang w:val="es-MX"/>
+        </w:rPr>
+        <w:fldChar w:fldCharType="separate"/>
+      </w:r>
+      <w:r>
+        <w:t xml:space="preserve">Sintaxis 20 </w:t>
+      </w:r>
+      <w:r>
+        <w:rPr>
+          <w:lang w:val="es-MX"/>
+        </w:rPr>
+        <w:t xml:space="preserve"> Funcion *args</w:t>
+      </w:r>
+      <w:r>
+        <w:tab/>
+      </w:r>
+      <w:r>
+        <w:fldChar w:fldCharType="begin"/>
+      </w:r>
+      <w:r>
+        <w:instrText xml:space="preserve"> PAGEREF _Toc5347 \h </w:instrText>
+      </w:r>
+      <w:r>
+        <w:fldChar w:fldCharType="separate"/>
+      </w:r>
+      <w:r>
+        <w:t>12</w:t>
+      </w:r>
+      <w:r>
+        <w:fldChar w:fldCharType="end"/>
+      </w:r>
+      <w:r>
+        <w:rPr>
+          <w:rFonts w:hint="default"/>
+          <w:lang w:val="es-MX"/>
+        </w:rPr>
+        <w:fldChar w:fldCharType="end"/>
+      </w:r>
+    </w:p>
+    <w:p>
+      <w:pPr>
+        <w:pStyle w:val="17"/>
+        <w:tabs>
+          <w:tab w:val="right" w:leader="dot" w:pos="8504"/>
+        </w:tabs>
+      </w:pPr>
+      <w:r>
+        <w:rPr>
+          <w:rFonts w:hint="default"/>
+          <w:lang w:val="es-MX"/>
+        </w:rPr>
+        <w:fldChar w:fldCharType="begin"/>
+      </w:r>
+      <w:r>
+        <w:rPr>
+          <w:rFonts w:hint="default"/>
+          <w:lang w:val="es-MX"/>
+        </w:rPr>
+        <w:instrText xml:space="preserve"> HYPERLINK \l _Toc27695 </w:instrText>
+      </w:r>
+      <w:r>
+        <w:rPr>
+          <w:rFonts w:hint="default"/>
+          <w:lang w:val="es-MX"/>
+        </w:rPr>
+        <w:fldChar w:fldCharType="separate"/>
+      </w:r>
+      <w:r>
+        <w:t xml:space="preserve">Sintaxis 21 </w:t>
+      </w:r>
+      <w:r>
+        <w:rPr>
+          <w:lang w:val="es-MX"/>
+        </w:rPr>
         <w:t xml:space="preserve"> Funcion **kwargs</w:t>
       </w:r>
       <w:r>
@@ -16906,13 +17131,13 @@
         <w:fldChar w:fldCharType="begin"/>
       </w:r>
       <w:r>
-        <w:instrText xml:space="preserve"> PAGEREF _Toc8248 \h </w:instrText>
+        <w:instrText xml:space="preserve"> PAGEREF _Toc27695 \h </w:instrText>
       </w:r>
       <w:r>
         <w:fldChar w:fldCharType="separate"/>
       </w:r>
       <w:r>
-        <w:t>11</w:t>
+        <w:t>12</w:t>
       </w:r>
       <w:r>
         <w:fldChar w:fldCharType="end"/>
@@ -18624,7 +18849,7 @@
       </w:numPr>
       <w:spacing w:before="360" w:after="80" w:line="480" w:lineRule="auto"/>
       <w:ind w:left="425" w:hanging="425"/>
-      <w:jc w:val="distribute"/>
+      <w:jc w:val="center"/>
       <w:outlineLvl w:val="0"/>
     </w:pPr>
     <w:rPr>

</xml_diff>